<commit_message>
Deploying to gh-pages from @ ignacioperezrjs/ignacioperezrjs.github.io@d3df76ec1fd6a7fbfe9abe815dd22b3ad3779416 🚀
</commit_message>
<xml_diff>
--- a/assets/pdf/Ignacio_Perez_cv.docx
+++ b/assets/pdf/Ignacio_Perez_cv.docx
@@ -32,8 +32,8 @@
             <w:tcW w:w="10490" w:type="dxa"/>
             <w:gridSpan w:val="5"/>
             <w:tcBorders>
-              <w:top w:val="single" w:sz="4" w:space="0" w:color="auto"/>
-              <w:bottom w:val="single" w:sz="4" w:space="0" w:color="auto"/>
+              <w:top w:val="single" w:sz="8" w:space="0" w:color="0070C0"/>
+              <w:bottom w:val="single" w:sz="8" w:space="0" w:color="0070C0"/>
             </w:tcBorders>
           </w:tcPr>
           <w:p>
@@ -55,42 +55,158 @@
             <w:tcW w:w="10490" w:type="dxa"/>
             <w:gridSpan w:val="5"/>
             <w:tcBorders>
-              <w:top w:val="single" w:sz="4" w:space="0" w:color="auto"/>
+              <w:top w:val="single" w:sz="8" w:space="0" w:color="0070C0"/>
+              <w:bottom w:val="single" w:sz="8" w:space="0" w:color="0070C0"/>
             </w:tcBorders>
           </w:tcPr>
           <w:p>
+            <w:proofErr w:type="spellStart"/>
             <w:r>
               <w:t>Rigorous</w:t>
             </w:r>
-            <w:r>
-              <w:t xml:space="preserve"> and versatile</w:t>
-            </w:r>
-            <w:r>
-              <w:t xml:space="preserve"> </w:t>
-            </w:r>
-            <w:r>
-              <w:t>Electrical Engineer. Skilled in technical documentation, CAD</w:t>
-            </w:r>
-            <w:r>
-              <w:t xml:space="preserve"> </w:t>
-            </w:r>
-            <w:r>
-              <w:t xml:space="preserve">based design, network infrastructure, and project coordination. </w:t>
-            </w:r>
-            <w:r>
-              <w:t>Proactive and s</w:t>
-            </w:r>
-            <w:r>
-              <w:t xml:space="preserve">trong </w:t>
+            <w:proofErr w:type="spellEnd"/>
+            <w:r>
+              <w:t xml:space="preserve"> and </w:t>
+            </w:r>
+            <w:proofErr w:type="spellStart"/>
+            <w:r>
+              <w:t>versatile</w:t>
+            </w:r>
+            <w:proofErr w:type="spellEnd"/>
+            <w:r>
+              <w:t xml:space="preserve"> </w:t>
+            </w:r>
+            <w:proofErr w:type="spellStart"/>
+            <w:r>
+              <w:t>Electrical</w:t>
+            </w:r>
+            <w:proofErr w:type="spellEnd"/>
+            <w:r>
+              <w:t xml:space="preserve"> </w:t>
+            </w:r>
+            <w:proofErr w:type="spellStart"/>
+            <w:r>
+              <w:t>Engineer</w:t>
+            </w:r>
+            <w:proofErr w:type="spellEnd"/>
+            <w:r>
+              <w:t xml:space="preserve">. </w:t>
+            </w:r>
+            <w:proofErr w:type="spellStart"/>
+            <w:r>
+              <w:t>Skilled</w:t>
+            </w:r>
+            <w:proofErr w:type="spellEnd"/>
+            <w:r>
+              <w:t xml:space="preserve"> in </w:t>
+            </w:r>
+            <w:proofErr w:type="spellStart"/>
+            <w:r>
+              <w:t>technical</w:t>
+            </w:r>
+            <w:proofErr w:type="spellEnd"/>
+            <w:r>
+              <w:t xml:space="preserve"> </w:t>
+            </w:r>
+            <w:proofErr w:type="spellStart"/>
+            <w:r>
+              <w:t>documentation</w:t>
+            </w:r>
+            <w:proofErr w:type="spellEnd"/>
+            <w:r>
+              <w:t>, CAD</w:t>
+            </w:r>
+            <w:r>
+              <w:t xml:space="preserve"> </w:t>
+            </w:r>
+            <w:proofErr w:type="spellStart"/>
+            <w:r>
+              <w:t>based</w:t>
+            </w:r>
+            <w:proofErr w:type="spellEnd"/>
+            <w:r>
+              <w:t xml:space="preserve"> </w:t>
+            </w:r>
+            <w:proofErr w:type="spellStart"/>
+            <w:r>
+              <w:t>design</w:t>
+            </w:r>
+            <w:proofErr w:type="spellEnd"/>
+            <w:r>
+              <w:t xml:space="preserve">, </w:t>
+            </w:r>
+            <w:proofErr w:type="spellStart"/>
+            <w:r>
+              <w:t>network</w:t>
+            </w:r>
+            <w:proofErr w:type="spellEnd"/>
+            <w:r>
+              <w:t xml:space="preserve"> </w:t>
+            </w:r>
+            <w:proofErr w:type="spellStart"/>
+            <w:r>
+              <w:t>infrastructure</w:t>
+            </w:r>
+            <w:proofErr w:type="spellEnd"/>
+            <w:r>
+              <w:t xml:space="preserve">, and </w:t>
+            </w:r>
+            <w:proofErr w:type="spellStart"/>
+            <w:r>
+              <w:t>project</w:t>
+            </w:r>
+            <w:proofErr w:type="spellEnd"/>
+            <w:r>
+              <w:t xml:space="preserve"> </w:t>
+            </w:r>
+            <w:proofErr w:type="spellStart"/>
+            <w:r>
+              <w:t>coordination</w:t>
+            </w:r>
+            <w:proofErr w:type="spellEnd"/>
+            <w:r>
+              <w:t xml:space="preserve">. </w:t>
+            </w:r>
+            <w:r>
+              <w:t xml:space="preserve">Proactive and </w:t>
+            </w:r>
+            <w:proofErr w:type="spellStart"/>
+            <w:r>
+              <w:t>s</w:t>
+            </w:r>
+            <w:r>
+              <w:t>trong</w:t>
+            </w:r>
+            <w:proofErr w:type="spellEnd"/>
+            <w:r>
+              <w:t xml:space="preserve"> </w:t>
             </w:r>
             <w:r>
               <w:t xml:space="preserve">interpersonal </w:t>
             </w:r>
+            <w:proofErr w:type="spellStart"/>
             <w:r>
               <w:t>abilities</w:t>
             </w:r>
-            <w:r>
-              <w:t xml:space="preserve"> with experience </w:t>
+            <w:proofErr w:type="spellEnd"/>
+            <w:r>
+              <w:t xml:space="preserve"> </w:t>
+            </w:r>
+            <w:proofErr w:type="spellStart"/>
+            <w:r>
+              <w:t>with</w:t>
+            </w:r>
+            <w:proofErr w:type="spellEnd"/>
+            <w:r>
+              <w:t xml:space="preserve"> </w:t>
+            </w:r>
+            <w:proofErr w:type="spellStart"/>
+            <w:r>
+              <w:t>experience</w:t>
+            </w:r>
+            <w:proofErr w:type="spellEnd"/>
+            <w:r>
+              <w:t xml:space="preserve"> </w:t>
             </w:r>
             <w:r>
               <w:t xml:space="preserve">in </w:t>
@@ -98,8 +214,93 @@
             <w:r>
               <w:t xml:space="preserve">multicultural </w:t>
             </w:r>
-            <w:r>
-              <w:t xml:space="preserve">teams, ensuring smooth system deployment and delivery. Fluent in English (C1) and actively improving German. More information in my </w:t>
+            <w:proofErr w:type="spellStart"/>
+            <w:r>
+              <w:t>teams</w:t>
+            </w:r>
+            <w:proofErr w:type="spellEnd"/>
+            <w:r>
+              <w:t xml:space="preserve">, </w:t>
+            </w:r>
+            <w:proofErr w:type="spellStart"/>
+            <w:r>
+              <w:t>ensuring</w:t>
+            </w:r>
+            <w:proofErr w:type="spellEnd"/>
+            <w:r>
+              <w:t xml:space="preserve"> </w:t>
+            </w:r>
+            <w:proofErr w:type="spellStart"/>
+            <w:r>
+              <w:t>smooth</w:t>
+            </w:r>
+            <w:proofErr w:type="spellEnd"/>
+            <w:r>
+              <w:t xml:space="preserve"> </w:t>
+            </w:r>
+            <w:proofErr w:type="spellStart"/>
+            <w:r>
+              <w:t>system</w:t>
+            </w:r>
+            <w:proofErr w:type="spellEnd"/>
+            <w:r>
+              <w:t xml:space="preserve"> </w:t>
+            </w:r>
+            <w:proofErr w:type="spellStart"/>
+            <w:r>
+              <w:t>deployment</w:t>
+            </w:r>
+            <w:proofErr w:type="spellEnd"/>
+            <w:r>
+              <w:t xml:space="preserve"> and </w:t>
+            </w:r>
+            <w:proofErr w:type="spellStart"/>
+            <w:r>
+              <w:t>delivery</w:t>
+            </w:r>
+            <w:proofErr w:type="spellEnd"/>
+            <w:r>
+              <w:t xml:space="preserve">. </w:t>
+            </w:r>
+            <w:proofErr w:type="spellStart"/>
+            <w:r>
+              <w:t>Fluent</w:t>
+            </w:r>
+            <w:proofErr w:type="spellEnd"/>
+            <w:r>
+              <w:t xml:space="preserve"> in English (C1) and </w:t>
+            </w:r>
+            <w:proofErr w:type="spellStart"/>
+            <w:r>
+              <w:t>actively</w:t>
+            </w:r>
+            <w:proofErr w:type="spellEnd"/>
+            <w:r>
+              <w:t xml:space="preserve"> </w:t>
+            </w:r>
+            <w:proofErr w:type="spellStart"/>
+            <w:r>
+              <w:t>improving</w:t>
+            </w:r>
+            <w:proofErr w:type="spellEnd"/>
+            <w:r>
+              <w:t xml:space="preserve"> German. More </w:t>
+            </w:r>
+            <w:proofErr w:type="spellStart"/>
+            <w:r>
+              <w:t>information</w:t>
+            </w:r>
+            <w:proofErr w:type="spellEnd"/>
+            <w:r>
+              <w:t xml:space="preserve"> in </w:t>
+            </w:r>
+            <w:proofErr w:type="spellStart"/>
+            <w:r>
+              <w:t>my</w:t>
+            </w:r>
+            <w:proofErr w:type="spellEnd"/>
+            <w:r>
+              <w:t xml:space="preserve"> </w:t>
             </w:r>
             <w:hyperlink r:id="rId7" w:history="1">
               <w:r>
@@ -107,11 +308,35 @@
               </w:r>
             </w:hyperlink>
             <w:r>
-              <w:t xml:space="preserve"> or my </w:t>
+              <w:t xml:space="preserve"> </w:t>
+            </w:r>
+            <w:proofErr w:type="spellStart"/>
+            <w:r>
+              <w:t>or</w:t>
+            </w:r>
+            <w:proofErr w:type="spellEnd"/>
+            <w:r>
+              <w:t xml:space="preserve"> </w:t>
+            </w:r>
+            <w:proofErr w:type="spellStart"/>
+            <w:r>
+              <w:t>my</w:t>
+            </w:r>
+            <w:proofErr w:type="spellEnd"/>
+            <w:r>
+              <w:t xml:space="preserve"> </w:t>
             </w:r>
             <w:hyperlink r:id="rId8" w:history="1">
               <w:r>
-                <w:t>personal website!</w:t>
+                <w:t xml:space="preserve">personal </w:t>
+              </w:r>
+              <w:proofErr w:type="spellStart"/>
+              <w:r>
+                <w:t>website</w:t>
+              </w:r>
+              <w:proofErr w:type="spellEnd"/>
+              <w:r>
+                <w:t>!</w:t>
               </w:r>
             </w:hyperlink>
           </w:p>
@@ -122,6 +347,10 @@
           <w:tcPr>
             <w:tcW w:w="10490" w:type="dxa"/>
             <w:gridSpan w:val="5"/>
+            <w:tcBorders>
+              <w:top w:val="single" w:sz="8" w:space="0" w:color="0070C0"/>
+              <w:bottom w:val="single" w:sz="8" w:space="0" w:color="0070C0"/>
+            </w:tcBorders>
           </w:tcPr>
           <w:p>
             <w:pPr>
@@ -138,19 +367,56 @@
           <w:tcPr>
             <w:tcW w:w="6658" w:type="dxa"/>
             <w:gridSpan w:val="3"/>
+            <w:tcBorders>
+              <w:top w:val="single" w:sz="8" w:space="0" w:color="0070C0"/>
+            </w:tcBorders>
           </w:tcPr>
           <w:p>
             <w:pPr>
               <w:pStyle w:val="Ttulo4"/>
             </w:pPr>
             <w:hyperlink r:id="rId9" w:history="1">
+              <w:proofErr w:type="spellStart"/>
               <w:r>
                 <w:rPr>
                   <w:color w:val="1E1E1E"/>
                   <w:u w:val="single"/>
                 </w:rPr>
-                <w:t>Automation &amp; Control Systems Intern</w:t>
+                <w:t>Automation</w:t>
               </w:r>
+              <w:proofErr w:type="spellEnd"/>
+              <w:r>
+                <w:rPr>
+                  <w:color w:val="1E1E1E"/>
+                  <w:u w:val="single"/>
+                </w:rPr>
+                <w:t xml:space="preserve"> &amp; Control </w:t>
+              </w:r>
+              <w:proofErr w:type="spellStart"/>
+              <w:r>
+                <w:rPr>
+                  <w:color w:val="1E1E1E"/>
+                  <w:u w:val="single"/>
+                </w:rPr>
+                <w:t>Systems</w:t>
+              </w:r>
+              <w:proofErr w:type="spellEnd"/>
+              <w:r>
+                <w:rPr>
+                  <w:color w:val="1E1E1E"/>
+                  <w:u w:val="single"/>
+                </w:rPr>
+                <w:t xml:space="preserve"> </w:t>
+              </w:r>
+              <w:proofErr w:type="spellStart"/>
+              <w:r>
+                <w:rPr>
+                  <w:color w:val="1E1E1E"/>
+                  <w:u w:val="single"/>
+                </w:rPr>
+                <w:t>Intern</w:t>
+              </w:r>
+              <w:proofErr w:type="spellEnd"/>
             </w:hyperlink>
             <w:r>
               <w:rPr>
@@ -164,8 +430,31 @@
                   <w:color w:val="1E1E1E"/>
                   <w:u w:val="single"/>
                 </w:rPr>
-                <w:t>WOLKE SpA</w:t>
+                <w:t>W</w:t>
               </w:r>
+              <w:r>
+                <w:rPr>
+                  <w:color w:val="1E1E1E"/>
+                  <w:u w:val="single"/>
+                </w:rPr>
+                <w:t>O</w:t>
+              </w:r>
+              <w:r>
+                <w:rPr>
+                  <w:color w:val="1E1E1E"/>
+                  <w:u w:val="single"/>
+                </w:rPr>
+                <w:t xml:space="preserve">LKE </w:t>
+              </w:r>
+              <w:proofErr w:type="spellStart"/>
+              <w:r>
+                <w:rPr>
+                  <w:color w:val="1E1E1E"/>
+                  <w:u w:val="single"/>
+                </w:rPr>
+                <w:t>SpA</w:t>
+              </w:r>
+              <w:proofErr w:type="spellEnd"/>
             </w:hyperlink>
             <w:r>
               <w:tab/>
@@ -176,14 +465,22 @@
           <w:tcPr>
             <w:tcW w:w="3832" w:type="dxa"/>
             <w:gridSpan w:val="2"/>
+            <w:tcBorders>
+              <w:top w:val="single" w:sz="8" w:space="0" w:color="0070C0"/>
+            </w:tcBorders>
           </w:tcPr>
           <w:p>
             <w:pPr>
               <w:pStyle w:val="Ttulo4"/>
             </w:pPr>
             <w:r>
-              <w:t>Nov 2024 - Present</w:t>
-            </w:r>
+              <w:t xml:space="preserve">Nov 2024 - </w:t>
+            </w:r>
+            <w:proofErr w:type="spellStart"/>
+            <w:r>
+              <w:t>Present</w:t>
+            </w:r>
+            <w:proofErr w:type="spellEnd"/>
           </w:p>
         </w:tc>
       </w:tr>
@@ -204,11 +501,133 @@
                 <w:color w:val="auto"/>
               </w:rPr>
             </w:pPr>
-            <w:r>
-              <w:t xml:space="preserve">Implemented telemetry for a remote power transmission system, enabling real-time monitoring of an induction heating machine for metal spears in </w:t>
-            </w:r>
-            <w:r>
-              <w:t>flame cutting.</w:t>
+            <w:proofErr w:type="spellStart"/>
+            <w:r>
+              <w:t>Implemented</w:t>
+            </w:r>
+            <w:proofErr w:type="spellEnd"/>
+            <w:r>
+              <w:t xml:space="preserve"> </w:t>
+            </w:r>
+            <w:proofErr w:type="spellStart"/>
+            <w:r>
+              <w:t>telemetry</w:t>
+            </w:r>
+            <w:proofErr w:type="spellEnd"/>
+            <w:r>
+              <w:t xml:space="preserve"> </w:t>
+            </w:r>
+            <w:proofErr w:type="spellStart"/>
+            <w:r>
+              <w:t>for</w:t>
+            </w:r>
+            <w:proofErr w:type="spellEnd"/>
+            <w:r>
+              <w:t xml:space="preserve"> a remote </w:t>
+            </w:r>
+            <w:proofErr w:type="spellStart"/>
+            <w:r>
+              <w:t>power</w:t>
+            </w:r>
+            <w:proofErr w:type="spellEnd"/>
+            <w:r>
+              <w:t xml:space="preserve"> </w:t>
+            </w:r>
+            <w:proofErr w:type="spellStart"/>
+            <w:r>
+              <w:t>transmission</w:t>
+            </w:r>
+            <w:proofErr w:type="spellEnd"/>
+            <w:r>
+              <w:t xml:space="preserve"> </w:t>
+            </w:r>
+            <w:proofErr w:type="spellStart"/>
+            <w:r>
+              <w:t>system</w:t>
+            </w:r>
+            <w:proofErr w:type="spellEnd"/>
+            <w:r>
+              <w:t xml:space="preserve">, </w:t>
+            </w:r>
+            <w:proofErr w:type="spellStart"/>
+            <w:r>
+              <w:t>enabling</w:t>
+            </w:r>
+            <w:proofErr w:type="spellEnd"/>
+            <w:r>
+              <w:t xml:space="preserve"> real-time </w:t>
+            </w:r>
+            <w:proofErr w:type="spellStart"/>
+            <w:r>
+              <w:t>monitoring</w:t>
+            </w:r>
+            <w:proofErr w:type="spellEnd"/>
+            <w:r>
+              <w:t xml:space="preserve"> </w:t>
+            </w:r>
+            <w:proofErr w:type="spellStart"/>
+            <w:r>
+              <w:t>of</w:t>
+            </w:r>
+            <w:proofErr w:type="spellEnd"/>
+            <w:r>
+              <w:t xml:space="preserve"> </w:t>
+            </w:r>
+            <w:proofErr w:type="spellStart"/>
+            <w:r>
+              <w:t>an</w:t>
+            </w:r>
+            <w:proofErr w:type="spellEnd"/>
+            <w:r>
+              <w:t xml:space="preserve"> </w:t>
+            </w:r>
+            <w:proofErr w:type="spellStart"/>
+            <w:r>
+              <w:t>induction</w:t>
+            </w:r>
+            <w:proofErr w:type="spellEnd"/>
+            <w:r>
+              <w:t xml:space="preserve"> </w:t>
+            </w:r>
+            <w:proofErr w:type="spellStart"/>
+            <w:r>
+              <w:t>heating</w:t>
+            </w:r>
+            <w:proofErr w:type="spellEnd"/>
+            <w:r>
+              <w:t xml:space="preserve"> machine </w:t>
+            </w:r>
+            <w:proofErr w:type="spellStart"/>
+            <w:r>
+              <w:t>for</w:t>
+            </w:r>
+            <w:proofErr w:type="spellEnd"/>
+            <w:r>
+              <w:t xml:space="preserve"> metal </w:t>
+            </w:r>
+            <w:proofErr w:type="spellStart"/>
+            <w:r>
+              <w:t>spears</w:t>
+            </w:r>
+            <w:proofErr w:type="spellEnd"/>
+            <w:r>
+              <w:t xml:space="preserve"> in </w:t>
+            </w:r>
+            <w:proofErr w:type="spellStart"/>
+            <w:r>
+              <w:t>flame</w:t>
+            </w:r>
+            <w:proofErr w:type="spellEnd"/>
+            <w:r>
+              <w:t xml:space="preserve"> </w:t>
+            </w:r>
+            <w:proofErr w:type="spellStart"/>
+            <w:r>
+              <w:t>cutting</w:t>
+            </w:r>
+            <w:proofErr w:type="spellEnd"/>
+            <w:r>
+              <w:t>.</w:t>
             </w:r>
           </w:p>
           <w:p>
@@ -222,8 +641,93 @@
                 <w:color w:val="auto"/>
               </w:rPr>
             </w:pPr>
-            <w:r>
-              <w:t>Assisted in hardware selection (PLCs, sensors, network devices), ensuring compliance with electrical safety standards.</w:t>
+            <w:proofErr w:type="spellStart"/>
+            <w:r>
+              <w:t>Assisted</w:t>
+            </w:r>
+            <w:proofErr w:type="spellEnd"/>
+            <w:r>
+              <w:t xml:space="preserve"> in hardware </w:t>
+            </w:r>
+            <w:proofErr w:type="spellStart"/>
+            <w:r>
+              <w:t>selection</w:t>
+            </w:r>
+            <w:proofErr w:type="spellEnd"/>
+            <w:r>
+              <w:t xml:space="preserve"> (</w:t>
+            </w:r>
+            <w:proofErr w:type="spellStart"/>
+            <w:r>
+              <w:t>PLCs</w:t>
+            </w:r>
+            <w:proofErr w:type="spellEnd"/>
+            <w:r>
+              <w:t xml:space="preserve">, </w:t>
+            </w:r>
+            <w:proofErr w:type="spellStart"/>
+            <w:r>
+              <w:t>sensors</w:t>
+            </w:r>
+            <w:proofErr w:type="spellEnd"/>
+            <w:r>
+              <w:t xml:space="preserve">, </w:t>
+            </w:r>
+            <w:proofErr w:type="spellStart"/>
+            <w:r>
+              <w:t>network</w:t>
+            </w:r>
+            <w:proofErr w:type="spellEnd"/>
+            <w:r>
+              <w:t xml:space="preserve"> </w:t>
+            </w:r>
+            <w:proofErr w:type="spellStart"/>
+            <w:r>
+              <w:t>devices</w:t>
+            </w:r>
+            <w:proofErr w:type="spellEnd"/>
+            <w:r>
+              <w:t xml:space="preserve">), </w:t>
+            </w:r>
+            <w:proofErr w:type="spellStart"/>
+            <w:r>
+              <w:t>ensuring</w:t>
+            </w:r>
+            <w:proofErr w:type="spellEnd"/>
+            <w:r>
+              <w:t xml:space="preserve"> </w:t>
+            </w:r>
+            <w:proofErr w:type="spellStart"/>
+            <w:r>
+              <w:t>compliance</w:t>
+            </w:r>
+            <w:proofErr w:type="spellEnd"/>
+            <w:r>
+              <w:t xml:space="preserve"> </w:t>
+            </w:r>
+            <w:proofErr w:type="spellStart"/>
+            <w:r>
+              <w:t>with</w:t>
+            </w:r>
+            <w:proofErr w:type="spellEnd"/>
+            <w:r>
+              <w:t xml:space="preserve"> </w:t>
+            </w:r>
+            <w:proofErr w:type="spellStart"/>
+            <w:r>
+              <w:t>electrical</w:t>
+            </w:r>
+            <w:proofErr w:type="spellEnd"/>
+            <w:r>
+              <w:t xml:space="preserve"> safety </w:t>
+            </w:r>
+            <w:proofErr w:type="spellStart"/>
+            <w:r>
+              <w:t>standards</w:t>
+            </w:r>
+            <w:proofErr w:type="spellEnd"/>
+            <w:r>
+              <w:t>.</w:t>
             </w:r>
           </w:p>
           <w:p>
@@ -234,29 +738,126 @@
                 <w:numId w:val="8"/>
               </w:numPr>
             </w:pPr>
-            <w:r>
-              <w:t>Managed and optimi</w:t>
+            <w:proofErr w:type="spellStart"/>
+            <w:r>
+              <w:t>Managed</w:t>
+            </w:r>
+            <w:proofErr w:type="spellEnd"/>
+            <w:r>
+              <w:t xml:space="preserve"> and </w:t>
+            </w:r>
+            <w:proofErr w:type="spellStart"/>
+            <w:r>
+              <w:t>optimi</w:t>
             </w:r>
             <w:r>
               <w:t>s</w:t>
             </w:r>
             <w:r>
-              <w:t>ed the</w:t>
-            </w:r>
-            <w:r>
-              <w:t xml:space="preserve"> </w:t>
-            </w:r>
+              <w:t>ed</w:t>
+            </w:r>
+            <w:proofErr w:type="spellEnd"/>
+            <w:r>
+              <w:t xml:space="preserve"> </w:t>
+            </w:r>
+            <w:proofErr w:type="spellStart"/>
+            <w:r>
+              <w:t>the</w:t>
+            </w:r>
+            <w:proofErr w:type="spellEnd"/>
+            <w:r>
+              <w:t xml:space="preserve"> </w:t>
+            </w:r>
+            <w:proofErr w:type="spellStart"/>
             <w:r>
               <w:t>company</w:t>
             </w:r>
-            <w:r>
-              <w:t xml:space="preserve"> database structure, utilizing </w:t>
+            <w:proofErr w:type="spellEnd"/>
+            <w:r>
+              <w:t xml:space="preserve"> </w:t>
+            </w:r>
+            <w:proofErr w:type="spellStart"/>
+            <w:r>
+              <w:t>database</w:t>
+            </w:r>
+            <w:proofErr w:type="spellEnd"/>
+            <w:r>
+              <w:t xml:space="preserve"> </w:t>
+            </w:r>
+            <w:proofErr w:type="spellStart"/>
+            <w:r>
+              <w:t>structure</w:t>
+            </w:r>
+            <w:proofErr w:type="spellEnd"/>
+            <w:r>
+              <w:t xml:space="preserve">, </w:t>
+            </w:r>
+            <w:proofErr w:type="spellStart"/>
+            <w:r>
+              <w:t>utilizing</w:t>
+            </w:r>
+            <w:proofErr w:type="spellEnd"/>
+            <w:r>
+              <w:t xml:space="preserve"> </w:t>
             </w:r>
             <w:r>
               <w:t xml:space="preserve">Microsoft </w:t>
             </w:r>
-            <w:r>
-              <w:t>Teams, SharePoint, Excel, Word, and permissions management to enhance collaboration and data security.</w:t>
+            <w:proofErr w:type="spellStart"/>
+            <w:r>
+              <w:t>Teams</w:t>
+            </w:r>
+            <w:proofErr w:type="spellEnd"/>
+            <w:r>
+              <w:t xml:space="preserve">, SharePoint, Excel, Word, and </w:t>
+            </w:r>
+            <w:proofErr w:type="spellStart"/>
+            <w:r>
+              <w:t>permissions</w:t>
+            </w:r>
+            <w:proofErr w:type="spellEnd"/>
+            <w:r>
+              <w:t xml:space="preserve"> </w:t>
+            </w:r>
+            <w:proofErr w:type="spellStart"/>
+            <w:r>
+              <w:t>management</w:t>
+            </w:r>
+            <w:proofErr w:type="spellEnd"/>
+            <w:r>
+              <w:t xml:space="preserve"> </w:t>
+            </w:r>
+            <w:proofErr w:type="spellStart"/>
+            <w:r>
+              <w:t>to</w:t>
+            </w:r>
+            <w:proofErr w:type="spellEnd"/>
+            <w:r>
+              <w:t xml:space="preserve"> </w:t>
+            </w:r>
+            <w:proofErr w:type="spellStart"/>
+            <w:r>
+              <w:t>enhance</w:t>
+            </w:r>
+            <w:proofErr w:type="spellEnd"/>
+            <w:r>
+              <w:t xml:space="preserve"> </w:t>
+            </w:r>
+            <w:proofErr w:type="spellStart"/>
+            <w:r>
+              <w:t>collaboration</w:t>
+            </w:r>
+            <w:proofErr w:type="spellEnd"/>
+            <w:r>
+              <w:t xml:space="preserve"> and data </w:t>
+            </w:r>
+            <w:proofErr w:type="spellStart"/>
+            <w:r>
+              <w:t>security</w:t>
+            </w:r>
+            <w:proofErr w:type="spellEnd"/>
+            <w:r>
+              <w:t>.</w:t>
             </w:r>
           </w:p>
           <w:p/>
@@ -273,9 +874,19 @@
               <w:pStyle w:val="Ttulo4"/>
             </w:pPr>
             <w:hyperlink r:id="rId11" w:history="1">
+              <w:proofErr w:type="spellStart"/>
               <w:r>
-                <w:t>Intern - Project Management Office, CISC SpA</w:t>
+                <w:t>Intern</w:t>
               </w:r>
+              <w:proofErr w:type="spellEnd"/>
+              <w:r>
+                <w:t xml:space="preserve"> - Project Management Office, CISC </w:t>
+              </w:r>
+              <w:proofErr w:type="spellStart"/>
+              <w:r>
+                <w:t>SpA</w:t>
+              </w:r>
+              <w:proofErr w:type="spellEnd"/>
             </w:hyperlink>
           </w:p>
         </w:tc>
@@ -288,8 +899,13 @@
             <w:pPr>
               <w:pStyle w:val="Ttulo4"/>
             </w:pPr>
-            <w:r>
-              <w:t>Aug 2024 - Nov 2024</w:t>
+            <w:proofErr w:type="spellStart"/>
+            <w:r>
+              <w:t>Aug</w:t>
+            </w:r>
+            <w:proofErr w:type="spellEnd"/>
+            <w:r>
+              <w:t xml:space="preserve"> 2024 - Nov 2024</w:t>
             </w:r>
           </w:p>
         </w:tc>
@@ -302,6 +918,9 @@
           <w:tcPr>
             <w:tcW w:w="10490" w:type="dxa"/>
             <w:gridSpan w:val="5"/>
+            <w:tcBorders>
+              <w:bottom w:val="single" w:sz="8" w:space="0" w:color="0070C0"/>
+            </w:tcBorders>
           </w:tcPr>
           <w:p>
             <w:pPr>
@@ -314,18 +933,257 @@
                 <w:color w:val="auto"/>
               </w:rPr>
             </w:pPr>
-            <w:r>
-              <w:t>Contributed to a large-scale green hydrogen project, focusing on renewable energy solutions including wind power generation and energy storage (electroly</w:t>
+            <w:proofErr w:type="spellStart"/>
+            <w:r>
+              <w:t>Contributed</w:t>
+            </w:r>
+            <w:proofErr w:type="spellEnd"/>
+            <w:r>
+              <w:t xml:space="preserve"> </w:t>
+            </w:r>
+            <w:proofErr w:type="spellStart"/>
+            <w:r>
+              <w:t>to</w:t>
+            </w:r>
+            <w:proofErr w:type="spellEnd"/>
+            <w:r>
+              <w:t xml:space="preserve"> a </w:t>
+            </w:r>
+            <w:proofErr w:type="spellStart"/>
+            <w:r>
+              <w:t>large-scale</w:t>
+            </w:r>
+            <w:proofErr w:type="spellEnd"/>
+            <w:r>
+              <w:t xml:space="preserve"> </w:t>
+            </w:r>
+            <w:proofErr w:type="spellStart"/>
+            <w:r>
+              <w:t>green</w:t>
+            </w:r>
+            <w:proofErr w:type="spellEnd"/>
+            <w:r>
+              <w:t xml:space="preserve"> </w:t>
+            </w:r>
+            <w:proofErr w:type="spellStart"/>
+            <w:r>
+              <w:t>hydrogen</w:t>
+            </w:r>
+            <w:proofErr w:type="spellEnd"/>
+            <w:r>
+              <w:t xml:space="preserve"> </w:t>
+            </w:r>
+            <w:proofErr w:type="spellStart"/>
+            <w:r>
+              <w:t>project</w:t>
+            </w:r>
+            <w:proofErr w:type="spellEnd"/>
+            <w:r>
+              <w:t xml:space="preserve">, </w:t>
+            </w:r>
+            <w:proofErr w:type="spellStart"/>
+            <w:r>
+              <w:t>focusing</w:t>
+            </w:r>
+            <w:proofErr w:type="spellEnd"/>
+            <w:r>
+              <w:t xml:space="preserve"> </w:t>
+            </w:r>
+            <w:proofErr w:type="spellStart"/>
+            <w:r>
+              <w:t>on</w:t>
+            </w:r>
+            <w:proofErr w:type="spellEnd"/>
+            <w:r>
+              <w:t xml:space="preserve"> </w:t>
+            </w:r>
+            <w:proofErr w:type="spellStart"/>
+            <w:r>
+              <w:t>renewable</w:t>
+            </w:r>
+            <w:proofErr w:type="spellEnd"/>
+            <w:r>
+              <w:t xml:space="preserve"> </w:t>
+            </w:r>
+            <w:proofErr w:type="spellStart"/>
+            <w:r>
+              <w:t>energy</w:t>
+            </w:r>
+            <w:proofErr w:type="spellEnd"/>
+            <w:r>
+              <w:t xml:space="preserve"> </w:t>
+            </w:r>
+            <w:proofErr w:type="spellStart"/>
+            <w:r>
+              <w:t>solutions</w:t>
+            </w:r>
+            <w:proofErr w:type="spellEnd"/>
+            <w:r>
+              <w:t xml:space="preserve"> </w:t>
+            </w:r>
+            <w:proofErr w:type="spellStart"/>
+            <w:r>
+              <w:t>including</w:t>
+            </w:r>
+            <w:proofErr w:type="spellEnd"/>
+            <w:r>
+              <w:t xml:space="preserve"> </w:t>
+            </w:r>
+            <w:proofErr w:type="spellStart"/>
+            <w:r>
+              <w:t>wind</w:t>
+            </w:r>
+            <w:proofErr w:type="spellEnd"/>
+            <w:r>
+              <w:t xml:space="preserve"> </w:t>
+            </w:r>
+            <w:proofErr w:type="spellStart"/>
+            <w:r>
+              <w:t>power</w:t>
+            </w:r>
+            <w:proofErr w:type="spellEnd"/>
+            <w:r>
+              <w:t xml:space="preserve"> </w:t>
+            </w:r>
+            <w:proofErr w:type="spellStart"/>
+            <w:r>
+              <w:t>generation</w:t>
+            </w:r>
+            <w:proofErr w:type="spellEnd"/>
+            <w:r>
+              <w:t xml:space="preserve"> and </w:t>
+            </w:r>
+            <w:proofErr w:type="spellStart"/>
+            <w:r>
+              <w:t>energy</w:t>
+            </w:r>
+            <w:proofErr w:type="spellEnd"/>
+            <w:r>
+              <w:t xml:space="preserve"> </w:t>
+            </w:r>
+            <w:proofErr w:type="spellStart"/>
+            <w:r>
+              <w:t>storage</w:t>
+            </w:r>
+            <w:proofErr w:type="spellEnd"/>
+            <w:r>
+              <w:t xml:space="preserve"> (</w:t>
+            </w:r>
+            <w:proofErr w:type="spellStart"/>
+            <w:r>
+              <w:t>electroly</w:t>
             </w:r>
             <w:r>
               <w:t>s</w:t>
             </w:r>
             <w:r>
-              <w:t xml:space="preserve">er, battery systems, hydrogen storage). Managed to catalogue +10.000 keywords in +2000 technical files to optimise </w:t>
-            </w:r>
-            <w:r>
-              <w:t>the company database</w:t>
-            </w:r>
+              <w:t>er</w:t>
+            </w:r>
+            <w:proofErr w:type="spellEnd"/>
+            <w:r>
+              <w:t xml:space="preserve">, </w:t>
+            </w:r>
+            <w:proofErr w:type="spellStart"/>
+            <w:r>
+              <w:t>battery</w:t>
+            </w:r>
+            <w:proofErr w:type="spellEnd"/>
+            <w:r>
+              <w:t xml:space="preserve"> </w:t>
+            </w:r>
+            <w:proofErr w:type="spellStart"/>
+            <w:r>
+              <w:t>systems</w:t>
+            </w:r>
+            <w:proofErr w:type="spellEnd"/>
+            <w:r>
+              <w:t xml:space="preserve">, </w:t>
+            </w:r>
+            <w:proofErr w:type="spellStart"/>
+            <w:r>
+              <w:t>hydrogen</w:t>
+            </w:r>
+            <w:proofErr w:type="spellEnd"/>
+            <w:r>
+              <w:t xml:space="preserve"> </w:t>
+            </w:r>
+            <w:proofErr w:type="spellStart"/>
+            <w:r>
+              <w:t>storage</w:t>
+            </w:r>
+            <w:proofErr w:type="spellEnd"/>
+            <w:r>
+              <w:t xml:space="preserve">). </w:t>
+            </w:r>
+            <w:proofErr w:type="spellStart"/>
+            <w:r>
+              <w:t>Managed</w:t>
+            </w:r>
+            <w:proofErr w:type="spellEnd"/>
+            <w:r>
+              <w:t xml:space="preserve"> </w:t>
+            </w:r>
+            <w:proofErr w:type="spellStart"/>
+            <w:r>
+              <w:t>to</w:t>
+            </w:r>
+            <w:proofErr w:type="spellEnd"/>
+            <w:r>
+              <w:t xml:space="preserve"> catalogue +10.000 </w:t>
+            </w:r>
+            <w:proofErr w:type="spellStart"/>
+            <w:r>
+              <w:t>keywords</w:t>
+            </w:r>
+            <w:proofErr w:type="spellEnd"/>
+            <w:r>
+              <w:t xml:space="preserve"> in +2000 </w:t>
+            </w:r>
+            <w:proofErr w:type="spellStart"/>
+            <w:r>
+              <w:t>technical</w:t>
+            </w:r>
+            <w:proofErr w:type="spellEnd"/>
+            <w:r>
+              <w:t xml:space="preserve"> files </w:t>
+            </w:r>
+            <w:proofErr w:type="spellStart"/>
+            <w:r>
+              <w:t>to</w:t>
+            </w:r>
+            <w:proofErr w:type="spellEnd"/>
+            <w:r>
+              <w:t xml:space="preserve"> </w:t>
+            </w:r>
+            <w:proofErr w:type="spellStart"/>
+            <w:r>
+              <w:t>optimise</w:t>
+            </w:r>
+            <w:proofErr w:type="spellEnd"/>
+            <w:r>
+              <w:t xml:space="preserve"> </w:t>
+            </w:r>
+            <w:proofErr w:type="spellStart"/>
+            <w:r>
+              <w:t>the</w:t>
+            </w:r>
+            <w:proofErr w:type="spellEnd"/>
+            <w:r>
+              <w:t xml:space="preserve"> </w:t>
+            </w:r>
+            <w:proofErr w:type="spellStart"/>
+            <w:r>
+              <w:t>company</w:t>
+            </w:r>
+            <w:proofErr w:type="spellEnd"/>
+            <w:r>
+              <w:t xml:space="preserve"> </w:t>
+            </w:r>
+            <w:proofErr w:type="spellStart"/>
+            <w:r>
+              <w:t>database</w:t>
+            </w:r>
+            <w:proofErr w:type="spellEnd"/>
             <w:r>
               <w:t>.</w:t>
             </w:r>
@@ -337,6 +1195,10 @@
           <w:tcPr>
             <w:tcW w:w="10490" w:type="dxa"/>
             <w:gridSpan w:val="5"/>
+            <w:tcBorders>
+              <w:top w:val="single" w:sz="8" w:space="0" w:color="0070C0"/>
+              <w:bottom w:val="single" w:sz="8" w:space="0" w:color="0070C0"/>
+            </w:tcBorders>
           </w:tcPr>
           <w:p>
             <w:pPr>
@@ -353,26 +1215,74 @@
           <w:tcPr>
             <w:tcW w:w="6799" w:type="dxa"/>
             <w:gridSpan w:val="4"/>
+            <w:tcBorders>
+              <w:top w:val="single" w:sz="8" w:space="0" w:color="0070C0"/>
+            </w:tcBorders>
           </w:tcPr>
           <w:p>
             <w:pPr>
               <w:pStyle w:val="Ttulo4"/>
             </w:pPr>
-            <w:r>
-              <w:t>Bachelor and Honours Degree in Electrical Engineering</w:t>
-            </w:r>
+            <w:proofErr w:type="spellStart"/>
+            <w:r>
+              <w:t>Bachelor</w:t>
+            </w:r>
+            <w:proofErr w:type="spellEnd"/>
+            <w:r>
+              <w:t xml:space="preserve"> and </w:t>
+            </w:r>
+            <w:proofErr w:type="spellStart"/>
+            <w:r>
+              <w:t>Honours</w:t>
+            </w:r>
+            <w:proofErr w:type="spellEnd"/>
+            <w:r>
+              <w:t xml:space="preserve"> </w:t>
+            </w:r>
+            <w:proofErr w:type="spellStart"/>
+            <w:r>
+              <w:t>Degree</w:t>
+            </w:r>
+            <w:proofErr w:type="spellEnd"/>
+            <w:r>
+              <w:t xml:space="preserve"> in </w:t>
+            </w:r>
+            <w:proofErr w:type="spellStart"/>
+            <w:r>
+              <w:t>Electrical</w:t>
+            </w:r>
+            <w:proofErr w:type="spellEnd"/>
+            <w:r>
+              <w:t xml:space="preserve"> </w:t>
+            </w:r>
+            <w:proofErr w:type="spellStart"/>
+            <w:r>
+              <w:t>Engineering</w:t>
+            </w:r>
+            <w:proofErr w:type="spellEnd"/>
           </w:p>
         </w:tc>
         <w:tc>
           <w:tcPr>
             <w:tcW w:w="3691" w:type="dxa"/>
+            <w:tcBorders>
+              <w:top w:val="single" w:sz="8" w:space="0" w:color="0070C0"/>
+            </w:tcBorders>
           </w:tcPr>
           <w:p>
             <w:pPr>
               <w:pStyle w:val="Ttulo4"/>
             </w:pPr>
             <w:r>
-              <w:t>Feb 2019 - Dec 2024</w:t>
+              <w:t xml:space="preserve">Feb 2019 - </w:t>
+            </w:r>
+            <w:proofErr w:type="spellStart"/>
+            <w:r>
+              <w:t>Dec</w:t>
+            </w:r>
+            <w:proofErr w:type="spellEnd"/>
+            <w:r>
+              <w:t xml:space="preserve"> 2024</w:t>
             </w:r>
           </w:p>
         </w:tc>
@@ -392,7 +1302,31 @@
               </w:rPr>
             </w:pPr>
             <w:r>
-              <w:t>Pontifical Catholic University of Chile</w:t>
+              <w:t xml:space="preserve">Pontifical </w:t>
+            </w:r>
+            <w:proofErr w:type="spellStart"/>
+            <w:r>
+              <w:t>Catholic</w:t>
+            </w:r>
+            <w:proofErr w:type="spellEnd"/>
+            <w:r>
+              <w:t xml:space="preserve"> </w:t>
+            </w:r>
+            <w:proofErr w:type="spellStart"/>
+            <w:r>
+              <w:t>University</w:t>
+            </w:r>
+            <w:proofErr w:type="spellEnd"/>
+            <w:r>
+              <w:t xml:space="preserve"> </w:t>
+            </w:r>
+            <w:proofErr w:type="spellStart"/>
+            <w:r>
+              <w:t>of</w:t>
+            </w:r>
+            <w:proofErr w:type="spellEnd"/>
+            <w:r>
+              <w:t xml:space="preserve"> Chile</w:t>
             </w:r>
           </w:p>
         </w:tc>
@@ -424,8 +1358,37 @@
                 <w:color w:val="auto"/>
               </w:rPr>
             </w:pPr>
-            <w:r>
-              <w:t>Major in Electrical Engineering - Minor in industries</w:t>
+            <w:proofErr w:type="spellStart"/>
+            <w:r>
+              <w:t>Major</w:t>
+            </w:r>
+            <w:proofErr w:type="spellEnd"/>
+            <w:r>
+              <w:t xml:space="preserve"> in </w:t>
+            </w:r>
+            <w:proofErr w:type="spellStart"/>
+            <w:r>
+              <w:t>Electrical</w:t>
+            </w:r>
+            <w:proofErr w:type="spellEnd"/>
+            <w:r>
+              <w:t xml:space="preserve"> </w:t>
+            </w:r>
+            <w:proofErr w:type="spellStart"/>
+            <w:r>
+              <w:t>Engineering</w:t>
+            </w:r>
+            <w:proofErr w:type="spellEnd"/>
+            <w:r>
+              <w:t xml:space="preserve"> - </w:t>
+            </w:r>
+            <w:proofErr w:type="spellStart"/>
+            <w:r>
+              <w:t>Minor</w:t>
+            </w:r>
+            <w:proofErr w:type="spellEnd"/>
+            <w:r>
+              <w:t xml:space="preserve"> in industries</w:t>
             </w:r>
           </w:p>
           <w:p>
@@ -439,8 +1402,77 @@
                 <w:color w:val="auto"/>
               </w:rPr>
             </w:pPr>
-            <w:r>
-              <w:t>Honours degree in Renewable Energy (Power Systems, Finance, Electrical Markets, Project Evaluation)</w:t>
+            <w:proofErr w:type="spellStart"/>
+            <w:r>
+              <w:t>Honours</w:t>
+            </w:r>
+            <w:proofErr w:type="spellEnd"/>
+            <w:r>
+              <w:t xml:space="preserve"> </w:t>
+            </w:r>
+            <w:proofErr w:type="spellStart"/>
+            <w:r>
+              <w:t>degree</w:t>
+            </w:r>
+            <w:proofErr w:type="spellEnd"/>
+            <w:r>
+              <w:t xml:space="preserve"> in </w:t>
+            </w:r>
+            <w:proofErr w:type="spellStart"/>
+            <w:r>
+              <w:t>Renewable</w:t>
+            </w:r>
+            <w:proofErr w:type="spellEnd"/>
+            <w:r>
+              <w:t xml:space="preserve"> Energy (</w:t>
+            </w:r>
+            <w:proofErr w:type="spellStart"/>
+            <w:r>
+              <w:t>Power</w:t>
+            </w:r>
+            <w:proofErr w:type="spellEnd"/>
+            <w:r>
+              <w:t xml:space="preserve"> </w:t>
+            </w:r>
+            <w:proofErr w:type="spellStart"/>
+            <w:r>
+              <w:t>Systems</w:t>
+            </w:r>
+            <w:proofErr w:type="spellEnd"/>
+            <w:r>
+              <w:t xml:space="preserve">, </w:t>
+            </w:r>
+            <w:proofErr w:type="spellStart"/>
+            <w:r>
+              <w:t>Finance</w:t>
+            </w:r>
+            <w:proofErr w:type="spellEnd"/>
+            <w:r>
+              <w:t xml:space="preserve">, </w:t>
+            </w:r>
+            <w:proofErr w:type="spellStart"/>
+            <w:r>
+              <w:t>Electrical</w:t>
+            </w:r>
+            <w:proofErr w:type="spellEnd"/>
+            <w:r>
+              <w:t xml:space="preserve"> </w:t>
+            </w:r>
+            <w:proofErr w:type="spellStart"/>
+            <w:r>
+              <w:t>Markets</w:t>
+            </w:r>
+            <w:proofErr w:type="spellEnd"/>
+            <w:r>
+              <w:t xml:space="preserve">, Project </w:t>
+            </w:r>
+            <w:proofErr w:type="spellStart"/>
+            <w:r>
+              <w:t>Evaluation</w:t>
+            </w:r>
+            <w:proofErr w:type="spellEnd"/>
+            <w:r>
+              <w:t>)</w:t>
             </w:r>
           </w:p>
           <w:p>
@@ -463,8 +1495,21 @@
               <w:pStyle w:val="Ttulo4"/>
             </w:pPr>
             <w:r>
-              <w:t>Bilateral Exchange Semester Program</w:t>
-            </w:r>
+              <w:t xml:space="preserve">Bilateral Exchange </w:t>
+            </w:r>
+            <w:proofErr w:type="spellStart"/>
+            <w:r>
+              <w:t>Semester</w:t>
+            </w:r>
+            <w:proofErr w:type="spellEnd"/>
+            <w:r>
+              <w:t xml:space="preserve"> </w:t>
+            </w:r>
+            <w:proofErr w:type="spellStart"/>
+            <w:r>
+              <w:t>Program</w:t>
+            </w:r>
+            <w:proofErr w:type="spellEnd"/>
           </w:p>
         </w:tc>
         <w:tc>
@@ -475,8 +1520,13 @@
             <w:pPr>
               <w:pStyle w:val="Ttulo4"/>
             </w:pPr>
-            <w:r>
-              <w:t>July 2023 - Feb 2024</w:t>
+            <w:proofErr w:type="spellStart"/>
+            <w:r>
+              <w:t>July</w:t>
+            </w:r>
+            <w:proofErr w:type="spellEnd"/>
+            <w:r>
+              <w:t xml:space="preserve"> 2023 - Feb 2024</w:t>
             </w:r>
           </w:p>
         </w:tc>
@@ -489,7 +1539,15 @@
           </w:tcPr>
           <w:p>
             <w:r>
-              <w:t>Monash University (Australia)</w:t>
+              <w:t xml:space="preserve">Monash </w:t>
+            </w:r>
+            <w:proofErr w:type="spellStart"/>
+            <w:r>
+              <w:t>University</w:t>
+            </w:r>
+            <w:proofErr w:type="spellEnd"/>
+            <w:r>
+              <w:t xml:space="preserve"> (Australia)</w:t>
             </w:r>
           </w:p>
         </w:tc>
@@ -512,6 +1570,9 @@
           <w:tcPr>
             <w:tcW w:w="10490" w:type="dxa"/>
             <w:gridSpan w:val="5"/>
+            <w:tcBorders>
+              <w:bottom w:val="single" w:sz="8" w:space="0" w:color="0070C0"/>
+            </w:tcBorders>
           </w:tcPr>
           <w:p>
             <w:pPr>
@@ -521,8 +1582,29 @@
                 <w:numId w:val="13"/>
               </w:numPr>
             </w:pPr>
-            <w:r>
-              <w:t>Organisational Behaviour, Fluid Dynamics and Operations Management</w:t>
+            <w:proofErr w:type="spellStart"/>
+            <w:r>
+              <w:t>Organisational</w:t>
+            </w:r>
+            <w:proofErr w:type="spellEnd"/>
+            <w:r>
+              <w:t xml:space="preserve"> </w:t>
+            </w:r>
+            <w:proofErr w:type="spellStart"/>
+            <w:r>
+              <w:t>Behaviour</w:t>
+            </w:r>
+            <w:proofErr w:type="spellEnd"/>
+            <w:r>
+              <w:t xml:space="preserve">, Fluid Dynamics and </w:t>
+            </w:r>
+            <w:proofErr w:type="spellStart"/>
+            <w:r>
+              <w:t>Operations</w:t>
+            </w:r>
+            <w:proofErr w:type="spellEnd"/>
+            <w:r>
+              <w:t xml:space="preserve"> Management</w:t>
             </w:r>
           </w:p>
         </w:tc>
@@ -532,6 +1614,10 @@
           <w:tcPr>
             <w:tcW w:w="10490" w:type="dxa"/>
             <w:gridSpan w:val="5"/>
+            <w:tcBorders>
+              <w:top w:val="single" w:sz="8" w:space="0" w:color="0070C0"/>
+              <w:bottom w:val="single" w:sz="8" w:space="0" w:color="0070C0"/>
+            </w:tcBorders>
           </w:tcPr>
           <w:p>
             <w:pPr>
@@ -550,6 +1636,10 @@
         <w:tc>
           <w:tcPr>
             <w:tcW w:w="3006" w:type="dxa"/>
+            <w:tcBorders>
+              <w:top w:val="single" w:sz="8" w:space="0" w:color="0070C0"/>
+              <w:bottom w:val="single" w:sz="8" w:space="0" w:color="0070C0"/>
+            </w:tcBorders>
           </w:tcPr>
           <w:p>
             <w:pPr>
@@ -557,8 +1647,13 @@
                 <w:color w:val="auto"/>
               </w:rPr>
             </w:pPr>
-            <w:r>
-              <w:t>Power BI / Microsoft 365</w:t>
+            <w:proofErr w:type="spellStart"/>
+            <w:r>
+              <w:t>Power</w:t>
+            </w:r>
+            <w:proofErr w:type="spellEnd"/>
+            <w:r>
+              <w:t xml:space="preserve"> BI / Microsoft 365</w:t>
             </w:r>
           </w:p>
           <w:p>
@@ -567,8 +1662,13 @@
                 <w:color w:val="auto"/>
               </w:rPr>
             </w:pPr>
-            <w:r>
-              <w:t>Advanced Excel (macros)</w:t>
+            <w:proofErr w:type="spellStart"/>
+            <w:r>
+              <w:t>Advanced</w:t>
+            </w:r>
+            <w:proofErr w:type="spellEnd"/>
+            <w:r>
+              <w:t xml:space="preserve"> Excel (macros)</w:t>
             </w:r>
           </w:p>
           <w:p>
@@ -577,14 +1677,23 @@
                 <w:color w:val="auto"/>
               </w:rPr>
             </w:pPr>
-            <w:r>
-              <w:t xml:space="preserve">Power Point, Word </w:t>
+            <w:proofErr w:type="spellStart"/>
+            <w:r>
+              <w:t>Power</w:t>
+            </w:r>
+            <w:proofErr w:type="spellEnd"/>
+            <w:r>
+              <w:t xml:space="preserve"> Point, Word </w:t>
             </w:r>
           </w:p>
         </w:tc>
         <w:tc>
           <w:tcPr>
             <w:tcW w:w="3007" w:type="dxa"/>
+            <w:tcBorders>
+              <w:top w:val="single" w:sz="8" w:space="0" w:color="0070C0"/>
+              <w:bottom w:val="single" w:sz="8" w:space="0" w:color="0070C0"/>
+            </w:tcBorders>
           </w:tcPr>
           <w:p>
             <w:pPr>
@@ -593,7 +1702,15 @@
               </w:rPr>
             </w:pPr>
             <w:r>
-              <w:t>Matlab (basics)</w:t>
+              <w:t>Matlab (</w:t>
+            </w:r>
+            <w:proofErr w:type="spellStart"/>
+            <w:r>
+              <w:t>basics</w:t>
+            </w:r>
+            <w:proofErr w:type="spellEnd"/>
+            <w:r>
+              <w:t>)</w:t>
             </w:r>
           </w:p>
           <w:p>
@@ -603,7 +1720,15 @@
               </w:rPr>
             </w:pPr>
             <w:r>
-              <w:t>Python (advanced)</w:t>
+              <w:t>Python (</w:t>
+            </w:r>
+            <w:proofErr w:type="spellStart"/>
+            <w:r>
+              <w:t>advanced</w:t>
+            </w:r>
+            <w:proofErr w:type="spellEnd"/>
+            <w:r>
+              <w:t>)</w:t>
             </w:r>
           </w:p>
           <w:p>
@@ -613,7 +1738,15 @@
               </w:rPr>
             </w:pPr>
             <w:r>
-              <w:t>C (microcontrollers)</w:t>
+              <w:t>C (</w:t>
+            </w:r>
+            <w:proofErr w:type="spellStart"/>
+            <w:r>
+              <w:t>microcontrollers</w:t>
+            </w:r>
+            <w:proofErr w:type="spellEnd"/>
+            <w:r>
+              <w:t>)</w:t>
             </w:r>
           </w:p>
         </w:tc>
@@ -621,6 +1754,10 @@
           <w:tcPr>
             <w:tcW w:w="4477" w:type="dxa"/>
             <w:gridSpan w:val="3"/>
+            <w:tcBorders>
+              <w:top w:val="single" w:sz="8" w:space="0" w:color="0070C0"/>
+              <w:bottom w:val="single" w:sz="8" w:space="0" w:color="0070C0"/>
+            </w:tcBorders>
           </w:tcPr>
           <w:p>
             <w:pPr>
@@ -628,8 +1765,29 @@
                 <w:color w:val="auto"/>
               </w:rPr>
             </w:pPr>
-            <w:r>
-              <w:t>PowerWorld (Power Systems)</w:t>
+            <w:proofErr w:type="spellStart"/>
+            <w:r>
+              <w:t>PowerWorld</w:t>
+            </w:r>
+            <w:proofErr w:type="spellEnd"/>
+            <w:r>
+              <w:t xml:space="preserve"> (</w:t>
+            </w:r>
+            <w:proofErr w:type="spellStart"/>
+            <w:r>
+              <w:t>Power</w:t>
+            </w:r>
+            <w:proofErr w:type="spellEnd"/>
+            <w:r>
+              <w:t xml:space="preserve"> </w:t>
+            </w:r>
+            <w:proofErr w:type="spellStart"/>
+            <w:r>
+              <w:t>Systems</w:t>
+            </w:r>
+            <w:proofErr w:type="spellEnd"/>
+            <w:r>
+              <w:t>)</w:t>
             </w:r>
           </w:p>
           <w:p>
@@ -639,7 +1797,15 @@
               </w:rPr>
             </w:pPr>
             <w:r>
-              <w:t>R (Data Analysis)</w:t>
+              <w:t xml:space="preserve">R (Data </w:t>
+            </w:r>
+            <w:proofErr w:type="spellStart"/>
+            <w:r>
+              <w:t>Analysis</w:t>
+            </w:r>
+            <w:proofErr w:type="spellEnd"/>
+            <w:r>
+              <w:t>)</w:t>
             </w:r>
           </w:p>
           <w:p>
@@ -648,9 +1814,27 @@
                 <w:color w:val="auto"/>
               </w:rPr>
             </w:pPr>
-            <w:r>
-              <w:t>Type B driver’s License</w:t>
-            </w:r>
+            <w:proofErr w:type="spellStart"/>
+            <w:r>
+              <w:t>Type</w:t>
+            </w:r>
+            <w:proofErr w:type="spellEnd"/>
+            <w:r>
+              <w:t xml:space="preserve"> B </w:t>
+            </w:r>
+            <w:proofErr w:type="spellStart"/>
+            <w:r>
+              <w:t>driver’s</w:t>
+            </w:r>
+            <w:proofErr w:type="spellEnd"/>
+            <w:r>
+              <w:t xml:space="preserve"> </w:t>
+            </w:r>
+            <w:proofErr w:type="spellStart"/>
+            <w:r>
+              <w:t>License</w:t>
+            </w:r>
+            <w:proofErr w:type="spellEnd"/>
           </w:p>
         </w:tc>
       </w:tr>
@@ -659,6 +1843,10 @@
           <w:tcPr>
             <w:tcW w:w="10490" w:type="dxa"/>
             <w:gridSpan w:val="5"/>
+            <w:tcBorders>
+              <w:top w:val="single" w:sz="8" w:space="0" w:color="0070C0"/>
+              <w:bottom w:val="single" w:sz="8" w:space="0" w:color="0070C0"/>
+            </w:tcBorders>
           </w:tcPr>
           <w:p>
             <w:pPr>
@@ -684,6 +1872,9 @@
           <w:tcPr>
             <w:tcW w:w="10490" w:type="dxa"/>
             <w:gridSpan w:val="5"/>
+            <w:tcBorders>
+              <w:top w:val="single" w:sz="8" w:space="0" w:color="0070C0"/>
+            </w:tcBorders>
           </w:tcPr>
           <w:p>
             <w:pPr>
@@ -696,13 +1887,31 @@
                 <w:color w:val="auto"/>
               </w:rPr>
             </w:pPr>
+            <w:proofErr w:type="spellStart"/>
             <w:r>
               <w:rPr>
                 <w:b/>
                 <w:bCs/>
               </w:rPr>
-              <w:t>Volunteer Work</w:t>
-            </w:r>
+              <w:t>Volunteer</w:t>
+            </w:r>
+            <w:proofErr w:type="spellEnd"/>
+            <w:r>
+              <w:rPr>
+                <w:b/>
+                <w:bCs/>
+              </w:rPr>
+              <w:t xml:space="preserve"> </w:t>
+            </w:r>
+            <w:proofErr w:type="spellStart"/>
+            <w:r>
+              <w:rPr>
+                <w:b/>
+                <w:bCs/>
+              </w:rPr>
+              <w:t>Work</w:t>
+            </w:r>
+            <w:proofErr w:type="spellEnd"/>
             <w:r>
               <w:rPr>
                 <w:rStyle w:val="nfasis"/>
@@ -714,8 +1923,373 @@
             <w:r>
               <w:t> </w:t>
             </w:r>
-            <w:r>
-              <w:t>Participated in Trabajos de Invierno (TDI), a social initiative aimed at empowering economically vulnerable families in rural Chile by providing them with tools for self-sufficiency. Over three campaigns in the La Araucanía Region, I helped build greenhouses and water towers in collaboration with local communities ("comunas"). On one occasion, I led a team of 10 students—most with no prior experience—to successfully construct a greenhouse and water tower to support sustainable food production.</w:t>
+            <w:proofErr w:type="spellStart"/>
+            <w:r>
+              <w:t>Participated</w:t>
+            </w:r>
+            <w:proofErr w:type="spellEnd"/>
+            <w:r>
+              <w:t xml:space="preserve"> in Trabajos de Invierno (TDI), a social </w:t>
+            </w:r>
+            <w:proofErr w:type="spellStart"/>
+            <w:r>
+              <w:t>initiative</w:t>
+            </w:r>
+            <w:proofErr w:type="spellEnd"/>
+            <w:r>
+              <w:t xml:space="preserve"> </w:t>
+            </w:r>
+            <w:proofErr w:type="spellStart"/>
+            <w:r>
+              <w:t>aimed</w:t>
+            </w:r>
+            <w:proofErr w:type="spellEnd"/>
+            <w:r>
+              <w:t xml:space="preserve"> at </w:t>
+            </w:r>
+            <w:proofErr w:type="spellStart"/>
+            <w:r>
+              <w:t>empowering</w:t>
+            </w:r>
+            <w:proofErr w:type="spellEnd"/>
+            <w:r>
+              <w:t xml:space="preserve"> </w:t>
+            </w:r>
+            <w:proofErr w:type="spellStart"/>
+            <w:r>
+              <w:t>economically</w:t>
+            </w:r>
+            <w:proofErr w:type="spellEnd"/>
+            <w:r>
+              <w:t xml:space="preserve"> vulnerable </w:t>
+            </w:r>
+            <w:proofErr w:type="spellStart"/>
+            <w:r>
+              <w:t>families</w:t>
+            </w:r>
+            <w:proofErr w:type="spellEnd"/>
+            <w:r>
+              <w:t xml:space="preserve"> in rural Chile </w:t>
+            </w:r>
+            <w:proofErr w:type="spellStart"/>
+            <w:r>
+              <w:t>by</w:t>
+            </w:r>
+            <w:proofErr w:type="spellEnd"/>
+            <w:r>
+              <w:t xml:space="preserve"> </w:t>
+            </w:r>
+            <w:proofErr w:type="spellStart"/>
+            <w:r>
+              <w:t>providing</w:t>
+            </w:r>
+            <w:proofErr w:type="spellEnd"/>
+            <w:r>
+              <w:t xml:space="preserve"> </w:t>
+            </w:r>
+            <w:proofErr w:type="spellStart"/>
+            <w:r>
+              <w:t>them</w:t>
+            </w:r>
+            <w:proofErr w:type="spellEnd"/>
+            <w:r>
+              <w:t xml:space="preserve"> </w:t>
+            </w:r>
+            <w:proofErr w:type="spellStart"/>
+            <w:r>
+              <w:t>with</w:t>
+            </w:r>
+            <w:proofErr w:type="spellEnd"/>
+            <w:r>
+              <w:t xml:space="preserve"> </w:t>
+            </w:r>
+            <w:proofErr w:type="spellStart"/>
+            <w:r>
+              <w:t>tools</w:t>
+            </w:r>
+            <w:proofErr w:type="spellEnd"/>
+            <w:r>
+              <w:t xml:space="preserve"> </w:t>
+            </w:r>
+            <w:proofErr w:type="spellStart"/>
+            <w:r>
+              <w:t>for</w:t>
+            </w:r>
+            <w:proofErr w:type="spellEnd"/>
+            <w:r>
+              <w:t xml:space="preserve"> </w:t>
+            </w:r>
+            <w:proofErr w:type="spellStart"/>
+            <w:r>
+              <w:t>self-sufficiency</w:t>
+            </w:r>
+            <w:proofErr w:type="spellEnd"/>
+            <w:r>
+              <w:t xml:space="preserve">. </w:t>
+            </w:r>
+            <w:proofErr w:type="spellStart"/>
+            <w:r>
+              <w:t>Over</w:t>
+            </w:r>
+            <w:proofErr w:type="spellEnd"/>
+            <w:r>
+              <w:t xml:space="preserve"> </w:t>
+            </w:r>
+            <w:proofErr w:type="spellStart"/>
+            <w:r>
+              <w:t>three</w:t>
+            </w:r>
+            <w:proofErr w:type="spellEnd"/>
+            <w:r>
+              <w:t xml:space="preserve"> </w:t>
+            </w:r>
+            <w:proofErr w:type="spellStart"/>
+            <w:r>
+              <w:t>campaigns</w:t>
+            </w:r>
+            <w:proofErr w:type="spellEnd"/>
+            <w:r>
+              <w:t xml:space="preserve"> in </w:t>
+            </w:r>
+            <w:proofErr w:type="spellStart"/>
+            <w:r>
+              <w:t>the</w:t>
+            </w:r>
+            <w:proofErr w:type="spellEnd"/>
+            <w:r>
+              <w:t xml:space="preserve"> La Araucanía </w:t>
+            </w:r>
+            <w:proofErr w:type="spellStart"/>
+            <w:r>
+              <w:t>Region</w:t>
+            </w:r>
+            <w:proofErr w:type="spellEnd"/>
+            <w:r>
+              <w:t xml:space="preserve">, I </w:t>
+            </w:r>
+            <w:proofErr w:type="spellStart"/>
+            <w:r>
+              <w:t>helped</w:t>
+            </w:r>
+            <w:proofErr w:type="spellEnd"/>
+            <w:r>
+              <w:t xml:space="preserve"> </w:t>
+            </w:r>
+            <w:proofErr w:type="spellStart"/>
+            <w:r>
+              <w:t>build</w:t>
+            </w:r>
+            <w:proofErr w:type="spellEnd"/>
+            <w:r>
+              <w:t xml:space="preserve"> </w:t>
+            </w:r>
+            <w:proofErr w:type="spellStart"/>
+            <w:r>
+              <w:t>greenhouses</w:t>
+            </w:r>
+            <w:proofErr w:type="spellEnd"/>
+            <w:r>
+              <w:t xml:space="preserve"> and </w:t>
+            </w:r>
+            <w:proofErr w:type="spellStart"/>
+            <w:r>
+              <w:t>water</w:t>
+            </w:r>
+            <w:proofErr w:type="spellEnd"/>
+            <w:r>
+              <w:t xml:space="preserve"> </w:t>
+            </w:r>
+            <w:proofErr w:type="spellStart"/>
+            <w:r>
+              <w:t>towers</w:t>
+            </w:r>
+            <w:proofErr w:type="spellEnd"/>
+            <w:r>
+              <w:t xml:space="preserve"> in </w:t>
+            </w:r>
+            <w:proofErr w:type="spellStart"/>
+            <w:r>
+              <w:t>collaboration</w:t>
+            </w:r>
+            <w:proofErr w:type="spellEnd"/>
+            <w:r>
+              <w:t xml:space="preserve"> </w:t>
+            </w:r>
+            <w:proofErr w:type="spellStart"/>
+            <w:r>
+              <w:t>with</w:t>
+            </w:r>
+            <w:proofErr w:type="spellEnd"/>
+            <w:r>
+              <w:t xml:space="preserve"> local </w:t>
+            </w:r>
+            <w:proofErr w:type="spellStart"/>
+            <w:r>
+              <w:t>communities</w:t>
+            </w:r>
+            <w:proofErr w:type="spellEnd"/>
+            <w:r>
+              <w:t xml:space="preserve"> ("comunas"). </w:t>
+            </w:r>
+            <w:proofErr w:type="spellStart"/>
+            <w:r>
+              <w:t>On</w:t>
+            </w:r>
+            <w:proofErr w:type="spellEnd"/>
+            <w:r>
+              <w:t xml:space="preserve"> </w:t>
+            </w:r>
+            <w:proofErr w:type="spellStart"/>
+            <w:r>
+              <w:t>one</w:t>
+            </w:r>
+            <w:proofErr w:type="spellEnd"/>
+            <w:r>
+              <w:t xml:space="preserve"> </w:t>
+            </w:r>
+            <w:proofErr w:type="spellStart"/>
+            <w:r>
+              <w:t>occasion</w:t>
+            </w:r>
+            <w:proofErr w:type="spellEnd"/>
+            <w:r>
+              <w:t xml:space="preserve">, I led a </w:t>
+            </w:r>
+            <w:proofErr w:type="spellStart"/>
+            <w:r>
+              <w:t>team</w:t>
+            </w:r>
+            <w:proofErr w:type="spellEnd"/>
+            <w:r>
+              <w:t xml:space="preserve"> </w:t>
+            </w:r>
+            <w:proofErr w:type="spellStart"/>
+            <w:r>
+              <w:t>of</w:t>
+            </w:r>
+            <w:proofErr w:type="spellEnd"/>
+            <w:r>
+              <w:t xml:space="preserve"> 10 </w:t>
+            </w:r>
+            <w:proofErr w:type="spellStart"/>
+            <w:r>
+              <w:t>students</w:t>
+            </w:r>
+            <w:proofErr w:type="spellEnd"/>
+            <w:r>
+              <w:t>—</w:t>
+            </w:r>
+            <w:proofErr w:type="spellStart"/>
+            <w:r>
+              <w:t>most</w:t>
+            </w:r>
+            <w:proofErr w:type="spellEnd"/>
+            <w:r>
+              <w:t xml:space="preserve"> </w:t>
+            </w:r>
+            <w:proofErr w:type="spellStart"/>
+            <w:r>
+              <w:t>with</w:t>
+            </w:r>
+            <w:proofErr w:type="spellEnd"/>
+            <w:r>
+              <w:t xml:space="preserve"> no prior </w:t>
+            </w:r>
+            <w:proofErr w:type="spellStart"/>
+            <w:r>
+              <w:t>experience</w:t>
+            </w:r>
+            <w:proofErr w:type="spellEnd"/>
+            <w:r>
+              <w:t>—</w:t>
+            </w:r>
+            <w:proofErr w:type="spellStart"/>
+            <w:r>
+              <w:t>to</w:t>
+            </w:r>
+            <w:proofErr w:type="spellEnd"/>
+            <w:r>
+              <w:t xml:space="preserve"> </w:t>
+            </w:r>
+            <w:proofErr w:type="spellStart"/>
+            <w:r>
+              <w:t>successfully</w:t>
+            </w:r>
+            <w:proofErr w:type="spellEnd"/>
+            <w:r>
+              <w:t xml:space="preserve"> </w:t>
+            </w:r>
+            <w:proofErr w:type="spellStart"/>
+            <w:r>
+              <w:t>construct</w:t>
+            </w:r>
+            <w:proofErr w:type="spellEnd"/>
+            <w:r>
+              <w:t xml:space="preserve"> a </w:t>
+            </w:r>
+            <w:proofErr w:type="spellStart"/>
+            <w:r>
+              <w:t>greenhouse</w:t>
+            </w:r>
+            <w:proofErr w:type="spellEnd"/>
+            <w:r>
+              <w:t xml:space="preserve"> and </w:t>
+            </w:r>
+            <w:proofErr w:type="spellStart"/>
+            <w:r>
+              <w:t>water</w:t>
+            </w:r>
+            <w:proofErr w:type="spellEnd"/>
+            <w:r>
+              <w:t xml:space="preserve"> </w:t>
+            </w:r>
+            <w:proofErr w:type="spellStart"/>
+            <w:r>
+              <w:t>tower</w:t>
+            </w:r>
+            <w:proofErr w:type="spellEnd"/>
+            <w:r>
+              <w:t xml:space="preserve"> </w:t>
+            </w:r>
+            <w:proofErr w:type="spellStart"/>
+            <w:r>
+              <w:t>to</w:t>
+            </w:r>
+            <w:proofErr w:type="spellEnd"/>
+            <w:r>
+              <w:t xml:space="preserve"> </w:t>
+            </w:r>
+            <w:proofErr w:type="spellStart"/>
+            <w:r>
+              <w:t>support</w:t>
+            </w:r>
+            <w:proofErr w:type="spellEnd"/>
+            <w:r>
+              <w:t xml:space="preserve"> </w:t>
+            </w:r>
+            <w:proofErr w:type="spellStart"/>
+            <w:r>
+              <w:t>sustainable</w:t>
+            </w:r>
+            <w:proofErr w:type="spellEnd"/>
+            <w:r>
+              <w:t xml:space="preserve"> </w:t>
+            </w:r>
+            <w:proofErr w:type="spellStart"/>
+            <w:r>
+              <w:t>food</w:t>
+            </w:r>
+            <w:proofErr w:type="spellEnd"/>
+            <w:r>
+              <w:t xml:space="preserve"> </w:t>
+            </w:r>
+            <w:proofErr w:type="spellStart"/>
+            <w:r>
+              <w:t>production</w:t>
+            </w:r>
+            <w:proofErr w:type="spellEnd"/>
+            <w:r>
+              <w:t>.</w:t>
             </w:r>
           </w:p>
           <w:p>
@@ -729,18 +2303,100 @@
                 <w:color w:val="auto"/>
               </w:rPr>
             </w:pPr>
+            <w:proofErr w:type="spellStart"/>
             <w:r>
               <w:rPr>
                 <w:b/>
                 <w:bCs/>
               </w:rPr>
-              <w:t>University Rugby Team</w:t>
-            </w:r>
-            <w:r>
-              <w:t>: Represented the university as a varsity rugby playe</w:t>
-            </w:r>
-            <w:r>
-              <w:t>r for three (3) years.</w:t>
+              <w:t>University</w:t>
+            </w:r>
+            <w:proofErr w:type="spellEnd"/>
+            <w:r>
+              <w:rPr>
+                <w:b/>
+                <w:bCs/>
+              </w:rPr>
+              <w:t xml:space="preserve"> Rugby </w:t>
+            </w:r>
+            <w:proofErr w:type="spellStart"/>
+            <w:r>
+              <w:rPr>
+                <w:b/>
+                <w:bCs/>
+              </w:rPr>
+              <w:t>Team</w:t>
+            </w:r>
+            <w:proofErr w:type="spellEnd"/>
+            <w:r>
+              <w:t xml:space="preserve">: </w:t>
+            </w:r>
+            <w:proofErr w:type="spellStart"/>
+            <w:r>
+              <w:t>Represented</w:t>
+            </w:r>
+            <w:proofErr w:type="spellEnd"/>
+            <w:r>
+              <w:t xml:space="preserve"> </w:t>
+            </w:r>
+            <w:proofErr w:type="spellStart"/>
+            <w:r>
+              <w:t>the</w:t>
+            </w:r>
+            <w:proofErr w:type="spellEnd"/>
+            <w:r>
+              <w:t xml:space="preserve"> </w:t>
+            </w:r>
+            <w:proofErr w:type="spellStart"/>
+            <w:r>
+              <w:t>university</w:t>
+            </w:r>
+            <w:proofErr w:type="spellEnd"/>
+            <w:r>
+              <w:t xml:space="preserve"> as a </w:t>
+            </w:r>
+            <w:proofErr w:type="spellStart"/>
+            <w:r>
+              <w:t>varsity</w:t>
+            </w:r>
+            <w:proofErr w:type="spellEnd"/>
+            <w:r>
+              <w:t xml:space="preserve"> rugby </w:t>
+            </w:r>
+            <w:proofErr w:type="spellStart"/>
+            <w:r>
+              <w:t>playe</w:t>
+            </w:r>
+            <w:r>
+              <w:t>r</w:t>
+            </w:r>
+            <w:proofErr w:type="spellEnd"/>
+            <w:r>
+              <w:t xml:space="preserve"> </w:t>
+            </w:r>
+            <w:proofErr w:type="spellStart"/>
+            <w:r>
+              <w:t>for</w:t>
+            </w:r>
+            <w:proofErr w:type="spellEnd"/>
+            <w:r>
+              <w:t xml:space="preserve"> </w:t>
+            </w:r>
+            <w:proofErr w:type="spellStart"/>
+            <w:r>
+              <w:t>three</w:t>
+            </w:r>
+            <w:proofErr w:type="spellEnd"/>
+            <w:r>
+              <w:t xml:space="preserve"> (3) </w:t>
+            </w:r>
+            <w:proofErr w:type="spellStart"/>
+            <w:r>
+              <w:t>years</w:t>
+            </w:r>
+            <w:proofErr w:type="spellEnd"/>
+            <w:r>
+              <w:t>.</w:t>
             </w:r>
           </w:p>
           <w:p>
@@ -754,6 +2410,7 @@
                 <w:color w:val="auto"/>
               </w:rPr>
             </w:pPr>
+            <w:proofErr w:type="spellStart"/>
             <w:r>
               <w:rPr>
                 <w:b/>
@@ -761,8 +2418,33 @@
               </w:rPr>
               <w:t>Activities</w:t>
             </w:r>
-            <w:r>
-              <w:t>: Reading, cultural exchange, active learning, and personal development.</w:t>
+            <w:proofErr w:type="spellEnd"/>
+            <w:r>
+              <w:t xml:space="preserve">: Reading, cultural </w:t>
+            </w:r>
+            <w:proofErr w:type="spellStart"/>
+            <w:r>
+              <w:t>exchange</w:t>
+            </w:r>
+            <w:proofErr w:type="spellEnd"/>
+            <w:r>
+              <w:t xml:space="preserve">, active </w:t>
+            </w:r>
+            <w:proofErr w:type="spellStart"/>
+            <w:r>
+              <w:t>learning</w:t>
+            </w:r>
+            <w:proofErr w:type="spellEnd"/>
+            <w:r>
+              <w:t xml:space="preserve">, and personal </w:t>
+            </w:r>
+            <w:proofErr w:type="spellStart"/>
+            <w:r>
+              <w:t>development</w:t>
+            </w:r>
+            <w:proofErr w:type="spellEnd"/>
+            <w:r>
+              <w:t>.</w:t>
             </w:r>
           </w:p>
           <w:p>
@@ -773,12 +2455,21 @@
                 <w:numId w:val="13"/>
               </w:numPr>
             </w:pPr>
+            <w:proofErr w:type="spellStart"/>
             <w:r>
               <w:rPr>
                 <w:b/>
                 <w:bCs/>
               </w:rPr>
-              <w:t>Languages:</w:t>
+              <w:t>Languages</w:t>
+            </w:r>
+            <w:proofErr w:type="spellEnd"/>
+            <w:r>
+              <w:rPr>
+                <w:b/>
+                <w:bCs/>
+              </w:rPr>
+              <w:t>:</w:t>
             </w:r>
             <w:r>
               <w:t xml:space="preserve"> </w:t>
@@ -789,12 +2480,22 @@
             <w:r>
               <w:t xml:space="preserve"> - </w:t>
             </w:r>
-            <w:r>
-              <w:t>TOEFLiBT (96)</w:t>
-            </w:r>
-            <w:r>
-              <w:t>, Spanish</w:t>
-            </w:r>
+            <w:proofErr w:type="spellStart"/>
+            <w:r>
+              <w:t>TOEFLiBT</w:t>
+            </w:r>
+            <w:proofErr w:type="spellEnd"/>
+            <w:r>
+              <w:t xml:space="preserve"> (96)</w:t>
+            </w:r>
+            <w:r>
+              <w:t xml:space="preserve">, </w:t>
+            </w:r>
+            <w:proofErr w:type="spellStart"/>
+            <w:r>
+              <w:t>Spanish</w:t>
+            </w:r>
+            <w:proofErr w:type="spellEnd"/>
             <w:r>
               <w:t xml:space="preserve"> - </w:t>
             </w:r>
@@ -811,8 +2512,13 @@
               <w:t>1</w:t>
             </w:r>
             <w:r>
-              <w:t xml:space="preserve"> certificate</w:t>
-            </w:r>
+              <w:t xml:space="preserve"> </w:t>
+            </w:r>
+            <w:proofErr w:type="spellStart"/>
+            <w:r>
+              <w:t>certificate</w:t>
+            </w:r>
+            <w:proofErr w:type="spellEnd"/>
             <w:r>
               <w:t>.</w:t>
             </w:r>
@@ -910,9 +2616,19 @@
           <w:pPr>
             <w:pStyle w:val="Ttulo4"/>
           </w:pPr>
+          <w:proofErr w:type="spellStart"/>
           <w:r>
-            <w:t>Electrical engineer</w:t>
+            <w:t>Electrical</w:t>
           </w:r>
+          <w:proofErr w:type="spellEnd"/>
+          <w:r>
+            <w:t xml:space="preserve"> </w:t>
+          </w:r>
+          <w:proofErr w:type="spellStart"/>
+          <w:r>
+            <w:t>engineer</w:t>
+          </w:r>
+          <w:proofErr w:type="spellEnd"/>
           <w:r>
             <w:tab/>
           </w:r>
@@ -925,8 +2641,21 @@
           <w:r>
             <w:t xml:space="preserve">| </w:t>
           </w:r>
+          <w:proofErr w:type="spellStart"/>
           <w:r>
-            <w:t>Pfeilgasse 3a, Vienna | +43 664 99470941 |</w:t>
+            <w:t>Pfeilgasse</w:t>
+          </w:r>
+          <w:proofErr w:type="spellEnd"/>
+          <w:r>
+            <w:t xml:space="preserve"> 3a, </w:t>
+          </w:r>
+          <w:proofErr w:type="spellStart"/>
+          <w:r>
+            <w:t>Vienna</w:t>
+          </w:r>
+          <w:proofErr w:type="spellEnd"/>
+          <w:r>
+            <w:t xml:space="preserve"> | +43 664 99470941 |</w:t>
           </w:r>
           <w:r>
             <w:t xml:space="preserve"> </w:t>
@@ -3458,9 +5187,9 @@
     <w:link w:val="Ttulo1Car"/>
     <w:uiPriority w:val="9"/>
     <w:qFormat/>
-    <w:rsid w:val="00073611"/>
+    <w:rsid w:val="001274AB"/>
     <w:pPr>
-      <w:spacing w:before="100" w:beforeAutospacing="1" w:after="100" w:afterAutospacing="1" w:line="360" w:lineRule="auto"/>
+      <w:spacing w:before="100" w:beforeAutospacing="1" w:after="100" w:afterAutospacing="1"/>
       <w:outlineLvl w:val="0"/>
     </w:pPr>
     <w:rPr>
@@ -3670,7 +5399,7 @@
     <w:basedOn w:val="Fuentedeprrafopredeter"/>
     <w:link w:val="Ttulo1"/>
     <w:uiPriority w:val="9"/>
-    <w:rsid w:val="00073611"/>
+    <w:rsid w:val="001274AB"/>
     <w:rPr>
       <w:rFonts w:ascii="Times New Roman" w:eastAsia="Times New Roman" w:hAnsi="Times New Roman" w:cs="Times New Roman"/>
       <w:b/>
@@ -3678,7 +5407,7 @@
       <w:caps/>
       <w:color w:val="1E62CB"/>
       <w:kern w:val="0"/>
-      <w:szCs w:val="21"/>
+      <w:szCs w:val="22"/>
       <w14:ligatures w14:val="none"/>
     </w:rPr>
   </w:style>

</xml_diff>

<commit_message>
Last commit of the day
</commit_message>
<xml_diff>
--- a/assets/pdf/Ignacio_Perez_cv.docx
+++ b/assets/pdf/Ignacio_Perez_cv.docx
@@ -60,153 +60,38 @@
             </w:tcBorders>
           </w:tcPr>
           <w:p>
-            <w:proofErr w:type="spellStart"/>
             <w:r>
               <w:t>Rigorous</w:t>
             </w:r>
-            <w:proofErr w:type="spellEnd"/>
-            <w:r>
-              <w:t xml:space="preserve"> and </w:t>
-            </w:r>
-            <w:proofErr w:type="spellStart"/>
-            <w:r>
-              <w:t>versatile</w:t>
-            </w:r>
-            <w:proofErr w:type="spellEnd"/>
+            <w:r>
+              <w:t xml:space="preserve"> and versatile</w:t>
+            </w:r>
             <w:r>
               <w:t xml:space="preserve"> </w:t>
             </w:r>
-            <w:proofErr w:type="spellStart"/>
-            <w:r>
-              <w:t>Electrical</w:t>
-            </w:r>
-            <w:proofErr w:type="spellEnd"/>
+            <w:r>
+              <w:t>Electrical Engineer. Skilled in technical documentation, CAD</w:t>
+            </w:r>
             <w:r>
               <w:t xml:space="preserve"> </w:t>
             </w:r>
-            <w:proofErr w:type="spellStart"/>
-            <w:r>
-              <w:t>Engineer</w:t>
-            </w:r>
-            <w:proofErr w:type="spellEnd"/>
-            <w:r>
-              <w:t xml:space="preserve">. </w:t>
-            </w:r>
-            <w:proofErr w:type="spellStart"/>
-            <w:r>
-              <w:t>Skilled</w:t>
-            </w:r>
-            <w:proofErr w:type="spellEnd"/>
-            <w:r>
-              <w:t xml:space="preserve"> in </w:t>
-            </w:r>
-            <w:proofErr w:type="spellStart"/>
-            <w:r>
-              <w:t>technical</w:t>
-            </w:r>
-            <w:proofErr w:type="spellEnd"/>
-            <w:r>
-              <w:t xml:space="preserve"> </w:t>
-            </w:r>
-            <w:proofErr w:type="spellStart"/>
-            <w:r>
-              <w:t>documentation</w:t>
-            </w:r>
-            <w:proofErr w:type="spellEnd"/>
-            <w:r>
-              <w:t>, CAD</w:t>
-            </w:r>
-            <w:r>
-              <w:t xml:space="preserve"> </w:t>
-            </w:r>
-            <w:proofErr w:type="spellStart"/>
-            <w:r>
-              <w:t>based</w:t>
-            </w:r>
-            <w:proofErr w:type="spellEnd"/>
-            <w:r>
-              <w:t xml:space="preserve"> </w:t>
-            </w:r>
-            <w:proofErr w:type="spellStart"/>
-            <w:r>
-              <w:t>design</w:t>
-            </w:r>
-            <w:proofErr w:type="spellEnd"/>
-            <w:r>
-              <w:t xml:space="preserve">, </w:t>
-            </w:r>
-            <w:proofErr w:type="spellStart"/>
-            <w:r>
-              <w:t>network</w:t>
-            </w:r>
-            <w:proofErr w:type="spellEnd"/>
-            <w:r>
-              <w:t xml:space="preserve"> </w:t>
-            </w:r>
-            <w:proofErr w:type="spellStart"/>
-            <w:r>
-              <w:t>infrastructure</w:t>
-            </w:r>
-            <w:proofErr w:type="spellEnd"/>
-            <w:r>
-              <w:t xml:space="preserve">, and </w:t>
-            </w:r>
-            <w:proofErr w:type="spellStart"/>
-            <w:r>
-              <w:t>project</w:t>
-            </w:r>
-            <w:proofErr w:type="spellEnd"/>
-            <w:r>
-              <w:t xml:space="preserve"> </w:t>
-            </w:r>
-            <w:proofErr w:type="spellStart"/>
-            <w:r>
-              <w:t>coordination</w:t>
-            </w:r>
-            <w:proofErr w:type="spellEnd"/>
-            <w:r>
-              <w:t xml:space="preserve">. </w:t>
-            </w:r>
-            <w:r>
-              <w:t xml:space="preserve">Proactive and </w:t>
-            </w:r>
-            <w:proofErr w:type="spellStart"/>
-            <w:r>
-              <w:t>s</w:t>
-            </w:r>
-            <w:r>
-              <w:t>trong</w:t>
-            </w:r>
-            <w:proofErr w:type="spellEnd"/>
-            <w:r>
-              <w:t xml:space="preserve"> </w:t>
+            <w:r>
+              <w:t xml:space="preserve">based design, network infrastructure, and project coordination. </w:t>
+            </w:r>
+            <w:r>
+              <w:t>Proactive and s</w:t>
+            </w:r>
+            <w:r>
+              <w:t xml:space="preserve">trong </w:t>
             </w:r>
             <w:r>
               <w:t xml:space="preserve">interpersonal </w:t>
             </w:r>
-            <w:proofErr w:type="spellStart"/>
             <w:r>
               <w:t>abilities</w:t>
             </w:r>
-            <w:proofErr w:type="spellEnd"/>
-            <w:r>
-              <w:t xml:space="preserve"> </w:t>
-            </w:r>
-            <w:proofErr w:type="spellStart"/>
-            <w:r>
-              <w:t>with</w:t>
-            </w:r>
-            <w:proofErr w:type="spellEnd"/>
-            <w:r>
-              <w:t xml:space="preserve"> </w:t>
-            </w:r>
-            <w:proofErr w:type="spellStart"/>
-            <w:r>
-              <w:t>experience</w:t>
-            </w:r>
-            <w:proofErr w:type="spellEnd"/>
-            <w:r>
-              <w:t xml:space="preserve"> </w:t>
+            <w:r>
+              <w:t xml:space="preserve"> with experience </w:t>
             </w:r>
             <w:r>
               <w:t xml:space="preserve">in </w:t>
@@ -214,93 +99,14 @@
             <w:r>
               <w:t xml:space="preserve">multicultural </w:t>
             </w:r>
-            <w:proofErr w:type="spellStart"/>
-            <w:r>
-              <w:t>teams</w:t>
-            </w:r>
-            <w:proofErr w:type="spellEnd"/>
-            <w:r>
-              <w:t xml:space="preserve">, </w:t>
-            </w:r>
-            <w:proofErr w:type="spellStart"/>
-            <w:r>
-              <w:t>ensuring</w:t>
-            </w:r>
-            <w:proofErr w:type="spellEnd"/>
-            <w:r>
-              <w:t xml:space="preserve"> </w:t>
-            </w:r>
-            <w:proofErr w:type="spellStart"/>
-            <w:r>
-              <w:t>smooth</w:t>
-            </w:r>
-            <w:proofErr w:type="spellEnd"/>
-            <w:r>
-              <w:t xml:space="preserve"> </w:t>
-            </w:r>
-            <w:proofErr w:type="spellStart"/>
-            <w:r>
-              <w:t>system</w:t>
-            </w:r>
-            <w:proofErr w:type="spellEnd"/>
-            <w:r>
-              <w:t xml:space="preserve"> </w:t>
-            </w:r>
-            <w:proofErr w:type="spellStart"/>
-            <w:r>
-              <w:t>deployment</w:t>
-            </w:r>
-            <w:proofErr w:type="spellEnd"/>
-            <w:r>
-              <w:t xml:space="preserve"> and </w:t>
-            </w:r>
-            <w:proofErr w:type="spellStart"/>
-            <w:r>
-              <w:t>delivery</w:t>
-            </w:r>
-            <w:proofErr w:type="spellEnd"/>
-            <w:r>
-              <w:t xml:space="preserve">. </w:t>
-            </w:r>
-            <w:proofErr w:type="spellStart"/>
-            <w:r>
-              <w:t>Fluent</w:t>
-            </w:r>
-            <w:proofErr w:type="spellEnd"/>
-            <w:r>
-              <w:t xml:space="preserve"> in English (C1) and </w:t>
-            </w:r>
-            <w:proofErr w:type="spellStart"/>
-            <w:r>
-              <w:t>actively</w:t>
-            </w:r>
-            <w:proofErr w:type="spellEnd"/>
-            <w:r>
-              <w:t xml:space="preserve"> </w:t>
-            </w:r>
-            <w:proofErr w:type="spellStart"/>
-            <w:r>
-              <w:t>improving</w:t>
-            </w:r>
-            <w:proofErr w:type="spellEnd"/>
-            <w:r>
-              <w:t xml:space="preserve"> German. More </w:t>
-            </w:r>
-            <w:proofErr w:type="spellStart"/>
-            <w:r>
-              <w:t>information</w:t>
-            </w:r>
-            <w:proofErr w:type="spellEnd"/>
-            <w:r>
-              <w:t xml:space="preserve"> in </w:t>
-            </w:r>
-            <w:proofErr w:type="spellStart"/>
-            <w:r>
-              <w:t>my</w:t>
-            </w:r>
-            <w:proofErr w:type="spellEnd"/>
-            <w:r>
-              <w:t xml:space="preserve"> </w:t>
+            <w:r>
+              <w:t xml:space="preserve">teams, ensuring smooth system deployment and delivery. Fluent in English (C1) and actively improving German. More information </w:t>
+            </w:r>
+            <w:r>
+              <w:t>o</w:t>
+            </w:r>
+            <w:r>
+              <w:t xml:space="preserve">n my </w:t>
             </w:r>
             <w:hyperlink r:id="rId7" w:history="1">
               <w:r>
@@ -308,35 +114,11 @@
               </w:r>
             </w:hyperlink>
             <w:r>
-              <w:t xml:space="preserve"> </w:t>
-            </w:r>
-            <w:proofErr w:type="spellStart"/>
-            <w:r>
-              <w:t>or</w:t>
-            </w:r>
-            <w:proofErr w:type="spellEnd"/>
-            <w:r>
-              <w:t xml:space="preserve"> </w:t>
-            </w:r>
-            <w:proofErr w:type="spellStart"/>
-            <w:r>
-              <w:t>my</w:t>
-            </w:r>
-            <w:proofErr w:type="spellEnd"/>
-            <w:r>
-              <w:t xml:space="preserve"> </w:t>
+              <w:t xml:space="preserve"> or my </w:t>
             </w:r>
             <w:hyperlink r:id="rId8" w:history="1">
               <w:r>
-                <w:t xml:space="preserve">personal </w:t>
-              </w:r>
-              <w:proofErr w:type="spellStart"/>
-              <w:r>
-                <w:t>website</w:t>
-              </w:r>
-              <w:proofErr w:type="spellEnd"/>
-              <w:r>
-                <w:t>!</w:t>
+                <w:t>personal website!</w:t>
               </w:r>
             </w:hyperlink>
           </w:p>
@@ -376,47 +158,13 @@
               <w:pStyle w:val="Ttulo4"/>
             </w:pPr>
             <w:hyperlink r:id="rId9" w:history="1">
-              <w:proofErr w:type="spellStart"/>
               <w:r>
                 <w:rPr>
                   <w:color w:val="1E1E1E"/>
                   <w:u w:val="single"/>
                 </w:rPr>
-                <w:t>Automation</w:t>
+                <w:t>Automation &amp; Control Systems Intern</w:t>
               </w:r>
-              <w:proofErr w:type="spellEnd"/>
-              <w:r>
-                <w:rPr>
-                  <w:color w:val="1E1E1E"/>
-                  <w:u w:val="single"/>
-                </w:rPr>
-                <w:t xml:space="preserve"> &amp; Control </w:t>
-              </w:r>
-              <w:proofErr w:type="spellStart"/>
-              <w:r>
-                <w:rPr>
-                  <w:color w:val="1E1E1E"/>
-                  <w:u w:val="single"/>
-                </w:rPr>
-                <w:t>Systems</w:t>
-              </w:r>
-              <w:proofErr w:type="spellEnd"/>
-              <w:r>
-                <w:rPr>
-                  <w:color w:val="1E1E1E"/>
-                  <w:u w:val="single"/>
-                </w:rPr>
-                <w:t xml:space="preserve"> </w:t>
-              </w:r>
-              <w:proofErr w:type="spellStart"/>
-              <w:r>
-                <w:rPr>
-                  <w:color w:val="1E1E1E"/>
-                  <w:u w:val="single"/>
-                </w:rPr>
-                <w:t>Intern</w:t>
-              </w:r>
-              <w:proofErr w:type="spellEnd"/>
             </w:hyperlink>
             <w:r>
               <w:rPr>
@@ -444,17 +192,8 @@
                   <w:color w:val="1E1E1E"/>
                   <w:u w:val="single"/>
                 </w:rPr>
-                <w:t xml:space="preserve">LKE </w:t>
+                <w:t>LKE SpA</w:t>
               </w:r>
-              <w:proofErr w:type="spellStart"/>
-              <w:r>
-                <w:rPr>
-                  <w:color w:val="1E1E1E"/>
-                  <w:u w:val="single"/>
-                </w:rPr>
-                <w:t>SpA</w:t>
-              </w:r>
-              <w:proofErr w:type="spellEnd"/>
             </w:hyperlink>
             <w:r>
               <w:tab/>
@@ -474,13 +213,8 @@
               <w:pStyle w:val="Ttulo4"/>
             </w:pPr>
             <w:r>
-              <w:t xml:space="preserve">Nov 2024 - </w:t>
-            </w:r>
-            <w:proofErr w:type="spellStart"/>
-            <w:r>
-              <w:t>Present</w:t>
-            </w:r>
-            <w:proofErr w:type="spellEnd"/>
+              <w:t>Nov 2024 - Present</w:t>
+            </w:r>
           </w:p>
         </w:tc>
       </w:tr>
@@ -501,133 +235,11 @@
                 <w:color w:val="auto"/>
               </w:rPr>
             </w:pPr>
-            <w:proofErr w:type="spellStart"/>
-            <w:r>
-              <w:t>Implemented</w:t>
-            </w:r>
-            <w:proofErr w:type="spellEnd"/>
-            <w:r>
-              <w:t xml:space="preserve"> </w:t>
-            </w:r>
-            <w:proofErr w:type="spellStart"/>
-            <w:r>
-              <w:t>telemetry</w:t>
-            </w:r>
-            <w:proofErr w:type="spellEnd"/>
-            <w:r>
-              <w:t xml:space="preserve"> </w:t>
-            </w:r>
-            <w:proofErr w:type="spellStart"/>
-            <w:r>
-              <w:t>for</w:t>
-            </w:r>
-            <w:proofErr w:type="spellEnd"/>
-            <w:r>
-              <w:t xml:space="preserve"> a remote </w:t>
-            </w:r>
-            <w:proofErr w:type="spellStart"/>
-            <w:r>
-              <w:t>power</w:t>
-            </w:r>
-            <w:proofErr w:type="spellEnd"/>
-            <w:r>
-              <w:t xml:space="preserve"> </w:t>
-            </w:r>
-            <w:proofErr w:type="spellStart"/>
-            <w:r>
-              <w:t>transmission</w:t>
-            </w:r>
-            <w:proofErr w:type="spellEnd"/>
-            <w:r>
-              <w:t xml:space="preserve"> </w:t>
-            </w:r>
-            <w:proofErr w:type="spellStart"/>
-            <w:r>
-              <w:t>system</w:t>
-            </w:r>
-            <w:proofErr w:type="spellEnd"/>
-            <w:r>
-              <w:t xml:space="preserve">, </w:t>
-            </w:r>
-            <w:proofErr w:type="spellStart"/>
-            <w:r>
-              <w:t>enabling</w:t>
-            </w:r>
-            <w:proofErr w:type="spellEnd"/>
-            <w:r>
-              <w:t xml:space="preserve"> real-time </w:t>
-            </w:r>
-            <w:proofErr w:type="spellStart"/>
-            <w:r>
-              <w:t>monitoring</w:t>
-            </w:r>
-            <w:proofErr w:type="spellEnd"/>
-            <w:r>
-              <w:t xml:space="preserve"> </w:t>
-            </w:r>
-            <w:proofErr w:type="spellStart"/>
-            <w:r>
-              <w:t>of</w:t>
-            </w:r>
-            <w:proofErr w:type="spellEnd"/>
-            <w:r>
-              <w:t xml:space="preserve"> </w:t>
-            </w:r>
-            <w:proofErr w:type="spellStart"/>
-            <w:r>
-              <w:t>an</w:t>
-            </w:r>
-            <w:proofErr w:type="spellEnd"/>
-            <w:r>
-              <w:t xml:space="preserve"> </w:t>
-            </w:r>
-            <w:proofErr w:type="spellStart"/>
-            <w:r>
-              <w:t>induction</w:t>
-            </w:r>
-            <w:proofErr w:type="spellEnd"/>
-            <w:r>
-              <w:t xml:space="preserve"> </w:t>
-            </w:r>
-            <w:proofErr w:type="spellStart"/>
-            <w:r>
-              <w:t>heating</w:t>
-            </w:r>
-            <w:proofErr w:type="spellEnd"/>
-            <w:r>
-              <w:t xml:space="preserve"> machine </w:t>
-            </w:r>
-            <w:proofErr w:type="spellStart"/>
-            <w:r>
-              <w:t>for</w:t>
-            </w:r>
-            <w:proofErr w:type="spellEnd"/>
-            <w:r>
-              <w:t xml:space="preserve"> metal </w:t>
-            </w:r>
-            <w:proofErr w:type="spellStart"/>
-            <w:r>
-              <w:t>spears</w:t>
-            </w:r>
-            <w:proofErr w:type="spellEnd"/>
-            <w:r>
-              <w:t xml:space="preserve"> in </w:t>
-            </w:r>
-            <w:proofErr w:type="spellStart"/>
-            <w:r>
-              <w:t>flame</w:t>
-            </w:r>
-            <w:proofErr w:type="spellEnd"/>
-            <w:r>
-              <w:t xml:space="preserve"> </w:t>
-            </w:r>
-            <w:proofErr w:type="spellStart"/>
-            <w:r>
-              <w:t>cutting</w:t>
-            </w:r>
-            <w:proofErr w:type="spellEnd"/>
-            <w:r>
-              <w:t>.</w:t>
+            <w:r>
+              <w:t xml:space="preserve">Implemented telemetry for a remote power transmission system, enabling real-time monitoring of an induction heating machine for metal spears in </w:t>
+            </w:r>
+            <w:r>
+              <w:t>flame cutting.</w:t>
             </w:r>
           </w:p>
           <w:p>
@@ -641,93 +253,8 @@
                 <w:color w:val="auto"/>
               </w:rPr>
             </w:pPr>
-            <w:proofErr w:type="spellStart"/>
-            <w:r>
-              <w:t>Assisted</w:t>
-            </w:r>
-            <w:proofErr w:type="spellEnd"/>
-            <w:r>
-              <w:t xml:space="preserve"> in hardware </w:t>
-            </w:r>
-            <w:proofErr w:type="spellStart"/>
-            <w:r>
-              <w:t>selection</w:t>
-            </w:r>
-            <w:proofErr w:type="spellEnd"/>
-            <w:r>
-              <w:t xml:space="preserve"> (</w:t>
-            </w:r>
-            <w:proofErr w:type="spellStart"/>
-            <w:r>
-              <w:t>PLCs</w:t>
-            </w:r>
-            <w:proofErr w:type="spellEnd"/>
-            <w:r>
-              <w:t xml:space="preserve">, </w:t>
-            </w:r>
-            <w:proofErr w:type="spellStart"/>
-            <w:r>
-              <w:t>sensors</w:t>
-            </w:r>
-            <w:proofErr w:type="spellEnd"/>
-            <w:r>
-              <w:t xml:space="preserve">, </w:t>
-            </w:r>
-            <w:proofErr w:type="spellStart"/>
-            <w:r>
-              <w:t>network</w:t>
-            </w:r>
-            <w:proofErr w:type="spellEnd"/>
-            <w:r>
-              <w:t xml:space="preserve"> </w:t>
-            </w:r>
-            <w:proofErr w:type="spellStart"/>
-            <w:r>
-              <w:t>devices</w:t>
-            </w:r>
-            <w:proofErr w:type="spellEnd"/>
-            <w:r>
-              <w:t xml:space="preserve">), </w:t>
-            </w:r>
-            <w:proofErr w:type="spellStart"/>
-            <w:r>
-              <w:t>ensuring</w:t>
-            </w:r>
-            <w:proofErr w:type="spellEnd"/>
-            <w:r>
-              <w:t xml:space="preserve"> </w:t>
-            </w:r>
-            <w:proofErr w:type="spellStart"/>
-            <w:r>
-              <w:t>compliance</w:t>
-            </w:r>
-            <w:proofErr w:type="spellEnd"/>
-            <w:r>
-              <w:t xml:space="preserve"> </w:t>
-            </w:r>
-            <w:proofErr w:type="spellStart"/>
-            <w:r>
-              <w:t>with</w:t>
-            </w:r>
-            <w:proofErr w:type="spellEnd"/>
-            <w:r>
-              <w:t xml:space="preserve"> </w:t>
-            </w:r>
-            <w:proofErr w:type="spellStart"/>
-            <w:r>
-              <w:t>electrical</w:t>
-            </w:r>
-            <w:proofErr w:type="spellEnd"/>
-            <w:r>
-              <w:t xml:space="preserve"> safety </w:t>
-            </w:r>
-            <w:proofErr w:type="spellStart"/>
-            <w:r>
-              <w:t>standards</w:t>
-            </w:r>
-            <w:proofErr w:type="spellEnd"/>
-            <w:r>
-              <w:t>.</w:t>
+            <w:r>
+              <w:t>Assisted in hardware selection (PLCs, sensors, network devices), ensuring compliance with electrical safety standards.</w:t>
             </w:r>
           </w:p>
           <w:p>
@@ -738,126 +265,32 @@
                 <w:numId w:val="8"/>
               </w:numPr>
             </w:pPr>
-            <w:proofErr w:type="spellStart"/>
-            <w:r>
-              <w:t>Managed</w:t>
-            </w:r>
-            <w:proofErr w:type="spellEnd"/>
-            <w:r>
-              <w:t xml:space="preserve"> and </w:t>
-            </w:r>
-            <w:proofErr w:type="spellStart"/>
-            <w:r>
-              <w:t>optimi</w:t>
+            <w:r>
+              <w:t>Managed and optimi</w:t>
             </w:r>
             <w:r>
               <w:t>s</w:t>
             </w:r>
             <w:r>
-              <w:t>ed</w:t>
-            </w:r>
-            <w:proofErr w:type="spellEnd"/>
+              <w:t>ed the</w:t>
+            </w:r>
             <w:r>
               <w:t xml:space="preserve"> </w:t>
             </w:r>
-            <w:proofErr w:type="spellStart"/>
-            <w:r>
-              <w:t>the</w:t>
-            </w:r>
-            <w:proofErr w:type="spellEnd"/>
-            <w:r>
-              <w:t xml:space="preserve"> </w:t>
-            </w:r>
-            <w:proofErr w:type="spellStart"/>
             <w:r>
               <w:t>company</w:t>
             </w:r>
-            <w:proofErr w:type="spellEnd"/>
-            <w:r>
-              <w:t xml:space="preserve"> </w:t>
-            </w:r>
-            <w:proofErr w:type="spellStart"/>
-            <w:r>
-              <w:t>database</w:t>
-            </w:r>
-            <w:proofErr w:type="spellEnd"/>
-            <w:r>
-              <w:t xml:space="preserve"> </w:t>
-            </w:r>
-            <w:proofErr w:type="spellStart"/>
-            <w:r>
-              <w:t>structure</w:t>
-            </w:r>
-            <w:proofErr w:type="spellEnd"/>
-            <w:r>
-              <w:t xml:space="preserve">, </w:t>
-            </w:r>
-            <w:proofErr w:type="spellStart"/>
-            <w:r>
-              <w:t>utilizing</w:t>
-            </w:r>
-            <w:proofErr w:type="spellEnd"/>
-            <w:r>
-              <w:t xml:space="preserve"> </w:t>
+            <w:r>
+              <w:t xml:space="preserve"> database structure, </w:t>
+            </w:r>
+            <w:r>
+              <w:t xml:space="preserve">using </w:t>
             </w:r>
             <w:r>
               <w:t xml:space="preserve">Microsoft </w:t>
             </w:r>
-            <w:proofErr w:type="spellStart"/>
-            <w:r>
-              <w:t>Teams</w:t>
-            </w:r>
-            <w:proofErr w:type="spellEnd"/>
-            <w:r>
-              <w:t xml:space="preserve">, SharePoint, Excel, Word, and </w:t>
-            </w:r>
-            <w:proofErr w:type="spellStart"/>
-            <w:r>
-              <w:t>permissions</w:t>
-            </w:r>
-            <w:proofErr w:type="spellEnd"/>
-            <w:r>
-              <w:t xml:space="preserve"> </w:t>
-            </w:r>
-            <w:proofErr w:type="spellStart"/>
-            <w:r>
-              <w:t>management</w:t>
-            </w:r>
-            <w:proofErr w:type="spellEnd"/>
-            <w:r>
-              <w:t xml:space="preserve"> </w:t>
-            </w:r>
-            <w:proofErr w:type="spellStart"/>
-            <w:r>
-              <w:t>to</w:t>
-            </w:r>
-            <w:proofErr w:type="spellEnd"/>
-            <w:r>
-              <w:t xml:space="preserve"> </w:t>
-            </w:r>
-            <w:proofErr w:type="spellStart"/>
-            <w:r>
-              <w:t>enhance</w:t>
-            </w:r>
-            <w:proofErr w:type="spellEnd"/>
-            <w:r>
-              <w:t xml:space="preserve"> </w:t>
-            </w:r>
-            <w:proofErr w:type="spellStart"/>
-            <w:r>
-              <w:t>collaboration</w:t>
-            </w:r>
-            <w:proofErr w:type="spellEnd"/>
-            <w:r>
-              <w:t xml:space="preserve"> and data </w:t>
-            </w:r>
-            <w:proofErr w:type="spellStart"/>
-            <w:r>
-              <w:t>security</w:t>
-            </w:r>
-            <w:proofErr w:type="spellEnd"/>
-            <w:r>
-              <w:t>.</w:t>
+            <w:r>
+              <w:t>Teams, SharePoint, Excel, Word, and permissions management to enhance collaboration and data security.</w:t>
             </w:r>
           </w:p>
           <w:p/>
@@ -874,19 +307,9 @@
               <w:pStyle w:val="Ttulo4"/>
             </w:pPr>
             <w:hyperlink r:id="rId11" w:history="1">
-              <w:proofErr w:type="spellStart"/>
               <w:r>
-                <w:t>Intern</w:t>
+                <w:t>Intern - Project Management Office, CISC SpA</w:t>
               </w:r>
-              <w:proofErr w:type="spellEnd"/>
-              <w:r>
-                <w:t xml:space="preserve"> - Project Management Office, CISC </w:t>
-              </w:r>
-              <w:proofErr w:type="spellStart"/>
-              <w:r>
-                <w:t>SpA</w:t>
-              </w:r>
-              <w:proofErr w:type="spellEnd"/>
             </w:hyperlink>
           </w:p>
         </w:tc>
@@ -899,13 +322,8 @@
             <w:pPr>
               <w:pStyle w:val="Ttulo4"/>
             </w:pPr>
-            <w:proofErr w:type="spellStart"/>
-            <w:r>
-              <w:t>Aug</w:t>
-            </w:r>
-            <w:proofErr w:type="spellEnd"/>
-            <w:r>
-              <w:t xml:space="preserve"> 2024 - Nov 2024</w:t>
+            <w:r>
+              <w:t>Aug 2024 - Nov 2024</w:t>
             </w:r>
           </w:p>
         </w:tc>
@@ -933,257 +351,18 @@
                 <w:color w:val="auto"/>
               </w:rPr>
             </w:pPr>
-            <w:proofErr w:type="spellStart"/>
-            <w:r>
-              <w:t>Contributed</w:t>
-            </w:r>
-            <w:proofErr w:type="spellEnd"/>
-            <w:r>
-              <w:t xml:space="preserve"> </w:t>
-            </w:r>
-            <w:proofErr w:type="spellStart"/>
-            <w:r>
-              <w:t>to</w:t>
-            </w:r>
-            <w:proofErr w:type="spellEnd"/>
-            <w:r>
-              <w:t xml:space="preserve"> a </w:t>
-            </w:r>
-            <w:proofErr w:type="spellStart"/>
-            <w:r>
-              <w:t>large-scale</w:t>
-            </w:r>
-            <w:proofErr w:type="spellEnd"/>
-            <w:r>
-              <w:t xml:space="preserve"> </w:t>
-            </w:r>
-            <w:proofErr w:type="spellStart"/>
-            <w:r>
-              <w:t>green</w:t>
-            </w:r>
-            <w:proofErr w:type="spellEnd"/>
-            <w:r>
-              <w:t xml:space="preserve"> </w:t>
-            </w:r>
-            <w:proofErr w:type="spellStart"/>
-            <w:r>
-              <w:t>hydrogen</w:t>
-            </w:r>
-            <w:proofErr w:type="spellEnd"/>
-            <w:r>
-              <w:t xml:space="preserve"> </w:t>
-            </w:r>
-            <w:proofErr w:type="spellStart"/>
-            <w:r>
-              <w:t>project</w:t>
-            </w:r>
-            <w:proofErr w:type="spellEnd"/>
-            <w:r>
-              <w:t xml:space="preserve">, </w:t>
-            </w:r>
-            <w:proofErr w:type="spellStart"/>
-            <w:r>
-              <w:t>focusing</w:t>
-            </w:r>
-            <w:proofErr w:type="spellEnd"/>
-            <w:r>
-              <w:t xml:space="preserve"> </w:t>
-            </w:r>
-            <w:proofErr w:type="spellStart"/>
-            <w:r>
-              <w:t>on</w:t>
-            </w:r>
-            <w:proofErr w:type="spellEnd"/>
-            <w:r>
-              <w:t xml:space="preserve"> </w:t>
-            </w:r>
-            <w:proofErr w:type="spellStart"/>
-            <w:r>
-              <w:t>renewable</w:t>
-            </w:r>
-            <w:proofErr w:type="spellEnd"/>
-            <w:r>
-              <w:t xml:space="preserve"> </w:t>
-            </w:r>
-            <w:proofErr w:type="spellStart"/>
-            <w:r>
-              <w:t>energy</w:t>
-            </w:r>
-            <w:proofErr w:type="spellEnd"/>
-            <w:r>
-              <w:t xml:space="preserve"> </w:t>
-            </w:r>
-            <w:proofErr w:type="spellStart"/>
-            <w:r>
-              <w:t>solutions</w:t>
-            </w:r>
-            <w:proofErr w:type="spellEnd"/>
-            <w:r>
-              <w:t xml:space="preserve"> </w:t>
-            </w:r>
-            <w:proofErr w:type="spellStart"/>
-            <w:r>
-              <w:t>including</w:t>
-            </w:r>
-            <w:proofErr w:type="spellEnd"/>
-            <w:r>
-              <w:t xml:space="preserve"> </w:t>
-            </w:r>
-            <w:proofErr w:type="spellStart"/>
-            <w:r>
-              <w:t>wind</w:t>
-            </w:r>
-            <w:proofErr w:type="spellEnd"/>
-            <w:r>
-              <w:t xml:space="preserve"> </w:t>
-            </w:r>
-            <w:proofErr w:type="spellStart"/>
-            <w:r>
-              <w:t>power</w:t>
-            </w:r>
-            <w:proofErr w:type="spellEnd"/>
-            <w:r>
-              <w:t xml:space="preserve"> </w:t>
-            </w:r>
-            <w:proofErr w:type="spellStart"/>
-            <w:r>
-              <w:t>generation</w:t>
-            </w:r>
-            <w:proofErr w:type="spellEnd"/>
-            <w:r>
-              <w:t xml:space="preserve"> and </w:t>
-            </w:r>
-            <w:proofErr w:type="spellStart"/>
-            <w:r>
-              <w:t>energy</w:t>
-            </w:r>
-            <w:proofErr w:type="spellEnd"/>
-            <w:r>
-              <w:t xml:space="preserve"> </w:t>
-            </w:r>
-            <w:proofErr w:type="spellStart"/>
-            <w:r>
-              <w:t>storage</w:t>
-            </w:r>
-            <w:proofErr w:type="spellEnd"/>
-            <w:r>
-              <w:t xml:space="preserve"> (</w:t>
-            </w:r>
-            <w:proofErr w:type="spellStart"/>
-            <w:r>
-              <w:t>electroly</w:t>
+            <w:r>
+              <w:t>Contributed to a large-scale green hydrogen project, focusing on renewable energy solutions including wind power generation and energy storage (electroly</w:t>
             </w:r>
             <w:r>
               <w:t>s</w:t>
             </w:r>
             <w:r>
-              <w:t>er</w:t>
-            </w:r>
-            <w:proofErr w:type="spellEnd"/>
-            <w:r>
-              <w:t xml:space="preserve">, </w:t>
-            </w:r>
-            <w:proofErr w:type="spellStart"/>
-            <w:r>
-              <w:t>battery</w:t>
-            </w:r>
-            <w:proofErr w:type="spellEnd"/>
-            <w:r>
-              <w:t xml:space="preserve"> </w:t>
-            </w:r>
-            <w:proofErr w:type="spellStart"/>
-            <w:r>
-              <w:t>systems</w:t>
-            </w:r>
-            <w:proofErr w:type="spellEnd"/>
-            <w:r>
-              <w:t xml:space="preserve">, </w:t>
-            </w:r>
-            <w:proofErr w:type="spellStart"/>
-            <w:r>
-              <w:t>hydrogen</w:t>
-            </w:r>
-            <w:proofErr w:type="spellEnd"/>
-            <w:r>
-              <w:t xml:space="preserve"> </w:t>
-            </w:r>
-            <w:proofErr w:type="spellStart"/>
-            <w:r>
-              <w:t>storage</w:t>
-            </w:r>
-            <w:proofErr w:type="spellEnd"/>
-            <w:r>
-              <w:t xml:space="preserve">). </w:t>
-            </w:r>
-            <w:proofErr w:type="spellStart"/>
-            <w:r>
-              <w:t>Managed</w:t>
-            </w:r>
-            <w:proofErr w:type="spellEnd"/>
-            <w:r>
-              <w:t xml:space="preserve"> </w:t>
-            </w:r>
-            <w:proofErr w:type="spellStart"/>
-            <w:r>
-              <w:t>to</w:t>
-            </w:r>
-            <w:proofErr w:type="spellEnd"/>
-            <w:r>
-              <w:t xml:space="preserve"> catalogue +10.000 </w:t>
-            </w:r>
-            <w:proofErr w:type="spellStart"/>
-            <w:r>
-              <w:t>keywords</w:t>
-            </w:r>
-            <w:proofErr w:type="spellEnd"/>
-            <w:r>
-              <w:t xml:space="preserve"> in +2000 </w:t>
-            </w:r>
-            <w:proofErr w:type="spellStart"/>
-            <w:r>
-              <w:t>technical</w:t>
-            </w:r>
-            <w:proofErr w:type="spellEnd"/>
-            <w:r>
-              <w:t xml:space="preserve"> files </w:t>
-            </w:r>
-            <w:proofErr w:type="spellStart"/>
-            <w:r>
-              <w:t>to</w:t>
-            </w:r>
-            <w:proofErr w:type="spellEnd"/>
-            <w:r>
-              <w:t xml:space="preserve"> </w:t>
-            </w:r>
-            <w:proofErr w:type="spellStart"/>
-            <w:r>
-              <w:t>optimise</w:t>
-            </w:r>
-            <w:proofErr w:type="spellEnd"/>
-            <w:r>
-              <w:t xml:space="preserve"> </w:t>
-            </w:r>
-            <w:proofErr w:type="spellStart"/>
-            <w:r>
-              <w:t>the</w:t>
-            </w:r>
-            <w:proofErr w:type="spellEnd"/>
-            <w:r>
-              <w:t xml:space="preserve"> </w:t>
-            </w:r>
-            <w:proofErr w:type="spellStart"/>
-            <w:r>
-              <w:t>company</w:t>
-            </w:r>
-            <w:proofErr w:type="spellEnd"/>
-            <w:r>
-              <w:t xml:space="preserve"> </w:t>
-            </w:r>
-            <w:proofErr w:type="spellStart"/>
-            <w:r>
-              <w:t>database</w:t>
-            </w:r>
-            <w:proofErr w:type="spellEnd"/>
+              <w:t xml:space="preserve">er, battery systems, hydrogen storage). Managed to catalogue +10.000 keywords in +2000 technical files to optimise </w:t>
+            </w:r>
+            <w:r>
+              <w:t>the company database</w:t>
+            </w:r>
             <w:r>
               <w:t>.</w:t>
             </w:r>
@@ -1223,43 +402,9 @@
             <w:pPr>
               <w:pStyle w:val="Ttulo4"/>
             </w:pPr>
-            <w:proofErr w:type="spellStart"/>
-            <w:r>
-              <w:t>Bachelor</w:t>
-            </w:r>
-            <w:proofErr w:type="spellEnd"/>
-            <w:r>
-              <w:t xml:space="preserve"> and </w:t>
-            </w:r>
-            <w:proofErr w:type="spellStart"/>
-            <w:r>
-              <w:t>Honours</w:t>
-            </w:r>
-            <w:proofErr w:type="spellEnd"/>
-            <w:r>
-              <w:t xml:space="preserve"> </w:t>
-            </w:r>
-            <w:proofErr w:type="spellStart"/>
-            <w:r>
-              <w:t>Degree</w:t>
-            </w:r>
-            <w:proofErr w:type="spellEnd"/>
-            <w:r>
-              <w:t xml:space="preserve"> in </w:t>
-            </w:r>
-            <w:proofErr w:type="spellStart"/>
-            <w:r>
-              <w:t>Electrical</w:t>
-            </w:r>
-            <w:proofErr w:type="spellEnd"/>
-            <w:r>
-              <w:t xml:space="preserve"> </w:t>
-            </w:r>
-            <w:proofErr w:type="spellStart"/>
-            <w:r>
-              <w:t>Engineering</w:t>
-            </w:r>
-            <w:proofErr w:type="spellEnd"/>
+            <w:r>
+              <w:t>Bachelor and Honours Degree in Electrical Engineering</w:t>
+            </w:r>
           </w:p>
         </w:tc>
         <w:tc>
@@ -1274,15 +419,7 @@
               <w:pStyle w:val="Ttulo4"/>
             </w:pPr>
             <w:r>
-              <w:t xml:space="preserve">Feb 2019 - </w:t>
-            </w:r>
-            <w:proofErr w:type="spellStart"/>
-            <w:r>
-              <w:t>Dec</w:t>
-            </w:r>
-            <w:proofErr w:type="spellEnd"/>
-            <w:r>
-              <w:t xml:space="preserve"> 2024</w:t>
+              <w:t>Feb 2019 - Dec 2024</w:t>
             </w:r>
           </w:p>
         </w:tc>
@@ -1302,31 +439,7 @@
               </w:rPr>
             </w:pPr>
             <w:r>
-              <w:t xml:space="preserve">Pontifical </w:t>
-            </w:r>
-            <w:proofErr w:type="spellStart"/>
-            <w:r>
-              <w:t>Catholic</w:t>
-            </w:r>
-            <w:proofErr w:type="spellEnd"/>
-            <w:r>
-              <w:t xml:space="preserve"> </w:t>
-            </w:r>
-            <w:proofErr w:type="spellStart"/>
-            <w:r>
-              <w:t>University</w:t>
-            </w:r>
-            <w:proofErr w:type="spellEnd"/>
-            <w:r>
-              <w:t xml:space="preserve"> </w:t>
-            </w:r>
-            <w:proofErr w:type="spellStart"/>
-            <w:r>
-              <w:t>of</w:t>
-            </w:r>
-            <w:proofErr w:type="spellEnd"/>
-            <w:r>
-              <w:t xml:space="preserve"> Chile</w:t>
+              <w:t>Pontifical Catholic University of Chile</w:t>
             </w:r>
           </w:p>
         </w:tc>
@@ -1358,37 +471,8 @@
                 <w:color w:val="auto"/>
               </w:rPr>
             </w:pPr>
-            <w:proofErr w:type="spellStart"/>
-            <w:r>
-              <w:t>Major</w:t>
-            </w:r>
-            <w:proofErr w:type="spellEnd"/>
-            <w:r>
-              <w:t xml:space="preserve"> in </w:t>
-            </w:r>
-            <w:proofErr w:type="spellStart"/>
-            <w:r>
-              <w:t>Electrical</w:t>
-            </w:r>
-            <w:proofErr w:type="spellEnd"/>
-            <w:r>
-              <w:t xml:space="preserve"> </w:t>
-            </w:r>
-            <w:proofErr w:type="spellStart"/>
-            <w:r>
-              <w:t>Engineering</w:t>
-            </w:r>
-            <w:proofErr w:type="spellEnd"/>
-            <w:r>
-              <w:t xml:space="preserve"> - </w:t>
-            </w:r>
-            <w:proofErr w:type="spellStart"/>
-            <w:r>
-              <w:t>Minor</w:t>
-            </w:r>
-            <w:proofErr w:type="spellEnd"/>
-            <w:r>
-              <w:t xml:space="preserve"> in industries</w:t>
+            <w:r>
+              <w:t>Major in Electrical Engineering - Minor in industries</w:t>
             </w:r>
           </w:p>
           <w:p>
@@ -1402,77 +486,8 @@
                 <w:color w:val="auto"/>
               </w:rPr>
             </w:pPr>
-            <w:proofErr w:type="spellStart"/>
-            <w:r>
-              <w:t>Honours</w:t>
-            </w:r>
-            <w:proofErr w:type="spellEnd"/>
-            <w:r>
-              <w:t xml:space="preserve"> </w:t>
-            </w:r>
-            <w:proofErr w:type="spellStart"/>
-            <w:r>
-              <w:t>degree</w:t>
-            </w:r>
-            <w:proofErr w:type="spellEnd"/>
-            <w:r>
-              <w:t xml:space="preserve"> in </w:t>
-            </w:r>
-            <w:proofErr w:type="spellStart"/>
-            <w:r>
-              <w:t>Renewable</w:t>
-            </w:r>
-            <w:proofErr w:type="spellEnd"/>
-            <w:r>
-              <w:t xml:space="preserve"> Energy (</w:t>
-            </w:r>
-            <w:proofErr w:type="spellStart"/>
-            <w:r>
-              <w:t>Power</w:t>
-            </w:r>
-            <w:proofErr w:type="spellEnd"/>
-            <w:r>
-              <w:t xml:space="preserve"> </w:t>
-            </w:r>
-            <w:proofErr w:type="spellStart"/>
-            <w:r>
-              <w:t>Systems</w:t>
-            </w:r>
-            <w:proofErr w:type="spellEnd"/>
-            <w:r>
-              <w:t xml:space="preserve">, </w:t>
-            </w:r>
-            <w:proofErr w:type="spellStart"/>
-            <w:r>
-              <w:t>Finance</w:t>
-            </w:r>
-            <w:proofErr w:type="spellEnd"/>
-            <w:r>
-              <w:t xml:space="preserve">, </w:t>
-            </w:r>
-            <w:proofErr w:type="spellStart"/>
-            <w:r>
-              <w:t>Electrical</w:t>
-            </w:r>
-            <w:proofErr w:type="spellEnd"/>
-            <w:r>
-              <w:t xml:space="preserve"> </w:t>
-            </w:r>
-            <w:proofErr w:type="spellStart"/>
-            <w:r>
-              <w:t>Markets</w:t>
-            </w:r>
-            <w:proofErr w:type="spellEnd"/>
-            <w:r>
-              <w:t xml:space="preserve">, Project </w:t>
-            </w:r>
-            <w:proofErr w:type="spellStart"/>
-            <w:r>
-              <w:t>Evaluation</w:t>
-            </w:r>
-            <w:proofErr w:type="spellEnd"/>
-            <w:r>
-              <w:t>)</w:t>
+            <w:r>
+              <w:t>Honours degree in Renewable Energy (Power Systems, Finance, Electrical Markets, Project Evaluation)</w:t>
             </w:r>
           </w:p>
           <w:p>
@@ -1495,21 +510,8 @@
               <w:pStyle w:val="Ttulo4"/>
             </w:pPr>
             <w:r>
-              <w:t xml:space="preserve">Bilateral Exchange </w:t>
-            </w:r>
-            <w:proofErr w:type="spellStart"/>
-            <w:r>
-              <w:t>Semester</w:t>
-            </w:r>
-            <w:proofErr w:type="spellEnd"/>
-            <w:r>
-              <w:t xml:space="preserve"> </w:t>
-            </w:r>
-            <w:proofErr w:type="spellStart"/>
-            <w:r>
-              <w:t>Program</w:t>
-            </w:r>
-            <w:proofErr w:type="spellEnd"/>
+              <w:t>Bilateral Exchange Semester Program</w:t>
+            </w:r>
           </w:p>
         </w:tc>
         <w:tc>
@@ -1520,13 +522,8 @@
             <w:pPr>
               <w:pStyle w:val="Ttulo4"/>
             </w:pPr>
-            <w:proofErr w:type="spellStart"/>
-            <w:r>
-              <w:t>July</w:t>
-            </w:r>
-            <w:proofErr w:type="spellEnd"/>
-            <w:r>
-              <w:t xml:space="preserve"> 2023 - Feb 2024</w:t>
+            <w:r>
+              <w:t>July 2023 - Feb 2024</w:t>
             </w:r>
           </w:p>
         </w:tc>
@@ -1539,15 +536,7 @@
           </w:tcPr>
           <w:p>
             <w:r>
-              <w:t xml:space="preserve">Monash </w:t>
-            </w:r>
-            <w:proofErr w:type="spellStart"/>
-            <w:r>
-              <w:t>University</w:t>
-            </w:r>
-            <w:proofErr w:type="spellEnd"/>
-            <w:r>
-              <w:t xml:space="preserve"> (Australia)</w:t>
+              <w:t>Monash University (Australia)</w:t>
             </w:r>
           </w:p>
         </w:tc>
@@ -1582,29 +571,8 @@
                 <w:numId w:val="13"/>
               </w:numPr>
             </w:pPr>
-            <w:proofErr w:type="spellStart"/>
-            <w:r>
-              <w:t>Organisational</w:t>
-            </w:r>
-            <w:proofErr w:type="spellEnd"/>
-            <w:r>
-              <w:t xml:space="preserve"> </w:t>
-            </w:r>
-            <w:proofErr w:type="spellStart"/>
-            <w:r>
-              <w:t>Behaviour</w:t>
-            </w:r>
-            <w:proofErr w:type="spellEnd"/>
-            <w:r>
-              <w:t xml:space="preserve">, Fluid Dynamics and </w:t>
-            </w:r>
-            <w:proofErr w:type="spellStart"/>
-            <w:r>
-              <w:t>Operations</w:t>
-            </w:r>
-            <w:proofErr w:type="spellEnd"/>
-            <w:r>
-              <w:t xml:space="preserve"> Management</w:t>
+            <w:r>
+              <w:t>Organisational Behaviour, Fluid Dynamics and Operations Management</w:t>
             </w:r>
           </w:p>
         </w:tc>
@@ -1647,13 +615,8 @@
                 <w:color w:val="auto"/>
               </w:rPr>
             </w:pPr>
-            <w:proofErr w:type="spellStart"/>
-            <w:r>
-              <w:t>Power</w:t>
-            </w:r>
-            <w:proofErr w:type="spellEnd"/>
-            <w:r>
-              <w:t xml:space="preserve"> BI / Microsoft 365</w:t>
+            <w:r>
+              <w:t>Power BI / Microsoft 365</w:t>
             </w:r>
           </w:p>
           <w:p>
@@ -1662,13 +625,8 @@
                 <w:color w:val="auto"/>
               </w:rPr>
             </w:pPr>
-            <w:proofErr w:type="spellStart"/>
-            <w:r>
-              <w:t>Advanced</w:t>
-            </w:r>
-            <w:proofErr w:type="spellEnd"/>
-            <w:r>
-              <w:t xml:space="preserve"> Excel (macros)</w:t>
+            <w:r>
+              <w:t>Advanced Excel (macros)</w:t>
             </w:r>
           </w:p>
           <w:p>
@@ -1677,13 +635,8 @@
                 <w:color w:val="auto"/>
               </w:rPr>
             </w:pPr>
-            <w:proofErr w:type="spellStart"/>
-            <w:r>
-              <w:t>Power</w:t>
-            </w:r>
-            <w:proofErr w:type="spellEnd"/>
-            <w:r>
-              <w:t xml:space="preserve"> Point, Word </w:t>
+            <w:r>
+              <w:t xml:space="preserve">Power Point, Word </w:t>
             </w:r>
           </w:p>
         </w:tc>
@@ -1702,15 +655,7 @@
               </w:rPr>
             </w:pPr>
             <w:r>
-              <w:t>Matlab (</w:t>
-            </w:r>
-            <w:proofErr w:type="spellStart"/>
-            <w:r>
-              <w:t>basics</w:t>
-            </w:r>
-            <w:proofErr w:type="spellEnd"/>
-            <w:r>
-              <w:t>)</w:t>
+              <w:t>Matlab (basics)</w:t>
             </w:r>
           </w:p>
           <w:p>
@@ -1720,15 +665,7 @@
               </w:rPr>
             </w:pPr>
             <w:r>
-              <w:t>Python (</w:t>
-            </w:r>
-            <w:proofErr w:type="spellStart"/>
-            <w:r>
-              <w:t>advanced</w:t>
-            </w:r>
-            <w:proofErr w:type="spellEnd"/>
-            <w:r>
-              <w:t>)</w:t>
+              <w:t>Python (advanced)</w:t>
             </w:r>
           </w:p>
           <w:p>
@@ -1738,15 +675,7 @@
               </w:rPr>
             </w:pPr>
             <w:r>
-              <w:t>C (</w:t>
-            </w:r>
-            <w:proofErr w:type="spellStart"/>
-            <w:r>
-              <w:t>microcontrollers</w:t>
-            </w:r>
-            <w:proofErr w:type="spellEnd"/>
-            <w:r>
-              <w:t>)</w:t>
+              <w:t>C (microcontrollers)</w:t>
             </w:r>
           </w:p>
         </w:tc>
@@ -1765,29 +694,8 @@
                 <w:color w:val="auto"/>
               </w:rPr>
             </w:pPr>
-            <w:proofErr w:type="spellStart"/>
-            <w:r>
-              <w:t>PowerWorld</w:t>
-            </w:r>
-            <w:proofErr w:type="spellEnd"/>
-            <w:r>
-              <w:t xml:space="preserve"> (</w:t>
-            </w:r>
-            <w:proofErr w:type="spellStart"/>
-            <w:r>
-              <w:t>Power</w:t>
-            </w:r>
-            <w:proofErr w:type="spellEnd"/>
-            <w:r>
-              <w:t xml:space="preserve"> </w:t>
-            </w:r>
-            <w:proofErr w:type="spellStart"/>
-            <w:r>
-              <w:t>Systems</w:t>
-            </w:r>
-            <w:proofErr w:type="spellEnd"/>
-            <w:r>
-              <w:t>)</w:t>
+            <w:r>
+              <w:t>PowerWorld (Power Systems)</w:t>
             </w:r>
           </w:p>
           <w:p>
@@ -1797,15 +705,7 @@
               </w:rPr>
             </w:pPr>
             <w:r>
-              <w:t xml:space="preserve">R (Data </w:t>
-            </w:r>
-            <w:proofErr w:type="spellStart"/>
-            <w:r>
-              <w:t>Analysis</w:t>
-            </w:r>
-            <w:proofErr w:type="spellEnd"/>
-            <w:r>
-              <w:t>)</w:t>
+              <w:t>R (Data Analysis)</w:t>
             </w:r>
           </w:p>
           <w:p>
@@ -1814,27 +714,9 @@
                 <w:color w:val="auto"/>
               </w:rPr>
             </w:pPr>
-            <w:proofErr w:type="spellStart"/>
-            <w:r>
-              <w:t>Type</w:t>
-            </w:r>
-            <w:proofErr w:type="spellEnd"/>
-            <w:r>
-              <w:t xml:space="preserve"> B </w:t>
-            </w:r>
-            <w:proofErr w:type="spellStart"/>
-            <w:r>
-              <w:t>driver’s</w:t>
-            </w:r>
-            <w:proofErr w:type="spellEnd"/>
-            <w:r>
-              <w:t xml:space="preserve"> </w:t>
-            </w:r>
-            <w:proofErr w:type="spellStart"/>
-            <w:r>
-              <w:t>License</w:t>
-            </w:r>
-            <w:proofErr w:type="spellEnd"/>
+            <w:r>
+              <w:t>Type B driver’s License</w:t>
+            </w:r>
           </w:p>
         </w:tc>
       </w:tr>
@@ -1874,6 +756,7 @@
             <w:gridSpan w:val="5"/>
             <w:tcBorders>
               <w:top w:val="single" w:sz="8" w:space="0" w:color="0070C0"/>
+              <w:bottom w:val="single" w:sz="8" w:space="0" w:color="0070C0"/>
             </w:tcBorders>
           </w:tcPr>
           <w:p>
@@ -1887,407 +770,65 @@
                 <w:color w:val="auto"/>
               </w:rPr>
             </w:pPr>
-            <w:proofErr w:type="spellStart"/>
             <w:r>
               <w:rPr>
                 <w:b/>
                 <w:bCs/>
               </w:rPr>
-              <w:t>Volunteer</w:t>
-            </w:r>
-            <w:proofErr w:type="spellEnd"/>
+              <w:t>Activities</w:t>
+            </w:r>
+            <w:r>
+              <w:t>: Reading, cultural exchange, active learning, and personal development.</w:t>
+            </w:r>
+          </w:p>
+          <w:p>
+            <w:pPr>
+              <w:pStyle w:val="Prrafodelista"/>
+              <w:numPr>
+                <w:ilvl w:val="0"/>
+                <w:numId w:val="13"/>
+              </w:numPr>
+            </w:pPr>
             <w:r>
               <w:rPr>
                 <w:b/>
                 <w:bCs/>
               </w:rPr>
+              <w:t>Languages:</w:t>
+            </w:r>
+            <w:r>
               <w:t xml:space="preserve"> </w:t>
             </w:r>
-            <w:proofErr w:type="spellStart"/>
-            <w:r>
-              <w:rPr>
-                <w:b/>
-                <w:bCs/>
-              </w:rPr>
-              <w:t>Work</w:t>
-            </w:r>
-            <w:proofErr w:type="spellEnd"/>
-            <w:r>
-              <w:rPr>
-                <w:rStyle w:val="nfasis"/>
-                <w:rFonts w:ascii="Segoe UI" w:hAnsi="Segoe UI" w:cs="Segoe UI"/>
-                <w:color w:val="404040"/>
-              </w:rPr>
-              <w:t>:</w:t>
-            </w:r>
-            <w:r>
-              <w:t> </w:t>
-            </w:r>
-            <w:proofErr w:type="spellStart"/>
-            <w:r>
-              <w:t>Participated</w:t>
-            </w:r>
-            <w:proofErr w:type="spellEnd"/>
-            <w:r>
-              <w:t xml:space="preserve"> in Trabajos de Invierno (TDI), a social </w:t>
-            </w:r>
-            <w:proofErr w:type="spellStart"/>
-            <w:r>
-              <w:t>initiative</w:t>
-            </w:r>
-            <w:proofErr w:type="spellEnd"/>
-            <w:r>
-              <w:t xml:space="preserve"> </w:t>
-            </w:r>
-            <w:proofErr w:type="spellStart"/>
-            <w:r>
-              <w:t>aimed</w:t>
-            </w:r>
-            <w:proofErr w:type="spellEnd"/>
-            <w:r>
-              <w:t xml:space="preserve"> at </w:t>
-            </w:r>
-            <w:proofErr w:type="spellStart"/>
-            <w:r>
-              <w:t>empowering</w:t>
-            </w:r>
-            <w:proofErr w:type="spellEnd"/>
-            <w:r>
-              <w:t xml:space="preserve"> </w:t>
-            </w:r>
-            <w:proofErr w:type="spellStart"/>
-            <w:r>
-              <w:t>economically</w:t>
-            </w:r>
-            <w:proofErr w:type="spellEnd"/>
-            <w:r>
-              <w:t xml:space="preserve"> vulnerable </w:t>
-            </w:r>
-            <w:proofErr w:type="spellStart"/>
-            <w:r>
-              <w:t>families</w:t>
-            </w:r>
-            <w:proofErr w:type="spellEnd"/>
-            <w:r>
-              <w:t xml:space="preserve"> in rural Chile </w:t>
-            </w:r>
-            <w:proofErr w:type="spellStart"/>
-            <w:r>
-              <w:t>by</w:t>
-            </w:r>
-            <w:proofErr w:type="spellEnd"/>
-            <w:r>
-              <w:t xml:space="preserve"> </w:t>
-            </w:r>
-            <w:proofErr w:type="spellStart"/>
-            <w:r>
-              <w:t>providing</w:t>
-            </w:r>
-            <w:proofErr w:type="spellEnd"/>
-            <w:r>
-              <w:t xml:space="preserve"> </w:t>
-            </w:r>
-            <w:proofErr w:type="spellStart"/>
-            <w:r>
-              <w:t>them</w:t>
-            </w:r>
-            <w:proofErr w:type="spellEnd"/>
-            <w:r>
-              <w:t xml:space="preserve"> </w:t>
-            </w:r>
-            <w:proofErr w:type="spellStart"/>
-            <w:r>
-              <w:t>with</w:t>
-            </w:r>
-            <w:proofErr w:type="spellEnd"/>
-            <w:r>
-              <w:t xml:space="preserve"> </w:t>
-            </w:r>
-            <w:proofErr w:type="spellStart"/>
-            <w:r>
-              <w:t>tools</w:t>
-            </w:r>
-            <w:proofErr w:type="spellEnd"/>
-            <w:r>
-              <w:t xml:space="preserve"> </w:t>
-            </w:r>
-            <w:proofErr w:type="spellStart"/>
-            <w:r>
-              <w:t>for</w:t>
-            </w:r>
-            <w:proofErr w:type="spellEnd"/>
-            <w:r>
-              <w:t xml:space="preserve"> </w:t>
-            </w:r>
-            <w:proofErr w:type="spellStart"/>
-            <w:r>
-              <w:t>self-sufficiency</w:t>
-            </w:r>
-            <w:proofErr w:type="spellEnd"/>
-            <w:r>
-              <w:t xml:space="preserve">. </w:t>
-            </w:r>
-            <w:proofErr w:type="spellStart"/>
-            <w:r>
-              <w:t>Over</w:t>
-            </w:r>
-            <w:proofErr w:type="spellEnd"/>
-            <w:r>
-              <w:t xml:space="preserve"> </w:t>
-            </w:r>
-            <w:proofErr w:type="spellStart"/>
-            <w:r>
-              <w:t>three</w:t>
-            </w:r>
-            <w:proofErr w:type="spellEnd"/>
-            <w:r>
-              <w:t xml:space="preserve"> </w:t>
-            </w:r>
-            <w:proofErr w:type="spellStart"/>
-            <w:r>
-              <w:t>campaigns</w:t>
-            </w:r>
-            <w:proofErr w:type="spellEnd"/>
-            <w:r>
-              <w:t xml:space="preserve"> in </w:t>
-            </w:r>
-            <w:proofErr w:type="spellStart"/>
-            <w:r>
-              <w:t>the</w:t>
-            </w:r>
-            <w:proofErr w:type="spellEnd"/>
-            <w:r>
-              <w:t xml:space="preserve"> La Araucanía </w:t>
-            </w:r>
-            <w:proofErr w:type="spellStart"/>
-            <w:r>
-              <w:t>Region</w:t>
-            </w:r>
-            <w:proofErr w:type="spellEnd"/>
-            <w:r>
-              <w:t xml:space="preserve">, I </w:t>
-            </w:r>
-            <w:proofErr w:type="spellStart"/>
-            <w:r>
-              <w:t>helped</w:t>
-            </w:r>
-            <w:proofErr w:type="spellEnd"/>
-            <w:r>
-              <w:t xml:space="preserve"> </w:t>
-            </w:r>
-            <w:proofErr w:type="spellStart"/>
-            <w:r>
-              <w:t>build</w:t>
-            </w:r>
-            <w:proofErr w:type="spellEnd"/>
-            <w:r>
-              <w:t xml:space="preserve"> </w:t>
-            </w:r>
-            <w:proofErr w:type="spellStart"/>
-            <w:r>
-              <w:t>greenhouses</w:t>
-            </w:r>
-            <w:proofErr w:type="spellEnd"/>
-            <w:r>
-              <w:t xml:space="preserve"> and </w:t>
-            </w:r>
-            <w:proofErr w:type="spellStart"/>
-            <w:r>
-              <w:t>water</w:t>
-            </w:r>
-            <w:proofErr w:type="spellEnd"/>
-            <w:r>
-              <w:t xml:space="preserve"> </w:t>
-            </w:r>
-            <w:proofErr w:type="spellStart"/>
-            <w:r>
-              <w:t>towers</w:t>
-            </w:r>
-            <w:proofErr w:type="spellEnd"/>
-            <w:r>
-              <w:t xml:space="preserve"> in </w:t>
-            </w:r>
-            <w:proofErr w:type="spellStart"/>
-            <w:r>
-              <w:t>collaboration</w:t>
-            </w:r>
-            <w:proofErr w:type="spellEnd"/>
-            <w:r>
-              <w:t xml:space="preserve"> </w:t>
-            </w:r>
-            <w:proofErr w:type="spellStart"/>
-            <w:r>
-              <w:t>with</w:t>
-            </w:r>
-            <w:proofErr w:type="spellEnd"/>
-            <w:r>
-              <w:t xml:space="preserve"> local </w:t>
-            </w:r>
-            <w:proofErr w:type="spellStart"/>
-            <w:r>
-              <w:t>communities</w:t>
-            </w:r>
-            <w:proofErr w:type="spellEnd"/>
-            <w:r>
-              <w:t xml:space="preserve"> ("comunas"). </w:t>
-            </w:r>
-            <w:proofErr w:type="spellStart"/>
-            <w:r>
-              <w:t>On</w:t>
-            </w:r>
-            <w:proofErr w:type="spellEnd"/>
-            <w:r>
-              <w:t xml:space="preserve"> </w:t>
-            </w:r>
-            <w:proofErr w:type="spellStart"/>
-            <w:r>
-              <w:t>one</w:t>
-            </w:r>
-            <w:proofErr w:type="spellEnd"/>
-            <w:r>
-              <w:t xml:space="preserve"> </w:t>
-            </w:r>
-            <w:proofErr w:type="spellStart"/>
-            <w:r>
-              <w:t>occasion</w:t>
-            </w:r>
-            <w:proofErr w:type="spellEnd"/>
-            <w:r>
-              <w:t xml:space="preserve">, I led a </w:t>
-            </w:r>
-            <w:proofErr w:type="spellStart"/>
-            <w:r>
-              <w:t>team</w:t>
-            </w:r>
-            <w:proofErr w:type="spellEnd"/>
-            <w:r>
-              <w:t xml:space="preserve"> </w:t>
-            </w:r>
-            <w:proofErr w:type="spellStart"/>
-            <w:r>
-              <w:t>of</w:t>
-            </w:r>
-            <w:proofErr w:type="spellEnd"/>
-            <w:r>
-              <w:t xml:space="preserve"> 10 </w:t>
-            </w:r>
-            <w:proofErr w:type="spellStart"/>
-            <w:r>
-              <w:t>students</w:t>
-            </w:r>
-            <w:proofErr w:type="spellEnd"/>
-            <w:r>
-              <w:t>—</w:t>
-            </w:r>
-            <w:proofErr w:type="spellStart"/>
-            <w:r>
-              <w:t>most</w:t>
-            </w:r>
-            <w:proofErr w:type="spellEnd"/>
-            <w:r>
-              <w:t xml:space="preserve"> </w:t>
-            </w:r>
-            <w:proofErr w:type="spellStart"/>
-            <w:r>
-              <w:t>with</w:t>
-            </w:r>
-            <w:proofErr w:type="spellEnd"/>
-            <w:r>
-              <w:t xml:space="preserve"> no prior </w:t>
-            </w:r>
-            <w:proofErr w:type="spellStart"/>
-            <w:r>
-              <w:t>experience</w:t>
-            </w:r>
-            <w:proofErr w:type="spellEnd"/>
-            <w:r>
-              <w:t>—</w:t>
-            </w:r>
-            <w:proofErr w:type="spellStart"/>
-            <w:r>
-              <w:t>to</w:t>
-            </w:r>
-            <w:proofErr w:type="spellEnd"/>
-            <w:r>
-              <w:t xml:space="preserve"> </w:t>
-            </w:r>
-            <w:proofErr w:type="spellStart"/>
-            <w:r>
-              <w:t>successfully</w:t>
-            </w:r>
-            <w:proofErr w:type="spellEnd"/>
-            <w:r>
-              <w:t xml:space="preserve"> </w:t>
-            </w:r>
-            <w:proofErr w:type="spellStart"/>
-            <w:r>
-              <w:t>construct</w:t>
-            </w:r>
-            <w:proofErr w:type="spellEnd"/>
-            <w:r>
-              <w:t xml:space="preserve"> a </w:t>
-            </w:r>
-            <w:proofErr w:type="spellStart"/>
-            <w:r>
-              <w:t>greenhouse</w:t>
-            </w:r>
-            <w:proofErr w:type="spellEnd"/>
-            <w:r>
-              <w:t xml:space="preserve"> and </w:t>
-            </w:r>
-            <w:proofErr w:type="spellStart"/>
-            <w:r>
-              <w:t>water</w:t>
-            </w:r>
-            <w:proofErr w:type="spellEnd"/>
-            <w:r>
-              <w:t xml:space="preserve"> </w:t>
-            </w:r>
-            <w:proofErr w:type="spellStart"/>
-            <w:r>
-              <w:t>tower</w:t>
-            </w:r>
-            <w:proofErr w:type="spellEnd"/>
-            <w:r>
-              <w:t xml:space="preserve"> </w:t>
-            </w:r>
-            <w:proofErr w:type="spellStart"/>
-            <w:r>
-              <w:t>to</w:t>
-            </w:r>
-            <w:proofErr w:type="spellEnd"/>
-            <w:r>
-              <w:t xml:space="preserve"> </w:t>
-            </w:r>
-            <w:proofErr w:type="spellStart"/>
-            <w:r>
-              <w:t>support</w:t>
-            </w:r>
-            <w:proofErr w:type="spellEnd"/>
-            <w:r>
-              <w:t xml:space="preserve"> </w:t>
-            </w:r>
-            <w:proofErr w:type="spellStart"/>
-            <w:r>
-              <w:t>sustainable</w:t>
-            </w:r>
-            <w:proofErr w:type="spellEnd"/>
-            <w:r>
-              <w:t xml:space="preserve"> </w:t>
-            </w:r>
-            <w:proofErr w:type="spellStart"/>
-            <w:r>
-              <w:t>food</w:t>
-            </w:r>
-            <w:proofErr w:type="spellEnd"/>
-            <w:r>
-              <w:t xml:space="preserve"> </w:t>
-            </w:r>
-            <w:proofErr w:type="spellStart"/>
-            <w:r>
-              <w:t>production</w:t>
-            </w:r>
-            <w:proofErr w:type="spellEnd"/>
+            <w:r>
+              <w:t>English</w:t>
+            </w:r>
+            <w:r>
+              <w:t xml:space="preserve"> - </w:t>
+            </w:r>
+            <w:r>
+              <w:t>TOEFLiBT (96)</w:t>
+            </w:r>
+            <w:r>
+              <w:t>, Spanish</w:t>
+            </w:r>
+            <w:r>
+              <w:t xml:space="preserve"> - </w:t>
+            </w:r>
+            <w:r>
+              <w:t xml:space="preserve">native and German </w:t>
+            </w:r>
+            <w:r>
+              <w:t xml:space="preserve">- </w:t>
+            </w:r>
+            <w:r>
+              <w:t>A</w:t>
+            </w:r>
+            <w:r>
+              <w:t>1</w:t>
+            </w:r>
+            <w:r>
+              <w:t xml:space="preserve"> certificate</w:t>
+            </w:r>
             <w:r>
               <w:t>.</w:t>
             </w:r>
@@ -2303,222 +844,87 @@
                 <w:color w:val="auto"/>
               </w:rPr>
             </w:pPr>
-            <w:proofErr w:type="spellStart"/>
             <w:r>
               <w:rPr>
                 <w:b/>
                 <w:bCs/>
               </w:rPr>
-              <w:t>University</w:t>
-            </w:r>
-            <w:proofErr w:type="spellEnd"/>
-            <w:r>
+              <w:t>University Rugby Team</w:t>
+            </w:r>
+            <w:r>
+              <w:t>: Represented the university as a varsity rugby playe</w:t>
+            </w:r>
+            <w:r>
+              <w:t>r for three (3) years.</w:t>
+            </w:r>
+          </w:p>
+          <w:p>
+            <w:pPr>
+              <w:ind w:left="360"/>
+            </w:pPr>
+          </w:p>
+        </w:tc>
+      </w:tr>
+      <w:tr>
+        <w:trPr>
+          <w:trHeight w:val="44"/>
+        </w:trPr>
+        <w:tc>
+          <w:tcPr>
+            <w:tcW w:w="10490" w:type="dxa"/>
+            <w:gridSpan w:val="5"/>
+            <w:tcBorders>
+              <w:top w:val="single" w:sz="8" w:space="0" w:color="0070C0"/>
+              <w:bottom w:val="single" w:sz="8" w:space="0" w:color="0070C0"/>
+            </w:tcBorders>
+          </w:tcPr>
+          <w:p>
+            <w:pPr>
+              <w:pStyle w:val="Ttulo1"/>
+            </w:pPr>
+            <w:r>
+              <w:t>Volunteer Work</w:t>
+            </w:r>
+          </w:p>
+        </w:tc>
+      </w:tr>
+      <w:tr>
+        <w:trPr>
+          <w:trHeight w:val="1265"/>
+        </w:trPr>
+        <w:tc>
+          <w:tcPr>
+            <w:tcW w:w="10490" w:type="dxa"/>
+            <w:gridSpan w:val="5"/>
+            <w:tcBorders>
+              <w:top w:val="single" w:sz="8" w:space="0" w:color="0070C0"/>
+            </w:tcBorders>
+          </w:tcPr>
+          <w:p>
+            <w:pPr>
               <w:rPr>
                 <w:b/>
                 <w:bCs/>
               </w:rPr>
-              <w:t xml:space="preserve"> Rugby </w:t>
-            </w:r>
-            <w:proofErr w:type="spellStart"/>
-            <w:r>
-              <w:rPr>
-                <w:b/>
-                <w:bCs/>
-              </w:rPr>
-              <w:t>Team</w:t>
-            </w:r>
-            <w:proofErr w:type="spellEnd"/>
-            <w:r>
-              <w:t xml:space="preserve">: </w:t>
-            </w:r>
-            <w:proofErr w:type="spellStart"/>
-            <w:r>
-              <w:t>Represented</w:t>
-            </w:r>
-            <w:proofErr w:type="spellEnd"/>
-            <w:r>
-              <w:t xml:space="preserve"> </w:t>
-            </w:r>
-            <w:proofErr w:type="spellStart"/>
-            <w:r>
-              <w:t>the</w:t>
-            </w:r>
-            <w:proofErr w:type="spellEnd"/>
-            <w:r>
-              <w:t xml:space="preserve"> </w:t>
-            </w:r>
-            <w:proofErr w:type="spellStart"/>
-            <w:r>
-              <w:t>university</w:t>
-            </w:r>
-            <w:proofErr w:type="spellEnd"/>
-            <w:r>
-              <w:t xml:space="preserve"> as a </w:t>
-            </w:r>
-            <w:proofErr w:type="spellStart"/>
-            <w:r>
-              <w:t>varsity</w:t>
-            </w:r>
-            <w:proofErr w:type="spellEnd"/>
-            <w:r>
-              <w:t xml:space="preserve"> rugby </w:t>
-            </w:r>
-            <w:proofErr w:type="spellStart"/>
-            <w:r>
-              <w:t>playe</w:t>
-            </w:r>
-            <w:r>
-              <w:t>r</w:t>
-            </w:r>
-            <w:proofErr w:type="spellEnd"/>
-            <w:r>
-              <w:t xml:space="preserve"> </w:t>
-            </w:r>
-            <w:proofErr w:type="spellStart"/>
-            <w:r>
-              <w:t>for</w:t>
-            </w:r>
-            <w:proofErr w:type="spellEnd"/>
-            <w:r>
-              <w:t xml:space="preserve"> </w:t>
-            </w:r>
-            <w:proofErr w:type="spellStart"/>
-            <w:r>
-              <w:t>three</w:t>
-            </w:r>
-            <w:proofErr w:type="spellEnd"/>
-            <w:r>
-              <w:t xml:space="preserve"> (3) </w:t>
-            </w:r>
-            <w:proofErr w:type="spellStart"/>
-            <w:r>
-              <w:t>years</w:t>
-            </w:r>
-            <w:proofErr w:type="spellEnd"/>
-            <w:r>
-              <w:t>.</w:t>
-            </w:r>
-          </w:p>
-          <w:p>
-            <w:pPr>
-              <w:pStyle w:val="Prrafodelista"/>
-              <w:numPr>
-                <w:ilvl w:val="0"/>
-                <w:numId w:val="13"/>
-              </w:numPr>
-              <w:rPr>
-                <w:color w:val="auto"/>
-              </w:rPr>
             </w:pPr>
-            <w:proofErr w:type="spellStart"/>
-            <w:r>
-              <w:rPr>
-                <w:b/>
-                <w:bCs/>
-              </w:rPr>
-              <w:t>Activities</w:t>
-            </w:r>
-            <w:proofErr w:type="spellEnd"/>
-            <w:r>
-              <w:t xml:space="preserve">: Reading, cultural </w:t>
-            </w:r>
-            <w:proofErr w:type="spellStart"/>
-            <w:r>
-              <w:t>exchange</w:t>
-            </w:r>
-            <w:proofErr w:type="spellEnd"/>
-            <w:r>
-              <w:t xml:space="preserve">, active </w:t>
-            </w:r>
-            <w:proofErr w:type="spellStart"/>
-            <w:r>
-              <w:t>learning</w:t>
-            </w:r>
-            <w:proofErr w:type="spellEnd"/>
-            <w:r>
-              <w:t xml:space="preserve">, and personal </w:t>
-            </w:r>
-            <w:proofErr w:type="spellStart"/>
-            <w:r>
-              <w:t>development</w:t>
-            </w:r>
-            <w:proofErr w:type="spellEnd"/>
-            <w:r>
-              <w:t>.</w:t>
-            </w:r>
-          </w:p>
-          <w:p>
-            <w:pPr>
-              <w:pStyle w:val="Prrafodelista"/>
-              <w:numPr>
-                <w:ilvl w:val="0"/>
-                <w:numId w:val="13"/>
-              </w:numPr>
-            </w:pPr>
-            <w:proofErr w:type="spellStart"/>
-            <w:r>
-              <w:rPr>
-                <w:b/>
-                <w:bCs/>
-              </w:rPr>
-              <w:t>Languages</w:t>
-            </w:r>
-            <w:proofErr w:type="spellEnd"/>
-            <w:r>
-              <w:rPr>
-                <w:b/>
-                <w:bCs/>
-              </w:rPr>
-              <w:t>:</w:t>
-            </w:r>
-            <w:r>
-              <w:t xml:space="preserve"> </w:t>
-            </w:r>
-            <w:r>
-              <w:t>English</w:t>
-            </w:r>
-            <w:r>
-              <w:t xml:space="preserve"> - </w:t>
-            </w:r>
-            <w:proofErr w:type="spellStart"/>
-            <w:r>
-              <w:t>TOEFLiBT</w:t>
-            </w:r>
-            <w:proofErr w:type="spellEnd"/>
-            <w:r>
-              <w:t xml:space="preserve"> (96)</w:t>
-            </w:r>
-            <w:r>
-              <w:t xml:space="preserve">, </w:t>
-            </w:r>
-            <w:proofErr w:type="spellStart"/>
-            <w:r>
-              <w:t>Spanish</w:t>
-            </w:r>
-            <w:proofErr w:type="spellEnd"/>
-            <w:r>
-              <w:t xml:space="preserve"> - </w:t>
-            </w:r>
-            <w:r>
-              <w:t xml:space="preserve">native and German </w:t>
-            </w:r>
-            <w:r>
-              <w:t xml:space="preserve">- </w:t>
-            </w:r>
-            <w:r>
-              <w:t>A</w:t>
-            </w:r>
-            <w:r>
-              <w:t>1</w:t>
-            </w:r>
-            <w:r>
-              <w:t xml:space="preserve"> </w:t>
-            </w:r>
-            <w:proofErr w:type="spellStart"/>
-            <w:r>
-              <w:t>certificate</w:t>
-            </w:r>
-            <w:proofErr w:type="spellEnd"/>
+            <w:r>
+              <w:t>Participated in Trabajos de Invierno (TDI), a social initiative aimed at empowering economically vulnerable families in rural Chile by providing them with tools for self-sufficiency. Over three campaigns in the La Araucanía Region, I helped build greenhouses and water towers in collaboration with local communities ("comunas"). On one occasion, I led a team of 10 students</w:t>
+            </w:r>
+            <w:r>
+              <w:t xml:space="preserve"> (</w:t>
+            </w:r>
+            <w:r>
+              <w:t>most with no prior experience</w:t>
+            </w:r>
+            <w:r>
+              <w:t xml:space="preserve">), </w:t>
+            </w:r>
+            <w:r>
+              <w:t>to successfully construct a greenhouse and water tower to support sustainable food production</w:t>
+            </w:r>
+            <w:r>
+              <w:t xml:space="preserve"> in a period of 8 days.</w:t>
+            </w:r>
             <w:r>
               <w:t>.</w:t>
             </w:r>
@@ -2528,7 +934,12 @@
     </w:tbl>
     <w:p/>
     <w:sectPr>
-      <w:headerReference w:type="default" r:id="rId12"/>
+      <w:headerReference w:type="even" r:id="rId12"/>
+      <w:headerReference w:type="default" r:id="rId13"/>
+      <w:footerReference w:type="even" r:id="rId14"/>
+      <w:footerReference w:type="default" r:id="rId15"/>
+      <w:headerReference w:type="first" r:id="rId16"/>
+      <w:footerReference w:type="first" r:id="rId17"/>
       <w:pgSz w:w="11910" w:h="16845"/>
       <w:pgMar w:top="720" w:right="720" w:bottom="720" w:left="720" w:header="720" w:footer="720" w:gutter="0"/>
       <w:cols w:space="720"/>
@@ -2557,6 +968,36 @@
 </w:endnotes>
 </file>
 
+<file path=word/footer1.xml><?xml version="1.0" encoding="utf-8"?>
+<w:ftr xmlns:wpc="http://schemas.microsoft.com/office/word/2010/wordprocessingCanvas" xmlns:cx="http://schemas.microsoft.com/office/drawing/2014/chartex" xmlns:cx1="http://schemas.microsoft.com/office/drawing/2015/9/8/chartex" xmlns:cx2="http://schemas.microsoft.com/office/drawing/2015/10/21/chartex" xmlns:cx3="http://schemas.microsoft.com/office/drawing/2016/5/9/chartex" xmlns:cx4="http://schemas.microsoft.com/office/drawing/2016/5/10/chartex" xmlns:cx5="http://schemas.microsoft.com/office/drawing/2016/5/11/chartex" xmlns:cx6="http://schemas.microsoft.com/office/drawing/2016/5/12/chartex" xmlns:cx7="http://schemas.microsoft.com/office/drawing/2016/5/13/chartex" xmlns:cx8="http://schemas.microsoft.com/office/drawing/2016/5/14/chartex" xmlns:mc="http://schemas.openxmlformats.org/markup-compatibility/2006" xmlns:aink="http://schemas.microsoft.com/office/drawing/2016/ink" xmlns:am3d="http://schemas.microsoft.com/office/drawing/2017/model3d" xmlns:o="urn:schemas-microsoft-com:office:office" xmlns:oel="http://schemas.microsoft.com/office/2019/extlst" xmlns:r="http://schemas.openxmlformats.org/officeDocument/2006/relationships" xmlns:m="http://schemas.openxmlformats.org/officeDocument/2006/math" xmlns:v="urn:schemas-microsoft-com:vml" xmlns:wp14="http://schemas.microsoft.com/office/word/2010/wordprocessingDrawing" xmlns:wp="http://schemas.openxmlformats.org/drawingml/2006/wordprocessingDrawing" xmlns:w10="urn:schemas-microsoft-com:office:word" xmlns:w="http://schemas.openxmlformats.org/wordprocessingml/2006/main" xmlns:w14="http://schemas.microsoft.com/office/word/2010/wordml" xmlns:w15="http://schemas.microsoft.com/office/word/2012/wordml" xmlns:w16cex="http://schemas.microsoft.com/office/word/2018/wordml/cex" xmlns:w16cid="http://schemas.microsoft.com/office/word/2016/wordml/cid" xmlns:w16="http://schemas.microsoft.com/office/word/2018/wordml" xmlns:w16du="http://schemas.microsoft.com/office/word/2023/wordml/word16du" xmlns:w16sdtdh="http://schemas.microsoft.com/office/word/2020/wordml/sdtdatahash" xmlns:w16sdtfl="http://schemas.microsoft.com/office/word/2024/wordml/sdtformatlock" xmlns:w16se="http://schemas.microsoft.com/office/word/2015/wordml/symex" xmlns:wpg="http://schemas.microsoft.com/office/word/2010/wordprocessingGroup" xmlns:wpi="http://schemas.microsoft.com/office/word/2010/wordprocessingInk" xmlns:wne="http://schemas.microsoft.com/office/word/2006/wordml" xmlns:wps="http://schemas.microsoft.com/office/word/2010/wordprocessingShape" mc:Ignorable="w14 w15 w16se w16cid w16 w16cex w16sdtdh w16sdtfl w16du wp14">
+  <w:p>
+    <w:pPr>
+      <w:pStyle w:val="Piedepgina"/>
+    </w:pPr>
+  </w:p>
+</w:ftr>
+</file>
+
+<file path=word/footer2.xml><?xml version="1.0" encoding="utf-8"?>
+<w:ftr xmlns:wpc="http://schemas.microsoft.com/office/word/2010/wordprocessingCanvas" xmlns:cx="http://schemas.microsoft.com/office/drawing/2014/chartex" xmlns:cx1="http://schemas.microsoft.com/office/drawing/2015/9/8/chartex" xmlns:cx2="http://schemas.microsoft.com/office/drawing/2015/10/21/chartex" xmlns:cx3="http://schemas.microsoft.com/office/drawing/2016/5/9/chartex" xmlns:cx4="http://schemas.microsoft.com/office/drawing/2016/5/10/chartex" xmlns:cx5="http://schemas.microsoft.com/office/drawing/2016/5/11/chartex" xmlns:cx6="http://schemas.microsoft.com/office/drawing/2016/5/12/chartex" xmlns:cx7="http://schemas.microsoft.com/office/drawing/2016/5/13/chartex" xmlns:cx8="http://schemas.microsoft.com/office/drawing/2016/5/14/chartex" xmlns:mc="http://schemas.openxmlformats.org/markup-compatibility/2006" xmlns:aink="http://schemas.microsoft.com/office/drawing/2016/ink" xmlns:am3d="http://schemas.microsoft.com/office/drawing/2017/model3d" xmlns:o="urn:schemas-microsoft-com:office:office" xmlns:oel="http://schemas.microsoft.com/office/2019/extlst" xmlns:r="http://schemas.openxmlformats.org/officeDocument/2006/relationships" xmlns:m="http://schemas.openxmlformats.org/officeDocument/2006/math" xmlns:v="urn:schemas-microsoft-com:vml" xmlns:wp14="http://schemas.microsoft.com/office/word/2010/wordprocessingDrawing" xmlns:wp="http://schemas.openxmlformats.org/drawingml/2006/wordprocessingDrawing" xmlns:w10="urn:schemas-microsoft-com:office:word" xmlns:w="http://schemas.openxmlformats.org/wordprocessingml/2006/main" xmlns:w14="http://schemas.microsoft.com/office/word/2010/wordml" xmlns:w15="http://schemas.microsoft.com/office/word/2012/wordml" xmlns:w16cex="http://schemas.microsoft.com/office/word/2018/wordml/cex" xmlns:w16cid="http://schemas.microsoft.com/office/word/2016/wordml/cid" xmlns:w16="http://schemas.microsoft.com/office/word/2018/wordml" xmlns:w16du="http://schemas.microsoft.com/office/word/2023/wordml/word16du" xmlns:w16sdtdh="http://schemas.microsoft.com/office/word/2020/wordml/sdtdatahash" xmlns:w16sdtfl="http://schemas.microsoft.com/office/word/2024/wordml/sdtformatlock" xmlns:w16se="http://schemas.microsoft.com/office/word/2015/wordml/symex" xmlns:wpg="http://schemas.microsoft.com/office/word/2010/wordprocessingGroup" xmlns:wpi="http://schemas.microsoft.com/office/word/2010/wordprocessingInk" xmlns:wne="http://schemas.microsoft.com/office/word/2006/wordml" xmlns:wps="http://schemas.microsoft.com/office/word/2010/wordprocessingShape" mc:Ignorable="w14 w15 w16se w16cid w16 w16cex w16sdtdh w16sdtfl w16du wp14">
+  <w:p>
+    <w:pPr>
+      <w:pStyle w:val="Piedepgina"/>
+    </w:pPr>
+  </w:p>
+</w:ftr>
+</file>
+
+<file path=word/footer3.xml><?xml version="1.0" encoding="utf-8"?>
+<w:ftr xmlns:wpc="http://schemas.microsoft.com/office/word/2010/wordprocessingCanvas" xmlns:cx="http://schemas.microsoft.com/office/drawing/2014/chartex" xmlns:cx1="http://schemas.microsoft.com/office/drawing/2015/9/8/chartex" xmlns:cx2="http://schemas.microsoft.com/office/drawing/2015/10/21/chartex" xmlns:cx3="http://schemas.microsoft.com/office/drawing/2016/5/9/chartex" xmlns:cx4="http://schemas.microsoft.com/office/drawing/2016/5/10/chartex" xmlns:cx5="http://schemas.microsoft.com/office/drawing/2016/5/11/chartex" xmlns:cx6="http://schemas.microsoft.com/office/drawing/2016/5/12/chartex" xmlns:cx7="http://schemas.microsoft.com/office/drawing/2016/5/13/chartex" xmlns:cx8="http://schemas.microsoft.com/office/drawing/2016/5/14/chartex" xmlns:mc="http://schemas.openxmlformats.org/markup-compatibility/2006" xmlns:aink="http://schemas.microsoft.com/office/drawing/2016/ink" xmlns:am3d="http://schemas.microsoft.com/office/drawing/2017/model3d" xmlns:o="urn:schemas-microsoft-com:office:office" xmlns:oel="http://schemas.microsoft.com/office/2019/extlst" xmlns:r="http://schemas.openxmlformats.org/officeDocument/2006/relationships" xmlns:m="http://schemas.openxmlformats.org/officeDocument/2006/math" xmlns:v="urn:schemas-microsoft-com:vml" xmlns:wp14="http://schemas.microsoft.com/office/word/2010/wordprocessingDrawing" xmlns:wp="http://schemas.openxmlformats.org/drawingml/2006/wordprocessingDrawing" xmlns:w10="urn:schemas-microsoft-com:office:word" xmlns:w="http://schemas.openxmlformats.org/wordprocessingml/2006/main" xmlns:w14="http://schemas.microsoft.com/office/word/2010/wordml" xmlns:w15="http://schemas.microsoft.com/office/word/2012/wordml" xmlns:w16cex="http://schemas.microsoft.com/office/word/2018/wordml/cex" xmlns:w16cid="http://schemas.microsoft.com/office/word/2016/wordml/cid" xmlns:w16="http://schemas.microsoft.com/office/word/2018/wordml" xmlns:w16du="http://schemas.microsoft.com/office/word/2023/wordml/word16du" xmlns:w16sdtdh="http://schemas.microsoft.com/office/word/2020/wordml/sdtdatahash" xmlns:w16sdtfl="http://schemas.microsoft.com/office/word/2024/wordml/sdtformatlock" xmlns:w16se="http://schemas.microsoft.com/office/word/2015/wordml/symex" xmlns:wpg="http://schemas.microsoft.com/office/word/2010/wordprocessingGroup" xmlns:wpi="http://schemas.microsoft.com/office/word/2010/wordprocessingInk" xmlns:wne="http://schemas.microsoft.com/office/word/2006/wordml" xmlns:wps="http://schemas.microsoft.com/office/word/2010/wordprocessingShape" mc:Ignorable="w14 w15 w16se w16cid w16 w16cex w16sdtdh w16sdtfl w16du wp14">
+  <w:p>
+    <w:pPr>
+      <w:pStyle w:val="Piedepgina"/>
+    </w:pPr>
+  </w:p>
+</w:ftr>
+</file>
+
 <file path=word/footnotes.xml><?xml version="1.0" encoding="utf-8"?>
 <w:footnotes xmlns:wpc="http://schemas.microsoft.com/office/word/2010/wordprocessingCanvas" xmlns:cx="http://schemas.microsoft.com/office/drawing/2014/chartex" xmlns:cx1="http://schemas.microsoft.com/office/drawing/2015/9/8/chartex" xmlns:cx2="http://schemas.microsoft.com/office/drawing/2015/10/21/chartex" xmlns:cx3="http://schemas.microsoft.com/office/drawing/2016/5/9/chartex" xmlns:cx4="http://schemas.microsoft.com/office/drawing/2016/5/10/chartex" xmlns:cx5="http://schemas.microsoft.com/office/drawing/2016/5/11/chartex" xmlns:cx6="http://schemas.microsoft.com/office/drawing/2016/5/12/chartex" xmlns:cx7="http://schemas.microsoft.com/office/drawing/2016/5/13/chartex" xmlns:cx8="http://schemas.microsoft.com/office/drawing/2016/5/14/chartex" xmlns:mc="http://schemas.openxmlformats.org/markup-compatibility/2006" xmlns:aink="http://schemas.microsoft.com/office/drawing/2016/ink" xmlns:am3d="http://schemas.microsoft.com/office/drawing/2017/model3d" xmlns:o="urn:schemas-microsoft-com:office:office" xmlns:oel="http://schemas.microsoft.com/office/2019/extlst" xmlns:r="http://schemas.openxmlformats.org/officeDocument/2006/relationships" xmlns:m="http://schemas.openxmlformats.org/officeDocument/2006/math" xmlns:v="urn:schemas-microsoft-com:vml" xmlns:wp14="http://schemas.microsoft.com/office/word/2010/wordprocessingDrawing" xmlns:wp="http://schemas.openxmlformats.org/drawingml/2006/wordprocessingDrawing" xmlns:w10="urn:schemas-microsoft-com:office:word" xmlns:w="http://schemas.openxmlformats.org/wordprocessingml/2006/main" xmlns:w14="http://schemas.microsoft.com/office/word/2010/wordml" xmlns:w15="http://schemas.microsoft.com/office/word/2012/wordml" xmlns:w16cex="http://schemas.microsoft.com/office/word/2018/wordml/cex" xmlns:w16cid="http://schemas.microsoft.com/office/word/2016/wordml/cid" xmlns:w16="http://schemas.microsoft.com/office/word/2018/wordml" xmlns:w16du="http://schemas.microsoft.com/office/word/2023/wordml/word16du" xmlns:w16sdtdh="http://schemas.microsoft.com/office/word/2020/wordml/sdtdatahash" xmlns:w16sdtfl="http://schemas.microsoft.com/office/word/2024/wordml/sdtformatlock" xmlns:w16se="http://schemas.microsoft.com/office/word/2015/wordml/symex" xmlns:wpg="http://schemas.microsoft.com/office/word/2010/wordprocessingGroup" xmlns:wpi="http://schemas.microsoft.com/office/word/2010/wordprocessingInk" xmlns:wne="http://schemas.microsoft.com/office/word/2006/wordml" xmlns:wps="http://schemas.microsoft.com/office/word/2010/wordprocessingShape" mc:Ignorable="w14 w15 w16se w16cid w16 w16cex w16sdtdh w16sdtfl w16du wp14">
   <w:footnote w:type="separator" w:id="-1">
@@ -2578,6 +1019,16 @@
 
 <file path=word/header1.xml><?xml version="1.0" encoding="utf-8"?>
 <w:hdr xmlns:wpc="http://schemas.microsoft.com/office/word/2010/wordprocessingCanvas" xmlns:cx="http://schemas.microsoft.com/office/drawing/2014/chartex" xmlns:cx1="http://schemas.microsoft.com/office/drawing/2015/9/8/chartex" xmlns:cx2="http://schemas.microsoft.com/office/drawing/2015/10/21/chartex" xmlns:cx3="http://schemas.microsoft.com/office/drawing/2016/5/9/chartex" xmlns:cx4="http://schemas.microsoft.com/office/drawing/2016/5/10/chartex" xmlns:cx5="http://schemas.microsoft.com/office/drawing/2016/5/11/chartex" xmlns:cx6="http://schemas.microsoft.com/office/drawing/2016/5/12/chartex" xmlns:cx7="http://schemas.microsoft.com/office/drawing/2016/5/13/chartex" xmlns:cx8="http://schemas.microsoft.com/office/drawing/2016/5/14/chartex" xmlns:mc="http://schemas.openxmlformats.org/markup-compatibility/2006" xmlns:aink="http://schemas.microsoft.com/office/drawing/2016/ink" xmlns:am3d="http://schemas.microsoft.com/office/drawing/2017/model3d" xmlns:o="urn:schemas-microsoft-com:office:office" xmlns:oel="http://schemas.microsoft.com/office/2019/extlst" xmlns:r="http://schemas.openxmlformats.org/officeDocument/2006/relationships" xmlns:m="http://schemas.openxmlformats.org/officeDocument/2006/math" xmlns:v="urn:schemas-microsoft-com:vml" xmlns:wp14="http://schemas.microsoft.com/office/word/2010/wordprocessingDrawing" xmlns:wp="http://schemas.openxmlformats.org/drawingml/2006/wordprocessingDrawing" xmlns:w10="urn:schemas-microsoft-com:office:word" xmlns:w="http://schemas.openxmlformats.org/wordprocessingml/2006/main" xmlns:w14="http://schemas.microsoft.com/office/word/2010/wordml" xmlns:w15="http://schemas.microsoft.com/office/word/2012/wordml" xmlns:w16cex="http://schemas.microsoft.com/office/word/2018/wordml/cex" xmlns:w16cid="http://schemas.microsoft.com/office/word/2016/wordml/cid" xmlns:w16="http://schemas.microsoft.com/office/word/2018/wordml" xmlns:w16du="http://schemas.microsoft.com/office/word/2023/wordml/word16du" xmlns:w16sdtdh="http://schemas.microsoft.com/office/word/2020/wordml/sdtdatahash" xmlns:w16sdtfl="http://schemas.microsoft.com/office/word/2024/wordml/sdtformatlock" xmlns:w16se="http://schemas.microsoft.com/office/word/2015/wordml/symex" xmlns:wpg="http://schemas.microsoft.com/office/word/2010/wordprocessingGroup" xmlns:wpi="http://schemas.microsoft.com/office/word/2010/wordprocessingInk" xmlns:wne="http://schemas.microsoft.com/office/word/2006/wordml" xmlns:wps="http://schemas.microsoft.com/office/word/2010/wordprocessingShape" mc:Ignorable="w14 w15 w16se w16cid w16 w16cex w16sdtdh w16sdtfl w16du wp14">
+  <w:p>
+    <w:pPr>
+      <w:pStyle w:val="Encabezado"/>
+    </w:pPr>
+  </w:p>
+</w:hdr>
+</file>
+
+<file path=word/header2.xml><?xml version="1.0" encoding="utf-8"?>
+<w:hdr xmlns:wpc="http://schemas.microsoft.com/office/word/2010/wordprocessingCanvas" xmlns:cx="http://schemas.microsoft.com/office/drawing/2014/chartex" xmlns:cx1="http://schemas.microsoft.com/office/drawing/2015/9/8/chartex" xmlns:cx2="http://schemas.microsoft.com/office/drawing/2015/10/21/chartex" xmlns:cx3="http://schemas.microsoft.com/office/drawing/2016/5/9/chartex" xmlns:cx4="http://schemas.microsoft.com/office/drawing/2016/5/10/chartex" xmlns:cx5="http://schemas.microsoft.com/office/drawing/2016/5/11/chartex" xmlns:cx6="http://schemas.microsoft.com/office/drawing/2016/5/12/chartex" xmlns:cx7="http://schemas.microsoft.com/office/drawing/2016/5/13/chartex" xmlns:cx8="http://schemas.microsoft.com/office/drawing/2016/5/14/chartex" xmlns:mc="http://schemas.openxmlformats.org/markup-compatibility/2006" xmlns:aink="http://schemas.microsoft.com/office/drawing/2016/ink" xmlns:am3d="http://schemas.microsoft.com/office/drawing/2017/model3d" xmlns:o="urn:schemas-microsoft-com:office:office" xmlns:oel="http://schemas.microsoft.com/office/2019/extlst" xmlns:r="http://schemas.openxmlformats.org/officeDocument/2006/relationships" xmlns:m="http://schemas.openxmlformats.org/officeDocument/2006/math" xmlns:v="urn:schemas-microsoft-com:vml" xmlns:wp14="http://schemas.microsoft.com/office/word/2010/wordprocessingDrawing" xmlns:wp="http://schemas.openxmlformats.org/drawingml/2006/wordprocessingDrawing" xmlns:w10="urn:schemas-microsoft-com:office:word" xmlns:w="http://schemas.openxmlformats.org/wordprocessingml/2006/main" xmlns:w14="http://schemas.microsoft.com/office/word/2010/wordml" xmlns:w15="http://schemas.microsoft.com/office/word/2012/wordml" xmlns:w16cex="http://schemas.microsoft.com/office/word/2018/wordml/cex" xmlns:w16cid="http://schemas.microsoft.com/office/word/2016/wordml/cid" xmlns:w16="http://schemas.microsoft.com/office/word/2018/wordml" xmlns:w16du="http://schemas.microsoft.com/office/word/2023/wordml/word16du" xmlns:w16sdtdh="http://schemas.microsoft.com/office/word/2020/wordml/sdtdatahash" xmlns:w16sdtfl="http://schemas.microsoft.com/office/word/2024/wordml/sdtformatlock" xmlns:w16se="http://schemas.microsoft.com/office/word/2015/wordml/symex" xmlns:wpg="http://schemas.microsoft.com/office/word/2010/wordprocessingGroup" xmlns:wpi="http://schemas.microsoft.com/office/word/2010/wordprocessingInk" xmlns:wne="http://schemas.microsoft.com/office/word/2006/wordml" xmlns:wps="http://schemas.microsoft.com/office/word/2010/wordprocessingShape" mc:Ignorable="w14 w15 w16se w16cid w16 w16cex w16sdtdh w16sdtfl w16du wp14">
   <w:tbl>
     <w:tblPr>
       <w:tblStyle w:val="Tablaconcuadrcula"/>
@@ -2593,8 +1044,8 @@
       <w:tblLook w:val="04A0" w:firstRow="1" w:lastRow="0" w:firstColumn="1" w:lastColumn="0" w:noHBand="0" w:noVBand="1"/>
     </w:tblPr>
     <w:tblGrid>
-      <w:gridCol w:w="8223"/>
-      <w:gridCol w:w="2256"/>
+      <w:gridCol w:w="8217"/>
+      <w:gridCol w:w="2262"/>
     </w:tblGrid>
     <w:tr>
       <w:trPr>
@@ -2607,8 +1058,16 @@
         <w:p>
           <w:pPr>
             <w:pStyle w:val="Ttulo2"/>
+            <w:rPr>
+              <w:sz w:val="44"/>
+              <w:szCs w:val="44"/>
+            </w:rPr>
           </w:pPr>
           <w:r>
+            <w:rPr>
+              <w:sz w:val="44"/>
+              <w:szCs w:val="44"/>
+            </w:rPr>
             <w:t>Ignacio Pérez</w:t>
           </w:r>
         </w:p>
@@ -2616,46 +1075,19 @@
           <w:pPr>
             <w:pStyle w:val="Ttulo4"/>
           </w:pPr>
-          <w:proofErr w:type="spellStart"/>
           <w:r>
-            <w:t>Electrical</w:t>
+            <w:t>Electrical engineer</w:t>
           </w:r>
-          <w:proofErr w:type="spellEnd"/>
-          <w:r>
-            <w:t xml:space="preserve"> </w:t>
-          </w:r>
-          <w:proofErr w:type="spellStart"/>
-          <w:r>
-            <w:t>engineer</w:t>
-          </w:r>
-          <w:proofErr w:type="spellEnd"/>
           <w:r>
             <w:tab/>
           </w:r>
         </w:p>
         <w:p>
-          <w:pPr>
-            <w:pStyle w:val="Subttulo"/>
-            <w:spacing w:line="276" w:lineRule="auto"/>
-          </w:pPr>
           <w:r>
             <w:t xml:space="preserve">| </w:t>
           </w:r>
-          <w:proofErr w:type="spellStart"/>
           <w:r>
-            <w:t>Pfeilgasse</w:t>
-          </w:r>
-          <w:proofErr w:type="spellEnd"/>
-          <w:r>
-            <w:t xml:space="preserve"> 3a, </w:t>
-          </w:r>
-          <w:proofErr w:type="spellStart"/>
-          <w:r>
-            <w:t>Vienna</w:t>
-          </w:r>
-          <w:proofErr w:type="spellEnd"/>
-          <w:r>
-            <w:t xml:space="preserve"> | +43 664 99470941 |</w:t>
+            <w:t>Pfeilgasse 3a, Vienna | +43 664 99470941 |</w:t>
           </w:r>
           <w:r>
             <w:t xml:space="preserve"> </w:t>
@@ -2677,9 +1109,6 @@
           </w:r>
         </w:p>
         <w:p>
-          <w:pPr>
-            <w:pStyle w:val="Subttulo"/>
-          </w:pPr>
           <w:r>
             <w:t xml:space="preserve">| </w:t>
           </w:r>
@@ -2758,9 +1187,9 @@
               <w:noProof/>
             </w:rPr>
             <w:drawing>
-              <wp:inline distT="0" distB="0" distL="0" distR="0" wp14:anchorId="63B46D09" wp14:editId="485094F3">
+              <wp:inline distT="0" distB="0" distL="0" distR="0" wp14:anchorId="63B46D09" wp14:editId="18803AB3">
                 <wp:extent cx="1294108" cy="1294108"/>
-                <wp:effectExtent l="0" t="0" r="1905" b="1905"/>
+                <wp:effectExtent l="0" t="0" r="5715" b="5715"/>
                 <wp:docPr id="134221174" name="Imagen 2"/>
                 <wp:cNvGraphicFramePr>
                   <a:graphicFrameLocks xmlns:a="http://schemas.openxmlformats.org/drawingml/2006/main" noChangeAspect="1"/>
@@ -2787,7 +1216,7 @@
                       <pic:spPr>
                         <a:xfrm>
                           <a:off x="0" y="0"/>
-                          <a:ext cx="1316090" cy="1316090"/>
+                          <a:ext cx="1294108" cy="1294108"/>
                         </a:xfrm>
                         <a:prstGeom prst="rect">
                           <a:avLst/>
@@ -2804,6 +1233,16 @@
     </w:tr>
   </w:tbl>
   <w:p/>
+</w:hdr>
+</file>
+
+<file path=word/header3.xml><?xml version="1.0" encoding="utf-8"?>
+<w:hdr xmlns:wpc="http://schemas.microsoft.com/office/word/2010/wordprocessingCanvas" xmlns:cx="http://schemas.microsoft.com/office/drawing/2014/chartex" xmlns:cx1="http://schemas.microsoft.com/office/drawing/2015/9/8/chartex" xmlns:cx2="http://schemas.microsoft.com/office/drawing/2015/10/21/chartex" xmlns:cx3="http://schemas.microsoft.com/office/drawing/2016/5/9/chartex" xmlns:cx4="http://schemas.microsoft.com/office/drawing/2016/5/10/chartex" xmlns:cx5="http://schemas.microsoft.com/office/drawing/2016/5/11/chartex" xmlns:cx6="http://schemas.microsoft.com/office/drawing/2016/5/12/chartex" xmlns:cx7="http://schemas.microsoft.com/office/drawing/2016/5/13/chartex" xmlns:cx8="http://schemas.microsoft.com/office/drawing/2016/5/14/chartex" xmlns:mc="http://schemas.openxmlformats.org/markup-compatibility/2006" xmlns:aink="http://schemas.microsoft.com/office/drawing/2016/ink" xmlns:am3d="http://schemas.microsoft.com/office/drawing/2017/model3d" xmlns:o="urn:schemas-microsoft-com:office:office" xmlns:oel="http://schemas.microsoft.com/office/2019/extlst" xmlns:r="http://schemas.openxmlformats.org/officeDocument/2006/relationships" xmlns:m="http://schemas.openxmlformats.org/officeDocument/2006/math" xmlns:v="urn:schemas-microsoft-com:vml" xmlns:wp14="http://schemas.microsoft.com/office/word/2010/wordprocessingDrawing" xmlns:wp="http://schemas.openxmlformats.org/drawingml/2006/wordprocessingDrawing" xmlns:w10="urn:schemas-microsoft-com:office:word" xmlns:w="http://schemas.openxmlformats.org/wordprocessingml/2006/main" xmlns:w14="http://schemas.microsoft.com/office/word/2010/wordml" xmlns:w15="http://schemas.microsoft.com/office/word/2012/wordml" xmlns:w16cex="http://schemas.microsoft.com/office/word/2018/wordml/cex" xmlns:w16cid="http://schemas.microsoft.com/office/word/2016/wordml/cid" xmlns:w16="http://schemas.microsoft.com/office/word/2018/wordml" xmlns:w16du="http://schemas.microsoft.com/office/word/2023/wordml/word16du" xmlns:w16sdtdh="http://schemas.microsoft.com/office/word/2020/wordml/sdtdatahash" xmlns:w16sdtfl="http://schemas.microsoft.com/office/word/2024/wordml/sdtformatlock" xmlns:w16se="http://schemas.microsoft.com/office/word/2015/wordml/symex" xmlns:wpg="http://schemas.microsoft.com/office/word/2010/wordprocessingGroup" xmlns:wpi="http://schemas.microsoft.com/office/word/2010/wordprocessingInk" xmlns:wne="http://schemas.microsoft.com/office/word/2006/wordml" xmlns:wps="http://schemas.microsoft.com/office/word/2010/wordprocessingShape" mc:Ignorable="w14 w15 w16se w16cid w16 w16cex w16sdtdh w16sdtfl w16du wp14">
+  <w:p>
+    <w:pPr>
+      <w:pStyle w:val="Encabezado"/>
+    </w:pPr>
+  </w:p>
 </w:hdr>
 </file>
 

</xml_diff>

<commit_message>
Deploying to gh-pages from @ ignacioperezrjs/ignacioperezrjs.github.io@7f9e5365a832183e0bb6f3fb94646dc9ee2598b3 🚀
</commit_message>
<xml_diff>
--- a/assets/pdf/Ignacio_Perez_cv.docx
+++ b/assets/pdf/Ignacio_Perez_cv.docx
@@ -60,153 +60,38 @@
             </w:tcBorders>
           </w:tcPr>
           <w:p>
-            <w:proofErr w:type="spellStart"/>
             <w:r>
               <w:t>Rigorous</w:t>
             </w:r>
-            <w:proofErr w:type="spellEnd"/>
-            <w:r>
-              <w:t xml:space="preserve"> and </w:t>
-            </w:r>
-            <w:proofErr w:type="spellStart"/>
-            <w:r>
-              <w:t>versatile</w:t>
-            </w:r>
-            <w:proofErr w:type="spellEnd"/>
+            <w:r>
+              <w:t xml:space="preserve"> and versatile</w:t>
+            </w:r>
             <w:r>
               <w:t xml:space="preserve"> </w:t>
             </w:r>
-            <w:proofErr w:type="spellStart"/>
-            <w:r>
-              <w:t>Electrical</w:t>
-            </w:r>
-            <w:proofErr w:type="spellEnd"/>
+            <w:r>
+              <w:t>Electrical Engineer. Skilled in technical documentation, CAD</w:t>
+            </w:r>
             <w:r>
               <w:t xml:space="preserve"> </w:t>
             </w:r>
-            <w:proofErr w:type="spellStart"/>
-            <w:r>
-              <w:t>Engineer</w:t>
-            </w:r>
-            <w:proofErr w:type="spellEnd"/>
-            <w:r>
-              <w:t xml:space="preserve">. </w:t>
-            </w:r>
-            <w:proofErr w:type="spellStart"/>
-            <w:r>
-              <w:t>Skilled</w:t>
-            </w:r>
-            <w:proofErr w:type="spellEnd"/>
-            <w:r>
-              <w:t xml:space="preserve"> in </w:t>
-            </w:r>
-            <w:proofErr w:type="spellStart"/>
-            <w:r>
-              <w:t>technical</w:t>
-            </w:r>
-            <w:proofErr w:type="spellEnd"/>
-            <w:r>
-              <w:t xml:space="preserve"> </w:t>
-            </w:r>
-            <w:proofErr w:type="spellStart"/>
-            <w:r>
-              <w:t>documentation</w:t>
-            </w:r>
-            <w:proofErr w:type="spellEnd"/>
-            <w:r>
-              <w:t>, CAD</w:t>
-            </w:r>
-            <w:r>
-              <w:t xml:space="preserve"> </w:t>
-            </w:r>
-            <w:proofErr w:type="spellStart"/>
-            <w:r>
-              <w:t>based</w:t>
-            </w:r>
-            <w:proofErr w:type="spellEnd"/>
-            <w:r>
-              <w:t xml:space="preserve"> </w:t>
-            </w:r>
-            <w:proofErr w:type="spellStart"/>
-            <w:r>
-              <w:t>design</w:t>
-            </w:r>
-            <w:proofErr w:type="spellEnd"/>
-            <w:r>
-              <w:t xml:space="preserve">, </w:t>
-            </w:r>
-            <w:proofErr w:type="spellStart"/>
-            <w:r>
-              <w:t>network</w:t>
-            </w:r>
-            <w:proofErr w:type="spellEnd"/>
-            <w:r>
-              <w:t xml:space="preserve"> </w:t>
-            </w:r>
-            <w:proofErr w:type="spellStart"/>
-            <w:r>
-              <w:t>infrastructure</w:t>
-            </w:r>
-            <w:proofErr w:type="spellEnd"/>
-            <w:r>
-              <w:t xml:space="preserve">, and </w:t>
-            </w:r>
-            <w:proofErr w:type="spellStart"/>
-            <w:r>
-              <w:t>project</w:t>
-            </w:r>
-            <w:proofErr w:type="spellEnd"/>
-            <w:r>
-              <w:t xml:space="preserve"> </w:t>
-            </w:r>
-            <w:proofErr w:type="spellStart"/>
-            <w:r>
-              <w:t>coordination</w:t>
-            </w:r>
-            <w:proofErr w:type="spellEnd"/>
-            <w:r>
-              <w:t xml:space="preserve">. </w:t>
-            </w:r>
-            <w:r>
-              <w:t xml:space="preserve">Proactive and </w:t>
-            </w:r>
-            <w:proofErr w:type="spellStart"/>
-            <w:r>
-              <w:t>s</w:t>
-            </w:r>
-            <w:r>
-              <w:t>trong</w:t>
-            </w:r>
-            <w:proofErr w:type="spellEnd"/>
-            <w:r>
-              <w:t xml:space="preserve"> </w:t>
+            <w:r>
+              <w:t xml:space="preserve">based design, network infrastructure, and project coordination. </w:t>
+            </w:r>
+            <w:r>
+              <w:t>Proactive and s</w:t>
+            </w:r>
+            <w:r>
+              <w:t xml:space="preserve">trong </w:t>
             </w:r>
             <w:r>
               <w:t xml:space="preserve">interpersonal </w:t>
             </w:r>
-            <w:proofErr w:type="spellStart"/>
             <w:r>
               <w:t>abilities</w:t>
             </w:r>
-            <w:proofErr w:type="spellEnd"/>
-            <w:r>
-              <w:t xml:space="preserve"> </w:t>
-            </w:r>
-            <w:proofErr w:type="spellStart"/>
-            <w:r>
-              <w:t>with</w:t>
-            </w:r>
-            <w:proofErr w:type="spellEnd"/>
-            <w:r>
-              <w:t xml:space="preserve"> </w:t>
-            </w:r>
-            <w:proofErr w:type="spellStart"/>
-            <w:r>
-              <w:t>experience</w:t>
-            </w:r>
-            <w:proofErr w:type="spellEnd"/>
-            <w:r>
-              <w:t xml:space="preserve"> </w:t>
+            <w:r>
+              <w:t xml:space="preserve"> with experience </w:t>
             </w:r>
             <w:r>
               <w:t xml:space="preserve">in </w:t>
@@ -214,93 +99,14 @@
             <w:r>
               <w:t xml:space="preserve">multicultural </w:t>
             </w:r>
-            <w:proofErr w:type="spellStart"/>
-            <w:r>
-              <w:t>teams</w:t>
-            </w:r>
-            <w:proofErr w:type="spellEnd"/>
-            <w:r>
-              <w:t xml:space="preserve">, </w:t>
-            </w:r>
-            <w:proofErr w:type="spellStart"/>
-            <w:r>
-              <w:t>ensuring</w:t>
-            </w:r>
-            <w:proofErr w:type="spellEnd"/>
-            <w:r>
-              <w:t xml:space="preserve"> </w:t>
-            </w:r>
-            <w:proofErr w:type="spellStart"/>
-            <w:r>
-              <w:t>smooth</w:t>
-            </w:r>
-            <w:proofErr w:type="spellEnd"/>
-            <w:r>
-              <w:t xml:space="preserve"> </w:t>
-            </w:r>
-            <w:proofErr w:type="spellStart"/>
-            <w:r>
-              <w:t>system</w:t>
-            </w:r>
-            <w:proofErr w:type="spellEnd"/>
-            <w:r>
-              <w:t xml:space="preserve"> </w:t>
-            </w:r>
-            <w:proofErr w:type="spellStart"/>
-            <w:r>
-              <w:t>deployment</w:t>
-            </w:r>
-            <w:proofErr w:type="spellEnd"/>
-            <w:r>
-              <w:t xml:space="preserve"> and </w:t>
-            </w:r>
-            <w:proofErr w:type="spellStart"/>
-            <w:r>
-              <w:t>delivery</w:t>
-            </w:r>
-            <w:proofErr w:type="spellEnd"/>
-            <w:r>
-              <w:t xml:space="preserve">. </w:t>
-            </w:r>
-            <w:proofErr w:type="spellStart"/>
-            <w:r>
-              <w:t>Fluent</w:t>
-            </w:r>
-            <w:proofErr w:type="spellEnd"/>
-            <w:r>
-              <w:t xml:space="preserve"> in English (C1) and </w:t>
-            </w:r>
-            <w:proofErr w:type="spellStart"/>
-            <w:r>
-              <w:t>actively</w:t>
-            </w:r>
-            <w:proofErr w:type="spellEnd"/>
-            <w:r>
-              <w:t xml:space="preserve"> </w:t>
-            </w:r>
-            <w:proofErr w:type="spellStart"/>
-            <w:r>
-              <w:t>improving</w:t>
-            </w:r>
-            <w:proofErr w:type="spellEnd"/>
-            <w:r>
-              <w:t xml:space="preserve"> German. More </w:t>
-            </w:r>
-            <w:proofErr w:type="spellStart"/>
-            <w:r>
-              <w:t>information</w:t>
-            </w:r>
-            <w:proofErr w:type="spellEnd"/>
-            <w:r>
-              <w:t xml:space="preserve"> in </w:t>
-            </w:r>
-            <w:proofErr w:type="spellStart"/>
-            <w:r>
-              <w:t>my</w:t>
-            </w:r>
-            <w:proofErr w:type="spellEnd"/>
-            <w:r>
-              <w:t xml:space="preserve"> </w:t>
+            <w:r>
+              <w:t xml:space="preserve">teams, ensuring smooth system deployment and delivery. Fluent in English (C1) and actively improving German. More information </w:t>
+            </w:r>
+            <w:r>
+              <w:t>o</w:t>
+            </w:r>
+            <w:r>
+              <w:t xml:space="preserve">n my </w:t>
             </w:r>
             <w:hyperlink r:id="rId7" w:history="1">
               <w:r>
@@ -308,35 +114,11 @@
               </w:r>
             </w:hyperlink>
             <w:r>
-              <w:t xml:space="preserve"> </w:t>
-            </w:r>
-            <w:proofErr w:type="spellStart"/>
-            <w:r>
-              <w:t>or</w:t>
-            </w:r>
-            <w:proofErr w:type="spellEnd"/>
-            <w:r>
-              <w:t xml:space="preserve"> </w:t>
-            </w:r>
-            <w:proofErr w:type="spellStart"/>
-            <w:r>
-              <w:t>my</w:t>
-            </w:r>
-            <w:proofErr w:type="spellEnd"/>
-            <w:r>
-              <w:t xml:space="preserve"> </w:t>
+              <w:t xml:space="preserve"> or my </w:t>
             </w:r>
             <w:hyperlink r:id="rId8" w:history="1">
               <w:r>
-                <w:t xml:space="preserve">personal </w:t>
-              </w:r>
-              <w:proofErr w:type="spellStart"/>
-              <w:r>
-                <w:t>website</w:t>
-              </w:r>
-              <w:proofErr w:type="spellEnd"/>
-              <w:r>
-                <w:t>!</w:t>
+                <w:t>personal website!</w:t>
               </w:r>
             </w:hyperlink>
           </w:p>
@@ -376,47 +158,13 @@
               <w:pStyle w:val="Ttulo4"/>
             </w:pPr>
             <w:hyperlink r:id="rId9" w:history="1">
-              <w:proofErr w:type="spellStart"/>
               <w:r>
                 <w:rPr>
                   <w:color w:val="1E1E1E"/>
                   <w:u w:val="single"/>
                 </w:rPr>
-                <w:t>Automation</w:t>
+                <w:t>Automation &amp; Control Systems Intern</w:t>
               </w:r>
-              <w:proofErr w:type="spellEnd"/>
-              <w:r>
-                <w:rPr>
-                  <w:color w:val="1E1E1E"/>
-                  <w:u w:val="single"/>
-                </w:rPr>
-                <w:t xml:space="preserve"> &amp; Control </w:t>
-              </w:r>
-              <w:proofErr w:type="spellStart"/>
-              <w:r>
-                <w:rPr>
-                  <w:color w:val="1E1E1E"/>
-                  <w:u w:val="single"/>
-                </w:rPr>
-                <w:t>Systems</w:t>
-              </w:r>
-              <w:proofErr w:type="spellEnd"/>
-              <w:r>
-                <w:rPr>
-                  <w:color w:val="1E1E1E"/>
-                  <w:u w:val="single"/>
-                </w:rPr>
-                <w:t xml:space="preserve"> </w:t>
-              </w:r>
-              <w:proofErr w:type="spellStart"/>
-              <w:r>
-                <w:rPr>
-                  <w:color w:val="1E1E1E"/>
-                  <w:u w:val="single"/>
-                </w:rPr>
-                <w:t>Intern</w:t>
-              </w:r>
-              <w:proofErr w:type="spellEnd"/>
             </w:hyperlink>
             <w:r>
               <w:rPr>
@@ -444,17 +192,8 @@
                   <w:color w:val="1E1E1E"/>
                   <w:u w:val="single"/>
                 </w:rPr>
-                <w:t xml:space="preserve">LKE </w:t>
+                <w:t>LKE SpA</w:t>
               </w:r>
-              <w:proofErr w:type="spellStart"/>
-              <w:r>
-                <w:rPr>
-                  <w:color w:val="1E1E1E"/>
-                  <w:u w:val="single"/>
-                </w:rPr>
-                <w:t>SpA</w:t>
-              </w:r>
-              <w:proofErr w:type="spellEnd"/>
             </w:hyperlink>
             <w:r>
               <w:tab/>
@@ -474,13 +213,8 @@
               <w:pStyle w:val="Ttulo4"/>
             </w:pPr>
             <w:r>
-              <w:t xml:space="preserve">Nov 2024 - </w:t>
-            </w:r>
-            <w:proofErr w:type="spellStart"/>
-            <w:r>
-              <w:t>Present</w:t>
-            </w:r>
-            <w:proofErr w:type="spellEnd"/>
+              <w:t>Nov 2024 - Present</w:t>
+            </w:r>
           </w:p>
         </w:tc>
       </w:tr>
@@ -501,133 +235,11 @@
                 <w:color w:val="auto"/>
               </w:rPr>
             </w:pPr>
-            <w:proofErr w:type="spellStart"/>
-            <w:r>
-              <w:t>Implemented</w:t>
-            </w:r>
-            <w:proofErr w:type="spellEnd"/>
-            <w:r>
-              <w:t xml:space="preserve"> </w:t>
-            </w:r>
-            <w:proofErr w:type="spellStart"/>
-            <w:r>
-              <w:t>telemetry</w:t>
-            </w:r>
-            <w:proofErr w:type="spellEnd"/>
-            <w:r>
-              <w:t xml:space="preserve"> </w:t>
-            </w:r>
-            <w:proofErr w:type="spellStart"/>
-            <w:r>
-              <w:t>for</w:t>
-            </w:r>
-            <w:proofErr w:type="spellEnd"/>
-            <w:r>
-              <w:t xml:space="preserve"> a remote </w:t>
-            </w:r>
-            <w:proofErr w:type="spellStart"/>
-            <w:r>
-              <w:t>power</w:t>
-            </w:r>
-            <w:proofErr w:type="spellEnd"/>
-            <w:r>
-              <w:t xml:space="preserve"> </w:t>
-            </w:r>
-            <w:proofErr w:type="spellStart"/>
-            <w:r>
-              <w:t>transmission</w:t>
-            </w:r>
-            <w:proofErr w:type="spellEnd"/>
-            <w:r>
-              <w:t xml:space="preserve"> </w:t>
-            </w:r>
-            <w:proofErr w:type="spellStart"/>
-            <w:r>
-              <w:t>system</w:t>
-            </w:r>
-            <w:proofErr w:type="spellEnd"/>
-            <w:r>
-              <w:t xml:space="preserve">, </w:t>
-            </w:r>
-            <w:proofErr w:type="spellStart"/>
-            <w:r>
-              <w:t>enabling</w:t>
-            </w:r>
-            <w:proofErr w:type="spellEnd"/>
-            <w:r>
-              <w:t xml:space="preserve"> real-time </w:t>
-            </w:r>
-            <w:proofErr w:type="spellStart"/>
-            <w:r>
-              <w:t>monitoring</w:t>
-            </w:r>
-            <w:proofErr w:type="spellEnd"/>
-            <w:r>
-              <w:t xml:space="preserve"> </w:t>
-            </w:r>
-            <w:proofErr w:type="spellStart"/>
-            <w:r>
-              <w:t>of</w:t>
-            </w:r>
-            <w:proofErr w:type="spellEnd"/>
-            <w:r>
-              <w:t xml:space="preserve"> </w:t>
-            </w:r>
-            <w:proofErr w:type="spellStart"/>
-            <w:r>
-              <w:t>an</w:t>
-            </w:r>
-            <w:proofErr w:type="spellEnd"/>
-            <w:r>
-              <w:t xml:space="preserve"> </w:t>
-            </w:r>
-            <w:proofErr w:type="spellStart"/>
-            <w:r>
-              <w:t>induction</w:t>
-            </w:r>
-            <w:proofErr w:type="spellEnd"/>
-            <w:r>
-              <w:t xml:space="preserve"> </w:t>
-            </w:r>
-            <w:proofErr w:type="spellStart"/>
-            <w:r>
-              <w:t>heating</w:t>
-            </w:r>
-            <w:proofErr w:type="spellEnd"/>
-            <w:r>
-              <w:t xml:space="preserve"> machine </w:t>
-            </w:r>
-            <w:proofErr w:type="spellStart"/>
-            <w:r>
-              <w:t>for</w:t>
-            </w:r>
-            <w:proofErr w:type="spellEnd"/>
-            <w:r>
-              <w:t xml:space="preserve"> metal </w:t>
-            </w:r>
-            <w:proofErr w:type="spellStart"/>
-            <w:r>
-              <w:t>spears</w:t>
-            </w:r>
-            <w:proofErr w:type="spellEnd"/>
-            <w:r>
-              <w:t xml:space="preserve"> in </w:t>
-            </w:r>
-            <w:proofErr w:type="spellStart"/>
-            <w:r>
-              <w:t>flame</w:t>
-            </w:r>
-            <w:proofErr w:type="spellEnd"/>
-            <w:r>
-              <w:t xml:space="preserve"> </w:t>
-            </w:r>
-            <w:proofErr w:type="spellStart"/>
-            <w:r>
-              <w:t>cutting</w:t>
-            </w:r>
-            <w:proofErr w:type="spellEnd"/>
-            <w:r>
-              <w:t>.</w:t>
+            <w:r>
+              <w:t xml:space="preserve">Implemented telemetry for a remote power transmission system, enabling real-time monitoring of an induction heating machine for metal spears in </w:t>
+            </w:r>
+            <w:r>
+              <w:t>flame cutting.</w:t>
             </w:r>
           </w:p>
           <w:p>
@@ -641,93 +253,8 @@
                 <w:color w:val="auto"/>
               </w:rPr>
             </w:pPr>
-            <w:proofErr w:type="spellStart"/>
-            <w:r>
-              <w:t>Assisted</w:t>
-            </w:r>
-            <w:proofErr w:type="spellEnd"/>
-            <w:r>
-              <w:t xml:space="preserve"> in hardware </w:t>
-            </w:r>
-            <w:proofErr w:type="spellStart"/>
-            <w:r>
-              <w:t>selection</w:t>
-            </w:r>
-            <w:proofErr w:type="spellEnd"/>
-            <w:r>
-              <w:t xml:space="preserve"> (</w:t>
-            </w:r>
-            <w:proofErr w:type="spellStart"/>
-            <w:r>
-              <w:t>PLCs</w:t>
-            </w:r>
-            <w:proofErr w:type="spellEnd"/>
-            <w:r>
-              <w:t xml:space="preserve">, </w:t>
-            </w:r>
-            <w:proofErr w:type="spellStart"/>
-            <w:r>
-              <w:t>sensors</w:t>
-            </w:r>
-            <w:proofErr w:type="spellEnd"/>
-            <w:r>
-              <w:t xml:space="preserve">, </w:t>
-            </w:r>
-            <w:proofErr w:type="spellStart"/>
-            <w:r>
-              <w:t>network</w:t>
-            </w:r>
-            <w:proofErr w:type="spellEnd"/>
-            <w:r>
-              <w:t xml:space="preserve"> </w:t>
-            </w:r>
-            <w:proofErr w:type="spellStart"/>
-            <w:r>
-              <w:t>devices</w:t>
-            </w:r>
-            <w:proofErr w:type="spellEnd"/>
-            <w:r>
-              <w:t xml:space="preserve">), </w:t>
-            </w:r>
-            <w:proofErr w:type="spellStart"/>
-            <w:r>
-              <w:t>ensuring</w:t>
-            </w:r>
-            <w:proofErr w:type="spellEnd"/>
-            <w:r>
-              <w:t xml:space="preserve"> </w:t>
-            </w:r>
-            <w:proofErr w:type="spellStart"/>
-            <w:r>
-              <w:t>compliance</w:t>
-            </w:r>
-            <w:proofErr w:type="spellEnd"/>
-            <w:r>
-              <w:t xml:space="preserve"> </w:t>
-            </w:r>
-            <w:proofErr w:type="spellStart"/>
-            <w:r>
-              <w:t>with</w:t>
-            </w:r>
-            <w:proofErr w:type="spellEnd"/>
-            <w:r>
-              <w:t xml:space="preserve"> </w:t>
-            </w:r>
-            <w:proofErr w:type="spellStart"/>
-            <w:r>
-              <w:t>electrical</w:t>
-            </w:r>
-            <w:proofErr w:type="spellEnd"/>
-            <w:r>
-              <w:t xml:space="preserve"> safety </w:t>
-            </w:r>
-            <w:proofErr w:type="spellStart"/>
-            <w:r>
-              <w:t>standards</w:t>
-            </w:r>
-            <w:proofErr w:type="spellEnd"/>
-            <w:r>
-              <w:t>.</w:t>
+            <w:r>
+              <w:t>Assisted in hardware selection (PLCs, sensors, network devices), ensuring compliance with electrical safety standards.</w:t>
             </w:r>
           </w:p>
           <w:p>
@@ -738,126 +265,32 @@
                 <w:numId w:val="8"/>
               </w:numPr>
             </w:pPr>
-            <w:proofErr w:type="spellStart"/>
-            <w:r>
-              <w:t>Managed</w:t>
-            </w:r>
-            <w:proofErr w:type="spellEnd"/>
-            <w:r>
-              <w:t xml:space="preserve"> and </w:t>
-            </w:r>
-            <w:proofErr w:type="spellStart"/>
-            <w:r>
-              <w:t>optimi</w:t>
+            <w:r>
+              <w:t>Managed and optimi</w:t>
             </w:r>
             <w:r>
               <w:t>s</w:t>
             </w:r>
             <w:r>
-              <w:t>ed</w:t>
-            </w:r>
-            <w:proofErr w:type="spellEnd"/>
+              <w:t>ed the</w:t>
+            </w:r>
             <w:r>
               <w:t xml:space="preserve"> </w:t>
             </w:r>
-            <w:proofErr w:type="spellStart"/>
-            <w:r>
-              <w:t>the</w:t>
-            </w:r>
-            <w:proofErr w:type="spellEnd"/>
-            <w:r>
-              <w:t xml:space="preserve"> </w:t>
-            </w:r>
-            <w:proofErr w:type="spellStart"/>
             <w:r>
               <w:t>company</w:t>
             </w:r>
-            <w:proofErr w:type="spellEnd"/>
-            <w:r>
-              <w:t xml:space="preserve"> </w:t>
-            </w:r>
-            <w:proofErr w:type="spellStart"/>
-            <w:r>
-              <w:t>database</w:t>
-            </w:r>
-            <w:proofErr w:type="spellEnd"/>
-            <w:r>
-              <w:t xml:space="preserve"> </w:t>
-            </w:r>
-            <w:proofErr w:type="spellStart"/>
-            <w:r>
-              <w:t>structure</w:t>
-            </w:r>
-            <w:proofErr w:type="spellEnd"/>
-            <w:r>
-              <w:t xml:space="preserve">, </w:t>
-            </w:r>
-            <w:proofErr w:type="spellStart"/>
-            <w:r>
-              <w:t>utilizing</w:t>
-            </w:r>
-            <w:proofErr w:type="spellEnd"/>
-            <w:r>
-              <w:t xml:space="preserve"> </w:t>
+            <w:r>
+              <w:t xml:space="preserve"> database structure, </w:t>
+            </w:r>
+            <w:r>
+              <w:t xml:space="preserve">using </w:t>
             </w:r>
             <w:r>
               <w:t xml:space="preserve">Microsoft </w:t>
             </w:r>
-            <w:proofErr w:type="spellStart"/>
-            <w:r>
-              <w:t>Teams</w:t>
-            </w:r>
-            <w:proofErr w:type="spellEnd"/>
-            <w:r>
-              <w:t xml:space="preserve">, SharePoint, Excel, Word, and </w:t>
-            </w:r>
-            <w:proofErr w:type="spellStart"/>
-            <w:r>
-              <w:t>permissions</w:t>
-            </w:r>
-            <w:proofErr w:type="spellEnd"/>
-            <w:r>
-              <w:t xml:space="preserve"> </w:t>
-            </w:r>
-            <w:proofErr w:type="spellStart"/>
-            <w:r>
-              <w:t>management</w:t>
-            </w:r>
-            <w:proofErr w:type="spellEnd"/>
-            <w:r>
-              <w:t xml:space="preserve"> </w:t>
-            </w:r>
-            <w:proofErr w:type="spellStart"/>
-            <w:r>
-              <w:t>to</w:t>
-            </w:r>
-            <w:proofErr w:type="spellEnd"/>
-            <w:r>
-              <w:t xml:space="preserve"> </w:t>
-            </w:r>
-            <w:proofErr w:type="spellStart"/>
-            <w:r>
-              <w:t>enhance</w:t>
-            </w:r>
-            <w:proofErr w:type="spellEnd"/>
-            <w:r>
-              <w:t xml:space="preserve"> </w:t>
-            </w:r>
-            <w:proofErr w:type="spellStart"/>
-            <w:r>
-              <w:t>collaboration</w:t>
-            </w:r>
-            <w:proofErr w:type="spellEnd"/>
-            <w:r>
-              <w:t xml:space="preserve"> and data </w:t>
-            </w:r>
-            <w:proofErr w:type="spellStart"/>
-            <w:r>
-              <w:t>security</w:t>
-            </w:r>
-            <w:proofErr w:type="spellEnd"/>
-            <w:r>
-              <w:t>.</w:t>
+            <w:r>
+              <w:t>Teams, SharePoint, Excel, Word, and permissions management to enhance collaboration and data security.</w:t>
             </w:r>
           </w:p>
           <w:p/>
@@ -874,19 +307,9 @@
               <w:pStyle w:val="Ttulo4"/>
             </w:pPr>
             <w:hyperlink r:id="rId11" w:history="1">
-              <w:proofErr w:type="spellStart"/>
               <w:r>
-                <w:t>Intern</w:t>
+                <w:t>Intern - Project Management Office, CISC SpA</w:t>
               </w:r>
-              <w:proofErr w:type="spellEnd"/>
-              <w:r>
-                <w:t xml:space="preserve"> - Project Management Office, CISC </w:t>
-              </w:r>
-              <w:proofErr w:type="spellStart"/>
-              <w:r>
-                <w:t>SpA</w:t>
-              </w:r>
-              <w:proofErr w:type="spellEnd"/>
             </w:hyperlink>
           </w:p>
         </w:tc>
@@ -899,13 +322,8 @@
             <w:pPr>
               <w:pStyle w:val="Ttulo4"/>
             </w:pPr>
-            <w:proofErr w:type="spellStart"/>
-            <w:r>
-              <w:t>Aug</w:t>
-            </w:r>
-            <w:proofErr w:type="spellEnd"/>
-            <w:r>
-              <w:t xml:space="preserve"> 2024 - Nov 2024</w:t>
+            <w:r>
+              <w:t>Aug 2024 - Nov 2024</w:t>
             </w:r>
           </w:p>
         </w:tc>
@@ -933,257 +351,18 @@
                 <w:color w:val="auto"/>
               </w:rPr>
             </w:pPr>
-            <w:proofErr w:type="spellStart"/>
-            <w:r>
-              <w:t>Contributed</w:t>
-            </w:r>
-            <w:proofErr w:type="spellEnd"/>
-            <w:r>
-              <w:t xml:space="preserve"> </w:t>
-            </w:r>
-            <w:proofErr w:type="spellStart"/>
-            <w:r>
-              <w:t>to</w:t>
-            </w:r>
-            <w:proofErr w:type="spellEnd"/>
-            <w:r>
-              <w:t xml:space="preserve"> a </w:t>
-            </w:r>
-            <w:proofErr w:type="spellStart"/>
-            <w:r>
-              <w:t>large-scale</w:t>
-            </w:r>
-            <w:proofErr w:type="spellEnd"/>
-            <w:r>
-              <w:t xml:space="preserve"> </w:t>
-            </w:r>
-            <w:proofErr w:type="spellStart"/>
-            <w:r>
-              <w:t>green</w:t>
-            </w:r>
-            <w:proofErr w:type="spellEnd"/>
-            <w:r>
-              <w:t xml:space="preserve"> </w:t>
-            </w:r>
-            <w:proofErr w:type="spellStart"/>
-            <w:r>
-              <w:t>hydrogen</w:t>
-            </w:r>
-            <w:proofErr w:type="spellEnd"/>
-            <w:r>
-              <w:t xml:space="preserve"> </w:t>
-            </w:r>
-            <w:proofErr w:type="spellStart"/>
-            <w:r>
-              <w:t>project</w:t>
-            </w:r>
-            <w:proofErr w:type="spellEnd"/>
-            <w:r>
-              <w:t xml:space="preserve">, </w:t>
-            </w:r>
-            <w:proofErr w:type="spellStart"/>
-            <w:r>
-              <w:t>focusing</w:t>
-            </w:r>
-            <w:proofErr w:type="spellEnd"/>
-            <w:r>
-              <w:t xml:space="preserve"> </w:t>
-            </w:r>
-            <w:proofErr w:type="spellStart"/>
-            <w:r>
-              <w:t>on</w:t>
-            </w:r>
-            <w:proofErr w:type="spellEnd"/>
-            <w:r>
-              <w:t xml:space="preserve"> </w:t>
-            </w:r>
-            <w:proofErr w:type="spellStart"/>
-            <w:r>
-              <w:t>renewable</w:t>
-            </w:r>
-            <w:proofErr w:type="spellEnd"/>
-            <w:r>
-              <w:t xml:space="preserve"> </w:t>
-            </w:r>
-            <w:proofErr w:type="spellStart"/>
-            <w:r>
-              <w:t>energy</w:t>
-            </w:r>
-            <w:proofErr w:type="spellEnd"/>
-            <w:r>
-              <w:t xml:space="preserve"> </w:t>
-            </w:r>
-            <w:proofErr w:type="spellStart"/>
-            <w:r>
-              <w:t>solutions</w:t>
-            </w:r>
-            <w:proofErr w:type="spellEnd"/>
-            <w:r>
-              <w:t xml:space="preserve"> </w:t>
-            </w:r>
-            <w:proofErr w:type="spellStart"/>
-            <w:r>
-              <w:t>including</w:t>
-            </w:r>
-            <w:proofErr w:type="spellEnd"/>
-            <w:r>
-              <w:t xml:space="preserve"> </w:t>
-            </w:r>
-            <w:proofErr w:type="spellStart"/>
-            <w:r>
-              <w:t>wind</w:t>
-            </w:r>
-            <w:proofErr w:type="spellEnd"/>
-            <w:r>
-              <w:t xml:space="preserve"> </w:t>
-            </w:r>
-            <w:proofErr w:type="spellStart"/>
-            <w:r>
-              <w:t>power</w:t>
-            </w:r>
-            <w:proofErr w:type="spellEnd"/>
-            <w:r>
-              <w:t xml:space="preserve"> </w:t>
-            </w:r>
-            <w:proofErr w:type="spellStart"/>
-            <w:r>
-              <w:t>generation</w:t>
-            </w:r>
-            <w:proofErr w:type="spellEnd"/>
-            <w:r>
-              <w:t xml:space="preserve"> and </w:t>
-            </w:r>
-            <w:proofErr w:type="spellStart"/>
-            <w:r>
-              <w:t>energy</w:t>
-            </w:r>
-            <w:proofErr w:type="spellEnd"/>
-            <w:r>
-              <w:t xml:space="preserve"> </w:t>
-            </w:r>
-            <w:proofErr w:type="spellStart"/>
-            <w:r>
-              <w:t>storage</w:t>
-            </w:r>
-            <w:proofErr w:type="spellEnd"/>
-            <w:r>
-              <w:t xml:space="preserve"> (</w:t>
-            </w:r>
-            <w:proofErr w:type="spellStart"/>
-            <w:r>
-              <w:t>electroly</w:t>
+            <w:r>
+              <w:t>Contributed to a large-scale green hydrogen project, focusing on renewable energy solutions including wind power generation and energy storage (electroly</w:t>
             </w:r>
             <w:r>
               <w:t>s</w:t>
             </w:r>
             <w:r>
-              <w:t>er</w:t>
-            </w:r>
-            <w:proofErr w:type="spellEnd"/>
-            <w:r>
-              <w:t xml:space="preserve">, </w:t>
-            </w:r>
-            <w:proofErr w:type="spellStart"/>
-            <w:r>
-              <w:t>battery</w:t>
-            </w:r>
-            <w:proofErr w:type="spellEnd"/>
-            <w:r>
-              <w:t xml:space="preserve"> </w:t>
-            </w:r>
-            <w:proofErr w:type="spellStart"/>
-            <w:r>
-              <w:t>systems</w:t>
-            </w:r>
-            <w:proofErr w:type="spellEnd"/>
-            <w:r>
-              <w:t xml:space="preserve">, </w:t>
-            </w:r>
-            <w:proofErr w:type="spellStart"/>
-            <w:r>
-              <w:t>hydrogen</w:t>
-            </w:r>
-            <w:proofErr w:type="spellEnd"/>
-            <w:r>
-              <w:t xml:space="preserve"> </w:t>
-            </w:r>
-            <w:proofErr w:type="spellStart"/>
-            <w:r>
-              <w:t>storage</w:t>
-            </w:r>
-            <w:proofErr w:type="spellEnd"/>
-            <w:r>
-              <w:t xml:space="preserve">). </w:t>
-            </w:r>
-            <w:proofErr w:type="spellStart"/>
-            <w:r>
-              <w:t>Managed</w:t>
-            </w:r>
-            <w:proofErr w:type="spellEnd"/>
-            <w:r>
-              <w:t xml:space="preserve"> </w:t>
-            </w:r>
-            <w:proofErr w:type="spellStart"/>
-            <w:r>
-              <w:t>to</w:t>
-            </w:r>
-            <w:proofErr w:type="spellEnd"/>
-            <w:r>
-              <w:t xml:space="preserve"> catalogue +10.000 </w:t>
-            </w:r>
-            <w:proofErr w:type="spellStart"/>
-            <w:r>
-              <w:t>keywords</w:t>
-            </w:r>
-            <w:proofErr w:type="spellEnd"/>
-            <w:r>
-              <w:t xml:space="preserve"> in +2000 </w:t>
-            </w:r>
-            <w:proofErr w:type="spellStart"/>
-            <w:r>
-              <w:t>technical</w:t>
-            </w:r>
-            <w:proofErr w:type="spellEnd"/>
-            <w:r>
-              <w:t xml:space="preserve"> files </w:t>
-            </w:r>
-            <w:proofErr w:type="spellStart"/>
-            <w:r>
-              <w:t>to</w:t>
-            </w:r>
-            <w:proofErr w:type="spellEnd"/>
-            <w:r>
-              <w:t xml:space="preserve"> </w:t>
-            </w:r>
-            <w:proofErr w:type="spellStart"/>
-            <w:r>
-              <w:t>optimise</w:t>
-            </w:r>
-            <w:proofErr w:type="spellEnd"/>
-            <w:r>
-              <w:t xml:space="preserve"> </w:t>
-            </w:r>
-            <w:proofErr w:type="spellStart"/>
-            <w:r>
-              <w:t>the</w:t>
-            </w:r>
-            <w:proofErr w:type="spellEnd"/>
-            <w:r>
-              <w:t xml:space="preserve"> </w:t>
-            </w:r>
-            <w:proofErr w:type="spellStart"/>
-            <w:r>
-              <w:t>company</w:t>
-            </w:r>
-            <w:proofErr w:type="spellEnd"/>
-            <w:r>
-              <w:t xml:space="preserve"> </w:t>
-            </w:r>
-            <w:proofErr w:type="spellStart"/>
-            <w:r>
-              <w:t>database</w:t>
-            </w:r>
-            <w:proofErr w:type="spellEnd"/>
+              <w:t xml:space="preserve">er, battery systems, hydrogen storage). Managed to catalogue +10.000 keywords in +2000 technical files to optimise </w:t>
+            </w:r>
+            <w:r>
+              <w:t>the company database</w:t>
+            </w:r>
             <w:r>
               <w:t>.</w:t>
             </w:r>
@@ -1223,43 +402,9 @@
             <w:pPr>
               <w:pStyle w:val="Ttulo4"/>
             </w:pPr>
-            <w:proofErr w:type="spellStart"/>
-            <w:r>
-              <w:t>Bachelor</w:t>
-            </w:r>
-            <w:proofErr w:type="spellEnd"/>
-            <w:r>
-              <w:t xml:space="preserve"> and </w:t>
-            </w:r>
-            <w:proofErr w:type="spellStart"/>
-            <w:r>
-              <w:t>Honours</w:t>
-            </w:r>
-            <w:proofErr w:type="spellEnd"/>
-            <w:r>
-              <w:t xml:space="preserve"> </w:t>
-            </w:r>
-            <w:proofErr w:type="spellStart"/>
-            <w:r>
-              <w:t>Degree</w:t>
-            </w:r>
-            <w:proofErr w:type="spellEnd"/>
-            <w:r>
-              <w:t xml:space="preserve"> in </w:t>
-            </w:r>
-            <w:proofErr w:type="spellStart"/>
-            <w:r>
-              <w:t>Electrical</w:t>
-            </w:r>
-            <w:proofErr w:type="spellEnd"/>
-            <w:r>
-              <w:t xml:space="preserve"> </w:t>
-            </w:r>
-            <w:proofErr w:type="spellStart"/>
-            <w:r>
-              <w:t>Engineering</w:t>
-            </w:r>
-            <w:proofErr w:type="spellEnd"/>
+            <w:r>
+              <w:t>Bachelor and Honours Degree in Electrical Engineering</w:t>
+            </w:r>
           </w:p>
         </w:tc>
         <w:tc>
@@ -1274,15 +419,7 @@
               <w:pStyle w:val="Ttulo4"/>
             </w:pPr>
             <w:r>
-              <w:t xml:space="preserve">Feb 2019 - </w:t>
-            </w:r>
-            <w:proofErr w:type="spellStart"/>
-            <w:r>
-              <w:t>Dec</w:t>
-            </w:r>
-            <w:proofErr w:type="spellEnd"/>
-            <w:r>
-              <w:t xml:space="preserve"> 2024</w:t>
+              <w:t>Feb 2019 - Dec 2024</w:t>
             </w:r>
           </w:p>
         </w:tc>
@@ -1302,31 +439,7 @@
               </w:rPr>
             </w:pPr>
             <w:r>
-              <w:t xml:space="preserve">Pontifical </w:t>
-            </w:r>
-            <w:proofErr w:type="spellStart"/>
-            <w:r>
-              <w:t>Catholic</w:t>
-            </w:r>
-            <w:proofErr w:type="spellEnd"/>
-            <w:r>
-              <w:t xml:space="preserve"> </w:t>
-            </w:r>
-            <w:proofErr w:type="spellStart"/>
-            <w:r>
-              <w:t>University</w:t>
-            </w:r>
-            <w:proofErr w:type="spellEnd"/>
-            <w:r>
-              <w:t xml:space="preserve"> </w:t>
-            </w:r>
-            <w:proofErr w:type="spellStart"/>
-            <w:r>
-              <w:t>of</w:t>
-            </w:r>
-            <w:proofErr w:type="spellEnd"/>
-            <w:r>
-              <w:t xml:space="preserve"> Chile</w:t>
+              <w:t>Pontifical Catholic University of Chile</w:t>
             </w:r>
           </w:p>
         </w:tc>
@@ -1358,37 +471,8 @@
                 <w:color w:val="auto"/>
               </w:rPr>
             </w:pPr>
-            <w:proofErr w:type="spellStart"/>
-            <w:r>
-              <w:t>Major</w:t>
-            </w:r>
-            <w:proofErr w:type="spellEnd"/>
-            <w:r>
-              <w:t xml:space="preserve"> in </w:t>
-            </w:r>
-            <w:proofErr w:type="spellStart"/>
-            <w:r>
-              <w:t>Electrical</w:t>
-            </w:r>
-            <w:proofErr w:type="spellEnd"/>
-            <w:r>
-              <w:t xml:space="preserve"> </w:t>
-            </w:r>
-            <w:proofErr w:type="spellStart"/>
-            <w:r>
-              <w:t>Engineering</w:t>
-            </w:r>
-            <w:proofErr w:type="spellEnd"/>
-            <w:r>
-              <w:t xml:space="preserve"> - </w:t>
-            </w:r>
-            <w:proofErr w:type="spellStart"/>
-            <w:r>
-              <w:t>Minor</w:t>
-            </w:r>
-            <w:proofErr w:type="spellEnd"/>
-            <w:r>
-              <w:t xml:space="preserve"> in industries</w:t>
+            <w:r>
+              <w:t>Major in Electrical Engineering - Minor in industries</w:t>
             </w:r>
           </w:p>
           <w:p>
@@ -1402,77 +486,8 @@
                 <w:color w:val="auto"/>
               </w:rPr>
             </w:pPr>
-            <w:proofErr w:type="spellStart"/>
-            <w:r>
-              <w:t>Honours</w:t>
-            </w:r>
-            <w:proofErr w:type="spellEnd"/>
-            <w:r>
-              <w:t xml:space="preserve"> </w:t>
-            </w:r>
-            <w:proofErr w:type="spellStart"/>
-            <w:r>
-              <w:t>degree</w:t>
-            </w:r>
-            <w:proofErr w:type="spellEnd"/>
-            <w:r>
-              <w:t xml:space="preserve"> in </w:t>
-            </w:r>
-            <w:proofErr w:type="spellStart"/>
-            <w:r>
-              <w:t>Renewable</w:t>
-            </w:r>
-            <w:proofErr w:type="spellEnd"/>
-            <w:r>
-              <w:t xml:space="preserve"> Energy (</w:t>
-            </w:r>
-            <w:proofErr w:type="spellStart"/>
-            <w:r>
-              <w:t>Power</w:t>
-            </w:r>
-            <w:proofErr w:type="spellEnd"/>
-            <w:r>
-              <w:t xml:space="preserve"> </w:t>
-            </w:r>
-            <w:proofErr w:type="spellStart"/>
-            <w:r>
-              <w:t>Systems</w:t>
-            </w:r>
-            <w:proofErr w:type="spellEnd"/>
-            <w:r>
-              <w:t xml:space="preserve">, </w:t>
-            </w:r>
-            <w:proofErr w:type="spellStart"/>
-            <w:r>
-              <w:t>Finance</w:t>
-            </w:r>
-            <w:proofErr w:type="spellEnd"/>
-            <w:r>
-              <w:t xml:space="preserve">, </w:t>
-            </w:r>
-            <w:proofErr w:type="spellStart"/>
-            <w:r>
-              <w:t>Electrical</w:t>
-            </w:r>
-            <w:proofErr w:type="spellEnd"/>
-            <w:r>
-              <w:t xml:space="preserve"> </w:t>
-            </w:r>
-            <w:proofErr w:type="spellStart"/>
-            <w:r>
-              <w:t>Markets</w:t>
-            </w:r>
-            <w:proofErr w:type="spellEnd"/>
-            <w:r>
-              <w:t xml:space="preserve">, Project </w:t>
-            </w:r>
-            <w:proofErr w:type="spellStart"/>
-            <w:r>
-              <w:t>Evaluation</w:t>
-            </w:r>
-            <w:proofErr w:type="spellEnd"/>
-            <w:r>
-              <w:t>)</w:t>
+            <w:r>
+              <w:t>Honours degree in Renewable Energy (Power Systems, Finance, Electrical Markets, Project Evaluation)</w:t>
             </w:r>
           </w:p>
           <w:p>
@@ -1495,21 +510,8 @@
               <w:pStyle w:val="Ttulo4"/>
             </w:pPr>
             <w:r>
-              <w:t xml:space="preserve">Bilateral Exchange </w:t>
-            </w:r>
-            <w:proofErr w:type="spellStart"/>
-            <w:r>
-              <w:t>Semester</w:t>
-            </w:r>
-            <w:proofErr w:type="spellEnd"/>
-            <w:r>
-              <w:t xml:space="preserve"> </w:t>
-            </w:r>
-            <w:proofErr w:type="spellStart"/>
-            <w:r>
-              <w:t>Program</w:t>
-            </w:r>
-            <w:proofErr w:type="spellEnd"/>
+              <w:t>Bilateral Exchange Semester Program</w:t>
+            </w:r>
           </w:p>
         </w:tc>
         <w:tc>
@@ -1520,13 +522,8 @@
             <w:pPr>
               <w:pStyle w:val="Ttulo4"/>
             </w:pPr>
-            <w:proofErr w:type="spellStart"/>
-            <w:r>
-              <w:t>July</w:t>
-            </w:r>
-            <w:proofErr w:type="spellEnd"/>
-            <w:r>
-              <w:t xml:space="preserve"> 2023 - Feb 2024</w:t>
+            <w:r>
+              <w:t>July 2023 - Feb 2024</w:t>
             </w:r>
           </w:p>
         </w:tc>
@@ -1539,15 +536,7 @@
           </w:tcPr>
           <w:p>
             <w:r>
-              <w:t xml:space="preserve">Monash </w:t>
-            </w:r>
-            <w:proofErr w:type="spellStart"/>
-            <w:r>
-              <w:t>University</w:t>
-            </w:r>
-            <w:proofErr w:type="spellEnd"/>
-            <w:r>
-              <w:t xml:space="preserve"> (Australia)</w:t>
+              <w:t>Monash University (Australia)</w:t>
             </w:r>
           </w:p>
         </w:tc>
@@ -1582,29 +571,8 @@
                 <w:numId w:val="13"/>
               </w:numPr>
             </w:pPr>
-            <w:proofErr w:type="spellStart"/>
-            <w:r>
-              <w:t>Organisational</w:t>
-            </w:r>
-            <w:proofErr w:type="spellEnd"/>
-            <w:r>
-              <w:t xml:space="preserve"> </w:t>
-            </w:r>
-            <w:proofErr w:type="spellStart"/>
-            <w:r>
-              <w:t>Behaviour</w:t>
-            </w:r>
-            <w:proofErr w:type="spellEnd"/>
-            <w:r>
-              <w:t xml:space="preserve">, Fluid Dynamics and </w:t>
-            </w:r>
-            <w:proofErr w:type="spellStart"/>
-            <w:r>
-              <w:t>Operations</w:t>
-            </w:r>
-            <w:proofErr w:type="spellEnd"/>
-            <w:r>
-              <w:t xml:space="preserve"> Management</w:t>
+            <w:r>
+              <w:t>Organisational Behaviour, Fluid Dynamics and Operations Management</w:t>
             </w:r>
           </w:p>
         </w:tc>
@@ -1647,13 +615,8 @@
                 <w:color w:val="auto"/>
               </w:rPr>
             </w:pPr>
-            <w:proofErr w:type="spellStart"/>
-            <w:r>
-              <w:t>Power</w:t>
-            </w:r>
-            <w:proofErr w:type="spellEnd"/>
-            <w:r>
-              <w:t xml:space="preserve"> BI / Microsoft 365</w:t>
+            <w:r>
+              <w:t>Power BI / Microsoft 365</w:t>
             </w:r>
           </w:p>
           <w:p>
@@ -1662,13 +625,8 @@
                 <w:color w:val="auto"/>
               </w:rPr>
             </w:pPr>
-            <w:proofErr w:type="spellStart"/>
-            <w:r>
-              <w:t>Advanced</w:t>
-            </w:r>
-            <w:proofErr w:type="spellEnd"/>
-            <w:r>
-              <w:t xml:space="preserve"> Excel (macros)</w:t>
+            <w:r>
+              <w:t>Advanced Excel (macros)</w:t>
             </w:r>
           </w:p>
           <w:p>
@@ -1677,13 +635,8 @@
                 <w:color w:val="auto"/>
               </w:rPr>
             </w:pPr>
-            <w:proofErr w:type="spellStart"/>
-            <w:r>
-              <w:t>Power</w:t>
-            </w:r>
-            <w:proofErr w:type="spellEnd"/>
-            <w:r>
-              <w:t xml:space="preserve"> Point, Word </w:t>
+            <w:r>
+              <w:t xml:space="preserve">Power Point, Word </w:t>
             </w:r>
           </w:p>
         </w:tc>
@@ -1702,15 +655,7 @@
               </w:rPr>
             </w:pPr>
             <w:r>
-              <w:t>Matlab (</w:t>
-            </w:r>
-            <w:proofErr w:type="spellStart"/>
-            <w:r>
-              <w:t>basics</w:t>
-            </w:r>
-            <w:proofErr w:type="spellEnd"/>
-            <w:r>
-              <w:t>)</w:t>
+              <w:t>Matlab (basics)</w:t>
             </w:r>
           </w:p>
           <w:p>
@@ -1720,15 +665,7 @@
               </w:rPr>
             </w:pPr>
             <w:r>
-              <w:t>Python (</w:t>
-            </w:r>
-            <w:proofErr w:type="spellStart"/>
-            <w:r>
-              <w:t>advanced</w:t>
-            </w:r>
-            <w:proofErr w:type="spellEnd"/>
-            <w:r>
-              <w:t>)</w:t>
+              <w:t>Python (advanced)</w:t>
             </w:r>
           </w:p>
           <w:p>
@@ -1738,15 +675,7 @@
               </w:rPr>
             </w:pPr>
             <w:r>
-              <w:t>C (</w:t>
-            </w:r>
-            <w:proofErr w:type="spellStart"/>
-            <w:r>
-              <w:t>microcontrollers</w:t>
-            </w:r>
-            <w:proofErr w:type="spellEnd"/>
-            <w:r>
-              <w:t>)</w:t>
+              <w:t>C (microcontrollers)</w:t>
             </w:r>
           </w:p>
         </w:tc>
@@ -1765,29 +694,8 @@
                 <w:color w:val="auto"/>
               </w:rPr>
             </w:pPr>
-            <w:proofErr w:type="spellStart"/>
-            <w:r>
-              <w:t>PowerWorld</w:t>
-            </w:r>
-            <w:proofErr w:type="spellEnd"/>
-            <w:r>
-              <w:t xml:space="preserve"> (</w:t>
-            </w:r>
-            <w:proofErr w:type="spellStart"/>
-            <w:r>
-              <w:t>Power</w:t>
-            </w:r>
-            <w:proofErr w:type="spellEnd"/>
-            <w:r>
-              <w:t xml:space="preserve"> </w:t>
-            </w:r>
-            <w:proofErr w:type="spellStart"/>
-            <w:r>
-              <w:t>Systems</w:t>
-            </w:r>
-            <w:proofErr w:type="spellEnd"/>
-            <w:r>
-              <w:t>)</w:t>
+            <w:r>
+              <w:t>PowerWorld (Power Systems)</w:t>
             </w:r>
           </w:p>
           <w:p>
@@ -1797,15 +705,7 @@
               </w:rPr>
             </w:pPr>
             <w:r>
-              <w:t xml:space="preserve">R (Data </w:t>
-            </w:r>
-            <w:proofErr w:type="spellStart"/>
-            <w:r>
-              <w:t>Analysis</w:t>
-            </w:r>
-            <w:proofErr w:type="spellEnd"/>
-            <w:r>
-              <w:t>)</w:t>
+              <w:t>R (Data Analysis)</w:t>
             </w:r>
           </w:p>
           <w:p>
@@ -1814,27 +714,9 @@
                 <w:color w:val="auto"/>
               </w:rPr>
             </w:pPr>
-            <w:proofErr w:type="spellStart"/>
-            <w:r>
-              <w:t>Type</w:t>
-            </w:r>
-            <w:proofErr w:type="spellEnd"/>
-            <w:r>
-              <w:t xml:space="preserve"> B </w:t>
-            </w:r>
-            <w:proofErr w:type="spellStart"/>
-            <w:r>
-              <w:t>driver’s</w:t>
-            </w:r>
-            <w:proofErr w:type="spellEnd"/>
-            <w:r>
-              <w:t xml:space="preserve"> </w:t>
-            </w:r>
-            <w:proofErr w:type="spellStart"/>
-            <w:r>
-              <w:t>License</w:t>
-            </w:r>
-            <w:proofErr w:type="spellEnd"/>
+            <w:r>
+              <w:t>Type B driver’s License</w:t>
+            </w:r>
           </w:p>
         </w:tc>
       </w:tr>
@@ -1874,6 +756,7 @@
             <w:gridSpan w:val="5"/>
             <w:tcBorders>
               <w:top w:val="single" w:sz="8" w:space="0" w:color="0070C0"/>
+              <w:bottom w:val="single" w:sz="8" w:space="0" w:color="0070C0"/>
             </w:tcBorders>
           </w:tcPr>
           <w:p>
@@ -1887,407 +770,65 @@
                 <w:color w:val="auto"/>
               </w:rPr>
             </w:pPr>
-            <w:proofErr w:type="spellStart"/>
             <w:r>
               <w:rPr>
                 <w:b/>
                 <w:bCs/>
               </w:rPr>
-              <w:t>Volunteer</w:t>
-            </w:r>
-            <w:proofErr w:type="spellEnd"/>
+              <w:t>Activities</w:t>
+            </w:r>
+            <w:r>
+              <w:t>: Reading, cultural exchange, active learning, and personal development.</w:t>
+            </w:r>
+          </w:p>
+          <w:p>
+            <w:pPr>
+              <w:pStyle w:val="Prrafodelista"/>
+              <w:numPr>
+                <w:ilvl w:val="0"/>
+                <w:numId w:val="13"/>
+              </w:numPr>
+            </w:pPr>
             <w:r>
               <w:rPr>
                 <w:b/>
                 <w:bCs/>
               </w:rPr>
+              <w:t>Languages:</w:t>
+            </w:r>
+            <w:r>
               <w:t xml:space="preserve"> </w:t>
             </w:r>
-            <w:proofErr w:type="spellStart"/>
-            <w:r>
-              <w:rPr>
-                <w:b/>
-                <w:bCs/>
-              </w:rPr>
-              <w:t>Work</w:t>
-            </w:r>
-            <w:proofErr w:type="spellEnd"/>
-            <w:r>
-              <w:rPr>
-                <w:rStyle w:val="nfasis"/>
-                <w:rFonts w:ascii="Segoe UI" w:hAnsi="Segoe UI" w:cs="Segoe UI"/>
-                <w:color w:val="404040"/>
-              </w:rPr>
-              <w:t>:</w:t>
-            </w:r>
-            <w:r>
-              <w:t> </w:t>
-            </w:r>
-            <w:proofErr w:type="spellStart"/>
-            <w:r>
-              <w:t>Participated</w:t>
-            </w:r>
-            <w:proofErr w:type="spellEnd"/>
-            <w:r>
-              <w:t xml:space="preserve"> in Trabajos de Invierno (TDI), a social </w:t>
-            </w:r>
-            <w:proofErr w:type="spellStart"/>
-            <w:r>
-              <w:t>initiative</w:t>
-            </w:r>
-            <w:proofErr w:type="spellEnd"/>
-            <w:r>
-              <w:t xml:space="preserve"> </w:t>
-            </w:r>
-            <w:proofErr w:type="spellStart"/>
-            <w:r>
-              <w:t>aimed</w:t>
-            </w:r>
-            <w:proofErr w:type="spellEnd"/>
-            <w:r>
-              <w:t xml:space="preserve"> at </w:t>
-            </w:r>
-            <w:proofErr w:type="spellStart"/>
-            <w:r>
-              <w:t>empowering</w:t>
-            </w:r>
-            <w:proofErr w:type="spellEnd"/>
-            <w:r>
-              <w:t xml:space="preserve"> </w:t>
-            </w:r>
-            <w:proofErr w:type="spellStart"/>
-            <w:r>
-              <w:t>economically</w:t>
-            </w:r>
-            <w:proofErr w:type="spellEnd"/>
-            <w:r>
-              <w:t xml:space="preserve"> vulnerable </w:t>
-            </w:r>
-            <w:proofErr w:type="spellStart"/>
-            <w:r>
-              <w:t>families</w:t>
-            </w:r>
-            <w:proofErr w:type="spellEnd"/>
-            <w:r>
-              <w:t xml:space="preserve"> in rural Chile </w:t>
-            </w:r>
-            <w:proofErr w:type="spellStart"/>
-            <w:r>
-              <w:t>by</w:t>
-            </w:r>
-            <w:proofErr w:type="spellEnd"/>
-            <w:r>
-              <w:t xml:space="preserve"> </w:t>
-            </w:r>
-            <w:proofErr w:type="spellStart"/>
-            <w:r>
-              <w:t>providing</w:t>
-            </w:r>
-            <w:proofErr w:type="spellEnd"/>
-            <w:r>
-              <w:t xml:space="preserve"> </w:t>
-            </w:r>
-            <w:proofErr w:type="spellStart"/>
-            <w:r>
-              <w:t>them</w:t>
-            </w:r>
-            <w:proofErr w:type="spellEnd"/>
-            <w:r>
-              <w:t xml:space="preserve"> </w:t>
-            </w:r>
-            <w:proofErr w:type="spellStart"/>
-            <w:r>
-              <w:t>with</w:t>
-            </w:r>
-            <w:proofErr w:type="spellEnd"/>
-            <w:r>
-              <w:t xml:space="preserve"> </w:t>
-            </w:r>
-            <w:proofErr w:type="spellStart"/>
-            <w:r>
-              <w:t>tools</w:t>
-            </w:r>
-            <w:proofErr w:type="spellEnd"/>
-            <w:r>
-              <w:t xml:space="preserve"> </w:t>
-            </w:r>
-            <w:proofErr w:type="spellStart"/>
-            <w:r>
-              <w:t>for</w:t>
-            </w:r>
-            <w:proofErr w:type="spellEnd"/>
-            <w:r>
-              <w:t xml:space="preserve"> </w:t>
-            </w:r>
-            <w:proofErr w:type="spellStart"/>
-            <w:r>
-              <w:t>self-sufficiency</w:t>
-            </w:r>
-            <w:proofErr w:type="spellEnd"/>
-            <w:r>
-              <w:t xml:space="preserve">. </w:t>
-            </w:r>
-            <w:proofErr w:type="spellStart"/>
-            <w:r>
-              <w:t>Over</w:t>
-            </w:r>
-            <w:proofErr w:type="spellEnd"/>
-            <w:r>
-              <w:t xml:space="preserve"> </w:t>
-            </w:r>
-            <w:proofErr w:type="spellStart"/>
-            <w:r>
-              <w:t>three</w:t>
-            </w:r>
-            <w:proofErr w:type="spellEnd"/>
-            <w:r>
-              <w:t xml:space="preserve"> </w:t>
-            </w:r>
-            <w:proofErr w:type="spellStart"/>
-            <w:r>
-              <w:t>campaigns</w:t>
-            </w:r>
-            <w:proofErr w:type="spellEnd"/>
-            <w:r>
-              <w:t xml:space="preserve"> in </w:t>
-            </w:r>
-            <w:proofErr w:type="spellStart"/>
-            <w:r>
-              <w:t>the</w:t>
-            </w:r>
-            <w:proofErr w:type="spellEnd"/>
-            <w:r>
-              <w:t xml:space="preserve"> La Araucanía </w:t>
-            </w:r>
-            <w:proofErr w:type="spellStart"/>
-            <w:r>
-              <w:t>Region</w:t>
-            </w:r>
-            <w:proofErr w:type="spellEnd"/>
-            <w:r>
-              <w:t xml:space="preserve">, I </w:t>
-            </w:r>
-            <w:proofErr w:type="spellStart"/>
-            <w:r>
-              <w:t>helped</w:t>
-            </w:r>
-            <w:proofErr w:type="spellEnd"/>
-            <w:r>
-              <w:t xml:space="preserve"> </w:t>
-            </w:r>
-            <w:proofErr w:type="spellStart"/>
-            <w:r>
-              <w:t>build</w:t>
-            </w:r>
-            <w:proofErr w:type="spellEnd"/>
-            <w:r>
-              <w:t xml:space="preserve"> </w:t>
-            </w:r>
-            <w:proofErr w:type="spellStart"/>
-            <w:r>
-              <w:t>greenhouses</w:t>
-            </w:r>
-            <w:proofErr w:type="spellEnd"/>
-            <w:r>
-              <w:t xml:space="preserve"> and </w:t>
-            </w:r>
-            <w:proofErr w:type="spellStart"/>
-            <w:r>
-              <w:t>water</w:t>
-            </w:r>
-            <w:proofErr w:type="spellEnd"/>
-            <w:r>
-              <w:t xml:space="preserve"> </w:t>
-            </w:r>
-            <w:proofErr w:type="spellStart"/>
-            <w:r>
-              <w:t>towers</w:t>
-            </w:r>
-            <w:proofErr w:type="spellEnd"/>
-            <w:r>
-              <w:t xml:space="preserve"> in </w:t>
-            </w:r>
-            <w:proofErr w:type="spellStart"/>
-            <w:r>
-              <w:t>collaboration</w:t>
-            </w:r>
-            <w:proofErr w:type="spellEnd"/>
-            <w:r>
-              <w:t xml:space="preserve"> </w:t>
-            </w:r>
-            <w:proofErr w:type="spellStart"/>
-            <w:r>
-              <w:t>with</w:t>
-            </w:r>
-            <w:proofErr w:type="spellEnd"/>
-            <w:r>
-              <w:t xml:space="preserve"> local </w:t>
-            </w:r>
-            <w:proofErr w:type="spellStart"/>
-            <w:r>
-              <w:t>communities</w:t>
-            </w:r>
-            <w:proofErr w:type="spellEnd"/>
-            <w:r>
-              <w:t xml:space="preserve"> ("comunas"). </w:t>
-            </w:r>
-            <w:proofErr w:type="spellStart"/>
-            <w:r>
-              <w:t>On</w:t>
-            </w:r>
-            <w:proofErr w:type="spellEnd"/>
-            <w:r>
-              <w:t xml:space="preserve"> </w:t>
-            </w:r>
-            <w:proofErr w:type="spellStart"/>
-            <w:r>
-              <w:t>one</w:t>
-            </w:r>
-            <w:proofErr w:type="spellEnd"/>
-            <w:r>
-              <w:t xml:space="preserve"> </w:t>
-            </w:r>
-            <w:proofErr w:type="spellStart"/>
-            <w:r>
-              <w:t>occasion</w:t>
-            </w:r>
-            <w:proofErr w:type="spellEnd"/>
-            <w:r>
-              <w:t xml:space="preserve">, I led a </w:t>
-            </w:r>
-            <w:proofErr w:type="spellStart"/>
-            <w:r>
-              <w:t>team</w:t>
-            </w:r>
-            <w:proofErr w:type="spellEnd"/>
-            <w:r>
-              <w:t xml:space="preserve"> </w:t>
-            </w:r>
-            <w:proofErr w:type="spellStart"/>
-            <w:r>
-              <w:t>of</w:t>
-            </w:r>
-            <w:proofErr w:type="spellEnd"/>
-            <w:r>
-              <w:t xml:space="preserve"> 10 </w:t>
-            </w:r>
-            <w:proofErr w:type="spellStart"/>
-            <w:r>
-              <w:t>students</w:t>
-            </w:r>
-            <w:proofErr w:type="spellEnd"/>
-            <w:r>
-              <w:t>—</w:t>
-            </w:r>
-            <w:proofErr w:type="spellStart"/>
-            <w:r>
-              <w:t>most</w:t>
-            </w:r>
-            <w:proofErr w:type="spellEnd"/>
-            <w:r>
-              <w:t xml:space="preserve"> </w:t>
-            </w:r>
-            <w:proofErr w:type="spellStart"/>
-            <w:r>
-              <w:t>with</w:t>
-            </w:r>
-            <w:proofErr w:type="spellEnd"/>
-            <w:r>
-              <w:t xml:space="preserve"> no prior </w:t>
-            </w:r>
-            <w:proofErr w:type="spellStart"/>
-            <w:r>
-              <w:t>experience</w:t>
-            </w:r>
-            <w:proofErr w:type="spellEnd"/>
-            <w:r>
-              <w:t>—</w:t>
-            </w:r>
-            <w:proofErr w:type="spellStart"/>
-            <w:r>
-              <w:t>to</w:t>
-            </w:r>
-            <w:proofErr w:type="spellEnd"/>
-            <w:r>
-              <w:t xml:space="preserve"> </w:t>
-            </w:r>
-            <w:proofErr w:type="spellStart"/>
-            <w:r>
-              <w:t>successfully</w:t>
-            </w:r>
-            <w:proofErr w:type="spellEnd"/>
-            <w:r>
-              <w:t xml:space="preserve"> </w:t>
-            </w:r>
-            <w:proofErr w:type="spellStart"/>
-            <w:r>
-              <w:t>construct</w:t>
-            </w:r>
-            <w:proofErr w:type="spellEnd"/>
-            <w:r>
-              <w:t xml:space="preserve"> a </w:t>
-            </w:r>
-            <w:proofErr w:type="spellStart"/>
-            <w:r>
-              <w:t>greenhouse</w:t>
-            </w:r>
-            <w:proofErr w:type="spellEnd"/>
-            <w:r>
-              <w:t xml:space="preserve"> and </w:t>
-            </w:r>
-            <w:proofErr w:type="spellStart"/>
-            <w:r>
-              <w:t>water</w:t>
-            </w:r>
-            <w:proofErr w:type="spellEnd"/>
-            <w:r>
-              <w:t xml:space="preserve"> </w:t>
-            </w:r>
-            <w:proofErr w:type="spellStart"/>
-            <w:r>
-              <w:t>tower</w:t>
-            </w:r>
-            <w:proofErr w:type="spellEnd"/>
-            <w:r>
-              <w:t xml:space="preserve"> </w:t>
-            </w:r>
-            <w:proofErr w:type="spellStart"/>
-            <w:r>
-              <w:t>to</w:t>
-            </w:r>
-            <w:proofErr w:type="spellEnd"/>
-            <w:r>
-              <w:t xml:space="preserve"> </w:t>
-            </w:r>
-            <w:proofErr w:type="spellStart"/>
-            <w:r>
-              <w:t>support</w:t>
-            </w:r>
-            <w:proofErr w:type="spellEnd"/>
-            <w:r>
-              <w:t xml:space="preserve"> </w:t>
-            </w:r>
-            <w:proofErr w:type="spellStart"/>
-            <w:r>
-              <w:t>sustainable</w:t>
-            </w:r>
-            <w:proofErr w:type="spellEnd"/>
-            <w:r>
-              <w:t xml:space="preserve"> </w:t>
-            </w:r>
-            <w:proofErr w:type="spellStart"/>
-            <w:r>
-              <w:t>food</w:t>
-            </w:r>
-            <w:proofErr w:type="spellEnd"/>
-            <w:r>
-              <w:t xml:space="preserve"> </w:t>
-            </w:r>
-            <w:proofErr w:type="spellStart"/>
-            <w:r>
-              <w:t>production</w:t>
-            </w:r>
-            <w:proofErr w:type="spellEnd"/>
+            <w:r>
+              <w:t>English</w:t>
+            </w:r>
+            <w:r>
+              <w:t xml:space="preserve"> - </w:t>
+            </w:r>
+            <w:r>
+              <w:t>TOEFLiBT (96)</w:t>
+            </w:r>
+            <w:r>
+              <w:t>, Spanish</w:t>
+            </w:r>
+            <w:r>
+              <w:t xml:space="preserve"> - </w:t>
+            </w:r>
+            <w:r>
+              <w:t xml:space="preserve">native and German </w:t>
+            </w:r>
+            <w:r>
+              <w:t xml:space="preserve">- </w:t>
+            </w:r>
+            <w:r>
+              <w:t>A</w:t>
+            </w:r>
+            <w:r>
+              <w:t>1</w:t>
+            </w:r>
+            <w:r>
+              <w:t xml:space="preserve"> certificate</w:t>
+            </w:r>
             <w:r>
               <w:t>.</w:t>
             </w:r>
@@ -2303,222 +844,87 @@
                 <w:color w:val="auto"/>
               </w:rPr>
             </w:pPr>
-            <w:proofErr w:type="spellStart"/>
             <w:r>
               <w:rPr>
                 <w:b/>
                 <w:bCs/>
               </w:rPr>
-              <w:t>University</w:t>
-            </w:r>
-            <w:proofErr w:type="spellEnd"/>
-            <w:r>
+              <w:t>University Rugby Team</w:t>
+            </w:r>
+            <w:r>
+              <w:t>: Represented the university as a varsity rugby playe</w:t>
+            </w:r>
+            <w:r>
+              <w:t>r for three (3) years.</w:t>
+            </w:r>
+          </w:p>
+          <w:p>
+            <w:pPr>
+              <w:ind w:left="360"/>
+            </w:pPr>
+          </w:p>
+        </w:tc>
+      </w:tr>
+      <w:tr>
+        <w:trPr>
+          <w:trHeight w:val="44"/>
+        </w:trPr>
+        <w:tc>
+          <w:tcPr>
+            <w:tcW w:w="10490" w:type="dxa"/>
+            <w:gridSpan w:val="5"/>
+            <w:tcBorders>
+              <w:top w:val="single" w:sz="8" w:space="0" w:color="0070C0"/>
+              <w:bottom w:val="single" w:sz="8" w:space="0" w:color="0070C0"/>
+            </w:tcBorders>
+          </w:tcPr>
+          <w:p>
+            <w:pPr>
+              <w:pStyle w:val="Ttulo1"/>
+            </w:pPr>
+            <w:r>
+              <w:t>Volunteer Work</w:t>
+            </w:r>
+          </w:p>
+        </w:tc>
+      </w:tr>
+      <w:tr>
+        <w:trPr>
+          <w:trHeight w:val="1265"/>
+        </w:trPr>
+        <w:tc>
+          <w:tcPr>
+            <w:tcW w:w="10490" w:type="dxa"/>
+            <w:gridSpan w:val="5"/>
+            <w:tcBorders>
+              <w:top w:val="single" w:sz="8" w:space="0" w:color="0070C0"/>
+            </w:tcBorders>
+          </w:tcPr>
+          <w:p>
+            <w:pPr>
               <w:rPr>
                 <w:b/>
                 <w:bCs/>
               </w:rPr>
-              <w:t xml:space="preserve"> Rugby </w:t>
-            </w:r>
-            <w:proofErr w:type="spellStart"/>
-            <w:r>
-              <w:rPr>
-                <w:b/>
-                <w:bCs/>
-              </w:rPr>
-              <w:t>Team</w:t>
-            </w:r>
-            <w:proofErr w:type="spellEnd"/>
-            <w:r>
-              <w:t xml:space="preserve">: </w:t>
-            </w:r>
-            <w:proofErr w:type="spellStart"/>
-            <w:r>
-              <w:t>Represented</w:t>
-            </w:r>
-            <w:proofErr w:type="spellEnd"/>
-            <w:r>
-              <w:t xml:space="preserve"> </w:t>
-            </w:r>
-            <w:proofErr w:type="spellStart"/>
-            <w:r>
-              <w:t>the</w:t>
-            </w:r>
-            <w:proofErr w:type="spellEnd"/>
-            <w:r>
-              <w:t xml:space="preserve"> </w:t>
-            </w:r>
-            <w:proofErr w:type="spellStart"/>
-            <w:r>
-              <w:t>university</w:t>
-            </w:r>
-            <w:proofErr w:type="spellEnd"/>
-            <w:r>
-              <w:t xml:space="preserve"> as a </w:t>
-            </w:r>
-            <w:proofErr w:type="spellStart"/>
-            <w:r>
-              <w:t>varsity</w:t>
-            </w:r>
-            <w:proofErr w:type="spellEnd"/>
-            <w:r>
-              <w:t xml:space="preserve"> rugby </w:t>
-            </w:r>
-            <w:proofErr w:type="spellStart"/>
-            <w:r>
-              <w:t>playe</w:t>
-            </w:r>
-            <w:r>
-              <w:t>r</w:t>
-            </w:r>
-            <w:proofErr w:type="spellEnd"/>
-            <w:r>
-              <w:t xml:space="preserve"> </w:t>
-            </w:r>
-            <w:proofErr w:type="spellStart"/>
-            <w:r>
-              <w:t>for</w:t>
-            </w:r>
-            <w:proofErr w:type="spellEnd"/>
-            <w:r>
-              <w:t xml:space="preserve"> </w:t>
-            </w:r>
-            <w:proofErr w:type="spellStart"/>
-            <w:r>
-              <w:t>three</w:t>
-            </w:r>
-            <w:proofErr w:type="spellEnd"/>
-            <w:r>
-              <w:t xml:space="preserve"> (3) </w:t>
-            </w:r>
-            <w:proofErr w:type="spellStart"/>
-            <w:r>
-              <w:t>years</w:t>
-            </w:r>
-            <w:proofErr w:type="spellEnd"/>
-            <w:r>
-              <w:t>.</w:t>
-            </w:r>
-          </w:p>
-          <w:p>
-            <w:pPr>
-              <w:pStyle w:val="Prrafodelista"/>
-              <w:numPr>
-                <w:ilvl w:val="0"/>
-                <w:numId w:val="13"/>
-              </w:numPr>
-              <w:rPr>
-                <w:color w:val="auto"/>
-              </w:rPr>
             </w:pPr>
-            <w:proofErr w:type="spellStart"/>
-            <w:r>
-              <w:rPr>
-                <w:b/>
-                <w:bCs/>
-              </w:rPr>
-              <w:t>Activities</w:t>
-            </w:r>
-            <w:proofErr w:type="spellEnd"/>
-            <w:r>
-              <w:t xml:space="preserve">: Reading, cultural </w:t>
-            </w:r>
-            <w:proofErr w:type="spellStart"/>
-            <w:r>
-              <w:t>exchange</w:t>
-            </w:r>
-            <w:proofErr w:type="spellEnd"/>
-            <w:r>
-              <w:t xml:space="preserve">, active </w:t>
-            </w:r>
-            <w:proofErr w:type="spellStart"/>
-            <w:r>
-              <w:t>learning</w:t>
-            </w:r>
-            <w:proofErr w:type="spellEnd"/>
-            <w:r>
-              <w:t xml:space="preserve">, and personal </w:t>
-            </w:r>
-            <w:proofErr w:type="spellStart"/>
-            <w:r>
-              <w:t>development</w:t>
-            </w:r>
-            <w:proofErr w:type="spellEnd"/>
-            <w:r>
-              <w:t>.</w:t>
-            </w:r>
-          </w:p>
-          <w:p>
-            <w:pPr>
-              <w:pStyle w:val="Prrafodelista"/>
-              <w:numPr>
-                <w:ilvl w:val="0"/>
-                <w:numId w:val="13"/>
-              </w:numPr>
-            </w:pPr>
-            <w:proofErr w:type="spellStart"/>
-            <w:r>
-              <w:rPr>
-                <w:b/>
-                <w:bCs/>
-              </w:rPr>
-              <w:t>Languages</w:t>
-            </w:r>
-            <w:proofErr w:type="spellEnd"/>
-            <w:r>
-              <w:rPr>
-                <w:b/>
-                <w:bCs/>
-              </w:rPr>
-              <w:t>:</w:t>
-            </w:r>
-            <w:r>
-              <w:t xml:space="preserve"> </w:t>
-            </w:r>
-            <w:r>
-              <w:t>English</w:t>
-            </w:r>
-            <w:r>
-              <w:t xml:space="preserve"> - </w:t>
-            </w:r>
-            <w:proofErr w:type="spellStart"/>
-            <w:r>
-              <w:t>TOEFLiBT</w:t>
-            </w:r>
-            <w:proofErr w:type="spellEnd"/>
-            <w:r>
-              <w:t xml:space="preserve"> (96)</w:t>
-            </w:r>
-            <w:r>
-              <w:t xml:space="preserve">, </w:t>
-            </w:r>
-            <w:proofErr w:type="spellStart"/>
-            <w:r>
-              <w:t>Spanish</w:t>
-            </w:r>
-            <w:proofErr w:type="spellEnd"/>
-            <w:r>
-              <w:t xml:space="preserve"> - </w:t>
-            </w:r>
-            <w:r>
-              <w:t xml:space="preserve">native and German </w:t>
-            </w:r>
-            <w:r>
-              <w:t xml:space="preserve">- </w:t>
-            </w:r>
-            <w:r>
-              <w:t>A</w:t>
-            </w:r>
-            <w:r>
-              <w:t>1</w:t>
-            </w:r>
-            <w:r>
-              <w:t xml:space="preserve"> </w:t>
-            </w:r>
-            <w:proofErr w:type="spellStart"/>
-            <w:r>
-              <w:t>certificate</w:t>
-            </w:r>
-            <w:proofErr w:type="spellEnd"/>
+            <w:r>
+              <w:t>Participated in Trabajos de Invierno (TDI), a social initiative aimed at empowering economically vulnerable families in rural Chile by providing them with tools for self-sufficiency. Over three campaigns in the La Araucanía Region, I helped build greenhouses and water towers in collaboration with local communities ("comunas"). On one occasion, I led a team of 10 students</w:t>
+            </w:r>
+            <w:r>
+              <w:t xml:space="preserve"> (</w:t>
+            </w:r>
+            <w:r>
+              <w:t>most with no prior experience</w:t>
+            </w:r>
+            <w:r>
+              <w:t xml:space="preserve">), </w:t>
+            </w:r>
+            <w:r>
+              <w:t>to successfully construct a greenhouse and water tower to support sustainable food production</w:t>
+            </w:r>
+            <w:r>
+              <w:t xml:space="preserve"> in a period of 8 days.</w:t>
+            </w:r>
             <w:r>
               <w:t>.</w:t>
             </w:r>
@@ -2528,7 +934,12 @@
     </w:tbl>
     <w:p/>
     <w:sectPr>
-      <w:headerReference w:type="default" r:id="rId12"/>
+      <w:headerReference w:type="even" r:id="rId12"/>
+      <w:headerReference w:type="default" r:id="rId13"/>
+      <w:footerReference w:type="even" r:id="rId14"/>
+      <w:footerReference w:type="default" r:id="rId15"/>
+      <w:headerReference w:type="first" r:id="rId16"/>
+      <w:footerReference w:type="first" r:id="rId17"/>
       <w:pgSz w:w="11910" w:h="16845"/>
       <w:pgMar w:top="720" w:right="720" w:bottom="720" w:left="720" w:header="720" w:footer="720" w:gutter="0"/>
       <w:cols w:space="720"/>
@@ -2557,6 +968,36 @@
 </w:endnotes>
 </file>
 
+<file path=word/footer1.xml><?xml version="1.0" encoding="utf-8"?>
+<w:ftr xmlns:wpc="http://schemas.microsoft.com/office/word/2010/wordprocessingCanvas" xmlns:cx="http://schemas.microsoft.com/office/drawing/2014/chartex" xmlns:cx1="http://schemas.microsoft.com/office/drawing/2015/9/8/chartex" xmlns:cx2="http://schemas.microsoft.com/office/drawing/2015/10/21/chartex" xmlns:cx3="http://schemas.microsoft.com/office/drawing/2016/5/9/chartex" xmlns:cx4="http://schemas.microsoft.com/office/drawing/2016/5/10/chartex" xmlns:cx5="http://schemas.microsoft.com/office/drawing/2016/5/11/chartex" xmlns:cx6="http://schemas.microsoft.com/office/drawing/2016/5/12/chartex" xmlns:cx7="http://schemas.microsoft.com/office/drawing/2016/5/13/chartex" xmlns:cx8="http://schemas.microsoft.com/office/drawing/2016/5/14/chartex" xmlns:mc="http://schemas.openxmlformats.org/markup-compatibility/2006" xmlns:aink="http://schemas.microsoft.com/office/drawing/2016/ink" xmlns:am3d="http://schemas.microsoft.com/office/drawing/2017/model3d" xmlns:o="urn:schemas-microsoft-com:office:office" xmlns:oel="http://schemas.microsoft.com/office/2019/extlst" xmlns:r="http://schemas.openxmlformats.org/officeDocument/2006/relationships" xmlns:m="http://schemas.openxmlformats.org/officeDocument/2006/math" xmlns:v="urn:schemas-microsoft-com:vml" xmlns:wp14="http://schemas.microsoft.com/office/word/2010/wordprocessingDrawing" xmlns:wp="http://schemas.openxmlformats.org/drawingml/2006/wordprocessingDrawing" xmlns:w10="urn:schemas-microsoft-com:office:word" xmlns:w="http://schemas.openxmlformats.org/wordprocessingml/2006/main" xmlns:w14="http://schemas.microsoft.com/office/word/2010/wordml" xmlns:w15="http://schemas.microsoft.com/office/word/2012/wordml" xmlns:w16cex="http://schemas.microsoft.com/office/word/2018/wordml/cex" xmlns:w16cid="http://schemas.microsoft.com/office/word/2016/wordml/cid" xmlns:w16="http://schemas.microsoft.com/office/word/2018/wordml" xmlns:w16du="http://schemas.microsoft.com/office/word/2023/wordml/word16du" xmlns:w16sdtdh="http://schemas.microsoft.com/office/word/2020/wordml/sdtdatahash" xmlns:w16sdtfl="http://schemas.microsoft.com/office/word/2024/wordml/sdtformatlock" xmlns:w16se="http://schemas.microsoft.com/office/word/2015/wordml/symex" xmlns:wpg="http://schemas.microsoft.com/office/word/2010/wordprocessingGroup" xmlns:wpi="http://schemas.microsoft.com/office/word/2010/wordprocessingInk" xmlns:wne="http://schemas.microsoft.com/office/word/2006/wordml" xmlns:wps="http://schemas.microsoft.com/office/word/2010/wordprocessingShape" mc:Ignorable="w14 w15 w16se w16cid w16 w16cex w16sdtdh w16sdtfl w16du wp14">
+  <w:p>
+    <w:pPr>
+      <w:pStyle w:val="Piedepgina"/>
+    </w:pPr>
+  </w:p>
+</w:ftr>
+</file>
+
+<file path=word/footer2.xml><?xml version="1.0" encoding="utf-8"?>
+<w:ftr xmlns:wpc="http://schemas.microsoft.com/office/word/2010/wordprocessingCanvas" xmlns:cx="http://schemas.microsoft.com/office/drawing/2014/chartex" xmlns:cx1="http://schemas.microsoft.com/office/drawing/2015/9/8/chartex" xmlns:cx2="http://schemas.microsoft.com/office/drawing/2015/10/21/chartex" xmlns:cx3="http://schemas.microsoft.com/office/drawing/2016/5/9/chartex" xmlns:cx4="http://schemas.microsoft.com/office/drawing/2016/5/10/chartex" xmlns:cx5="http://schemas.microsoft.com/office/drawing/2016/5/11/chartex" xmlns:cx6="http://schemas.microsoft.com/office/drawing/2016/5/12/chartex" xmlns:cx7="http://schemas.microsoft.com/office/drawing/2016/5/13/chartex" xmlns:cx8="http://schemas.microsoft.com/office/drawing/2016/5/14/chartex" xmlns:mc="http://schemas.openxmlformats.org/markup-compatibility/2006" xmlns:aink="http://schemas.microsoft.com/office/drawing/2016/ink" xmlns:am3d="http://schemas.microsoft.com/office/drawing/2017/model3d" xmlns:o="urn:schemas-microsoft-com:office:office" xmlns:oel="http://schemas.microsoft.com/office/2019/extlst" xmlns:r="http://schemas.openxmlformats.org/officeDocument/2006/relationships" xmlns:m="http://schemas.openxmlformats.org/officeDocument/2006/math" xmlns:v="urn:schemas-microsoft-com:vml" xmlns:wp14="http://schemas.microsoft.com/office/word/2010/wordprocessingDrawing" xmlns:wp="http://schemas.openxmlformats.org/drawingml/2006/wordprocessingDrawing" xmlns:w10="urn:schemas-microsoft-com:office:word" xmlns:w="http://schemas.openxmlformats.org/wordprocessingml/2006/main" xmlns:w14="http://schemas.microsoft.com/office/word/2010/wordml" xmlns:w15="http://schemas.microsoft.com/office/word/2012/wordml" xmlns:w16cex="http://schemas.microsoft.com/office/word/2018/wordml/cex" xmlns:w16cid="http://schemas.microsoft.com/office/word/2016/wordml/cid" xmlns:w16="http://schemas.microsoft.com/office/word/2018/wordml" xmlns:w16du="http://schemas.microsoft.com/office/word/2023/wordml/word16du" xmlns:w16sdtdh="http://schemas.microsoft.com/office/word/2020/wordml/sdtdatahash" xmlns:w16sdtfl="http://schemas.microsoft.com/office/word/2024/wordml/sdtformatlock" xmlns:w16se="http://schemas.microsoft.com/office/word/2015/wordml/symex" xmlns:wpg="http://schemas.microsoft.com/office/word/2010/wordprocessingGroup" xmlns:wpi="http://schemas.microsoft.com/office/word/2010/wordprocessingInk" xmlns:wne="http://schemas.microsoft.com/office/word/2006/wordml" xmlns:wps="http://schemas.microsoft.com/office/word/2010/wordprocessingShape" mc:Ignorable="w14 w15 w16se w16cid w16 w16cex w16sdtdh w16sdtfl w16du wp14">
+  <w:p>
+    <w:pPr>
+      <w:pStyle w:val="Piedepgina"/>
+    </w:pPr>
+  </w:p>
+</w:ftr>
+</file>
+
+<file path=word/footer3.xml><?xml version="1.0" encoding="utf-8"?>
+<w:ftr xmlns:wpc="http://schemas.microsoft.com/office/word/2010/wordprocessingCanvas" xmlns:cx="http://schemas.microsoft.com/office/drawing/2014/chartex" xmlns:cx1="http://schemas.microsoft.com/office/drawing/2015/9/8/chartex" xmlns:cx2="http://schemas.microsoft.com/office/drawing/2015/10/21/chartex" xmlns:cx3="http://schemas.microsoft.com/office/drawing/2016/5/9/chartex" xmlns:cx4="http://schemas.microsoft.com/office/drawing/2016/5/10/chartex" xmlns:cx5="http://schemas.microsoft.com/office/drawing/2016/5/11/chartex" xmlns:cx6="http://schemas.microsoft.com/office/drawing/2016/5/12/chartex" xmlns:cx7="http://schemas.microsoft.com/office/drawing/2016/5/13/chartex" xmlns:cx8="http://schemas.microsoft.com/office/drawing/2016/5/14/chartex" xmlns:mc="http://schemas.openxmlformats.org/markup-compatibility/2006" xmlns:aink="http://schemas.microsoft.com/office/drawing/2016/ink" xmlns:am3d="http://schemas.microsoft.com/office/drawing/2017/model3d" xmlns:o="urn:schemas-microsoft-com:office:office" xmlns:oel="http://schemas.microsoft.com/office/2019/extlst" xmlns:r="http://schemas.openxmlformats.org/officeDocument/2006/relationships" xmlns:m="http://schemas.openxmlformats.org/officeDocument/2006/math" xmlns:v="urn:schemas-microsoft-com:vml" xmlns:wp14="http://schemas.microsoft.com/office/word/2010/wordprocessingDrawing" xmlns:wp="http://schemas.openxmlformats.org/drawingml/2006/wordprocessingDrawing" xmlns:w10="urn:schemas-microsoft-com:office:word" xmlns:w="http://schemas.openxmlformats.org/wordprocessingml/2006/main" xmlns:w14="http://schemas.microsoft.com/office/word/2010/wordml" xmlns:w15="http://schemas.microsoft.com/office/word/2012/wordml" xmlns:w16cex="http://schemas.microsoft.com/office/word/2018/wordml/cex" xmlns:w16cid="http://schemas.microsoft.com/office/word/2016/wordml/cid" xmlns:w16="http://schemas.microsoft.com/office/word/2018/wordml" xmlns:w16du="http://schemas.microsoft.com/office/word/2023/wordml/word16du" xmlns:w16sdtdh="http://schemas.microsoft.com/office/word/2020/wordml/sdtdatahash" xmlns:w16sdtfl="http://schemas.microsoft.com/office/word/2024/wordml/sdtformatlock" xmlns:w16se="http://schemas.microsoft.com/office/word/2015/wordml/symex" xmlns:wpg="http://schemas.microsoft.com/office/word/2010/wordprocessingGroup" xmlns:wpi="http://schemas.microsoft.com/office/word/2010/wordprocessingInk" xmlns:wne="http://schemas.microsoft.com/office/word/2006/wordml" xmlns:wps="http://schemas.microsoft.com/office/word/2010/wordprocessingShape" mc:Ignorable="w14 w15 w16se w16cid w16 w16cex w16sdtdh w16sdtfl w16du wp14">
+  <w:p>
+    <w:pPr>
+      <w:pStyle w:val="Piedepgina"/>
+    </w:pPr>
+  </w:p>
+</w:ftr>
+</file>
+
 <file path=word/footnotes.xml><?xml version="1.0" encoding="utf-8"?>
 <w:footnotes xmlns:wpc="http://schemas.microsoft.com/office/word/2010/wordprocessingCanvas" xmlns:cx="http://schemas.microsoft.com/office/drawing/2014/chartex" xmlns:cx1="http://schemas.microsoft.com/office/drawing/2015/9/8/chartex" xmlns:cx2="http://schemas.microsoft.com/office/drawing/2015/10/21/chartex" xmlns:cx3="http://schemas.microsoft.com/office/drawing/2016/5/9/chartex" xmlns:cx4="http://schemas.microsoft.com/office/drawing/2016/5/10/chartex" xmlns:cx5="http://schemas.microsoft.com/office/drawing/2016/5/11/chartex" xmlns:cx6="http://schemas.microsoft.com/office/drawing/2016/5/12/chartex" xmlns:cx7="http://schemas.microsoft.com/office/drawing/2016/5/13/chartex" xmlns:cx8="http://schemas.microsoft.com/office/drawing/2016/5/14/chartex" xmlns:mc="http://schemas.openxmlformats.org/markup-compatibility/2006" xmlns:aink="http://schemas.microsoft.com/office/drawing/2016/ink" xmlns:am3d="http://schemas.microsoft.com/office/drawing/2017/model3d" xmlns:o="urn:schemas-microsoft-com:office:office" xmlns:oel="http://schemas.microsoft.com/office/2019/extlst" xmlns:r="http://schemas.openxmlformats.org/officeDocument/2006/relationships" xmlns:m="http://schemas.openxmlformats.org/officeDocument/2006/math" xmlns:v="urn:schemas-microsoft-com:vml" xmlns:wp14="http://schemas.microsoft.com/office/word/2010/wordprocessingDrawing" xmlns:wp="http://schemas.openxmlformats.org/drawingml/2006/wordprocessingDrawing" xmlns:w10="urn:schemas-microsoft-com:office:word" xmlns:w="http://schemas.openxmlformats.org/wordprocessingml/2006/main" xmlns:w14="http://schemas.microsoft.com/office/word/2010/wordml" xmlns:w15="http://schemas.microsoft.com/office/word/2012/wordml" xmlns:w16cex="http://schemas.microsoft.com/office/word/2018/wordml/cex" xmlns:w16cid="http://schemas.microsoft.com/office/word/2016/wordml/cid" xmlns:w16="http://schemas.microsoft.com/office/word/2018/wordml" xmlns:w16du="http://schemas.microsoft.com/office/word/2023/wordml/word16du" xmlns:w16sdtdh="http://schemas.microsoft.com/office/word/2020/wordml/sdtdatahash" xmlns:w16sdtfl="http://schemas.microsoft.com/office/word/2024/wordml/sdtformatlock" xmlns:w16se="http://schemas.microsoft.com/office/word/2015/wordml/symex" xmlns:wpg="http://schemas.microsoft.com/office/word/2010/wordprocessingGroup" xmlns:wpi="http://schemas.microsoft.com/office/word/2010/wordprocessingInk" xmlns:wne="http://schemas.microsoft.com/office/word/2006/wordml" xmlns:wps="http://schemas.microsoft.com/office/word/2010/wordprocessingShape" mc:Ignorable="w14 w15 w16se w16cid w16 w16cex w16sdtdh w16sdtfl w16du wp14">
   <w:footnote w:type="separator" w:id="-1">
@@ -2578,6 +1019,16 @@
 
 <file path=word/header1.xml><?xml version="1.0" encoding="utf-8"?>
 <w:hdr xmlns:wpc="http://schemas.microsoft.com/office/word/2010/wordprocessingCanvas" xmlns:cx="http://schemas.microsoft.com/office/drawing/2014/chartex" xmlns:cx1="http://schemas.microsoft.com/office/drawing/2015/9/8/chartex" xmlns:cx2="http://schemas.microsoft.com/office/drawing/2015/10/21/chartex" xmlns:cx3="http://schemas.microsoft.com/office/drawing/2016/5/9/chartex" xmlns:cx4="http://schemas.microsoft.com/office/drawing/2016/5/10/chartex" xmlns:cx5="http://schemas.microsoft.com/office/drawing/2016/5/11/chartex" xmlns:cx6="http://schemas.microsoft.com/office/drawing/2016/5/12/chartex" xmlns:cx7="http://schemas.microsoft.com/office/drawing/2016/5/13/chartex" xmlns:cx8="http://schemas.microsoft.com/office/drawing/2016/5/14/chartex" xmlns:mc="http://schemas.openxmlformats.org/markup-compatibility/2006" xmlns:aink="http://schemas.microsoft.com/office/drawing/2016/ink" xmlns:am3d="http://schemas.microsoft.com/office/drawing/2017/model3d" xmlns:o="urn:schemas-microsoft-com:office:office" xmlns:oel="http://schemas.microsoft.com/office/2019/extlst" xmlns:r="http://schemas.openxmlformats.org/officeDocument/2006/relationships" xmlns:m="http://schemas.openxmlformats.org/officeDocument/2006/math" xmlns:v="urn:schemas-microsoft-com:vml" xmlns:wp14="http://schemas.microsoft.com/office/word/2010/wordprocessingDrawing" xmlns:wp="http://schemas.openxmlformats.org/drawingml/2006/wordprocessingDrawing" xmlns:w10="urn:schemas-microsoft-com:office:word" xmlns:w="http://schemas.openxmlformats.org/wordprocessingml/2006/main" xmlns:w14="http://schemas.microsoft.com/office/word/2010/wordml" xmlns:w15="http://schemas.microsoft.com/office/word/2012/wordml" xmlns:w16cex="http://schemas.microsoft.com/office/word/2018/wordml/cex" xmlns:w16cid="http://schemas.microsoft.com/office/word/2016/wordml/cid" xmlns:w16="http://schemas.microsoft.com/office/word/2018/wordml" xmlns:w16du="http://schemas.microsoft.com/office/word/2023/wordml/word16du" xmlns:w16sdtdh="http://schemas.microsoft.com/office/word/2020/wordml/sdtdatahash" xmlns:w16sdtfl="http://schemas.microsoft.com/office/word/2024/wordml/sdtformatlock" xmlns:w16se="http://schemas.microsoft.com/office/word/2015/wordml/symex" xmlns:wpg="http://schemas.microsoft.com/office/word/2010/wordprocessingGroup" xmlns:wpi="http://schemas.microsoft.com/office/word/2010/wordprocessingInk" xmlns:wne="http://schemas.microsoft.com/office/word/2006/wordml" xmlns:wps="http://schemas.microsoft.com/office/word/2010/wordprocessingShape" mc:Ignorable="w14 w15 w16se w16cid w16 w16cex w16sdtdh w16sdtfl w16du wp14">
+  <w:p>
+    <w:pPr>
+      <w:pStyle w:val="Encabezado"/>
+    </w:pPr>
+  </w:p>
+</w:hdr>
+</file>
+
+<file path=word/header2.xml><?xml version="1.0" encoding="utf-8"?>
+<w:hdr xmlns:wpc="http://schemas.microsoft.com/office/word/2010/wordprocessingCanvas" xmlns:cx="http://schemas.microsoft.com/office/drawing/2014/chartex" xmlns:cx1="http://schemas.microsoft.com/office/drawing/2015/9/8/chartex" xmlns:cx2="http://schemas.microsoft.com/office/drawing/2015/10/21/chartex" xmlns:cx3="http://schemas.microsoft.com/office/drawing/2016/5/9/chartex" xmlns:cx4="http://schemas.microsoft.com/office/drawing/2016/5/10/chartex" xmlns:cx5="http://schemas.microsoft.com/office/drawing/2016/5/11/chartex" xmlns:cx6="http://schemas.microsoft.com/office/drawing/2016/5/12/chartex" xmlns:cx7="http://schemas.microsoft.com/office/drawing/2016/5/13/chartex" xmlns:cx8="http://schemas.microsoft.com/office/drawing/2016/5/14/chartex" xmlns:mc="http://schemas.openxmlformats.org/markup-compatibility/2006" xmlns:aink="http://schemas.microsoft.com/office/drawing/2016/ink" xmlns:am3d="http://schemas.microsoft.com/office/drawing/2017/model3d" xmlns:o="urn:schemas-microsoft-com:office:office" xmlns:oel="http://schemas.microsoft.com/office/2019/extlst" xmlns:r="http://schemas.openxmlformats.org/officeDocument/2006/relationships" xmlns:m="http://schemas.openxmlformats.org/officeDocument/2006/math" xmlns:v="urn:schemas-microsoft-com:vml" xmlns:wp14="http://schemas.microsoft.com/office/word/2010/wordprocessingDrawing" xmlns:wp="http://schemas.openxmlformats.org/drawingml/2006/wordprocessingDrawing" xmlns:w10="urn:schemas-microsoft-com:office:word" xmlns:w="http://schemas.openxmlformats.org/wordprocessingml/2006/main" xmlns:w14="http://schemas.microsoft.com/office/word/2010/wordml" xmlns:w15="http://schemas.microsoft.com/office/word/2012/wordml" xmlns:w16cex="http://schemas.microsoft.com/office/word/2018/wordml/cex" xmlns:w16cid="http://schemas.microsoft.com/office/word/2016/wordml/cid" xmlns:w16="http://schemas.microsoft.com/office/word/2018/wordml" xmlns:w16du="http://schemas.microsoft.com/office/word/2023/wordml/word16du" xmlns:w16sdtdh="http://schemas.microsoft.com/office/word/2020/wordml/sdtdatahash" xmlns:w16sdtfl="http://schemas.microsoft.com/office/word/2024/wordml/sdtformatlock" xmlns:w16se="http://schemas.microsoft.com/office/word/2015/wordml/symex" xmlns:wpg="http://schemas.microsoft.com/office/word/2010/wordprocessingGroup" xmlns:wpi="http://schemas.microsoft.com/office/word/2010/wordprocessingInk" xmlns:wne="http://schemas.microsoft.com/office/word/2006/wordml" xmlns:wps="http://schemas.microsoft.com/office/word/2010/wordprocessingShape" mc:Ignorable="w14 w15 w16se w16cid w16 w16cex w16sdtdh w16sdtfl w16du wp14">
   <w:tbl>
     <w:tblPr>
       <w:tblStyle w:val="Tablaconcuadrcula"/>
@@ -2593,8 +1044,8 @@
       <w:tblLook w:val="04A0" w:firstRow="1" w:lastRow="0" w:firstColumn="1" w:lastColumn="0" w:noHBand="0" w:noVBand="1"/>
     </w:tblPr>
     <w:tblGrid>
-      <w:gridCol w:w="8223"/>
-      <w:gridCol w:w="2256"/>
+      <w:gridCol w:w="8217"/>
+      <w:gridCol w:w="2262"/>
     </w:tblGrid>
     <w:tr>
       <w:trPr>
@@ -2607,8 +1058,16 @@
         <w:p>
           <w:pPr>
             <w:pStyle w:val="Ttulo2"/>
+            <w:rPr>
+              <w:sz w:val="44"/>
+              <w:szCs w:val="44"/>
+            </w:rPr>
           </w:pPr>
           <w:r>
+            <w:rPr>
+              <w:sz w:val="44"/>
+              <w:szCs w:val="44"/>
+            </w:rPr>
             <w:t>Ignacio Pérez</w:t>
           </w:r>
         </w:p>
@@ -2616,46 +1075,19 @@
           <w:pPr>
             <w:pStyle w:val="Ttulo4"/>
           </w:pPr>
-          <w:proofErr w:type="spellStart"/>
           <w:r>
-            <w:t>Electrical</w:t>
+            <w:t>Electrical engineer</w:t>
           </w:r>
-          <w:proofErr w:type="spellEnd"/>
-          <w:r>
-            <w:t xml:space="preserve"> </w:t>
-          </w:r>
-          <w:proofErr w:type="spellStart"/>
-          <w:r>
-            <w:t>engineer</w:t>
-          </w:r>
-          <w:proofErr w:type="spellEnd"/>
           <w:r>
             <w:tab/>
           </w:r>
         </w:p>
         <w:p>
-          <w:pPr>
-            <w:pStyle w:val="Subttulo"/>
-            <w:spacing w:line="276" w:lineRule="auto"/>
-          </w:pPr>
           <w:r>
             <w:t xml:space="preserve">| </w:t>
           </w:r>
-          <w:proofErr w:type="spellStart"/>
           <w:r>
-            <w:t>Pfeilgasse</w:t>
-          </w:r>
-          <w:proofErr w:type="spellEnd"/>
-          <w:r>
-            <w:t xml:space="preserve"> 3a, </w:t>
-          </w:r>
-          <w:proofErr w:type="spellStart"/>
-          <w:r>
-            <w:t>Vienna</w:t>
-          </w:r>
-          <w:proofErr w:type="spellEnd"/>
-          <w:r>
-            <w:t xml:space="preserve"> | +43 664 99470941 |</w:t>
+            <w:t>Pfeilgasse 3a, Vienna | +43 664 99470941 |</w:t>
           </w:r>
           <w:r>
             <w:t xml:space="preserve"> </w:t>
@@ -2677,9 +1109,6 @@
           </w:r>
         </w:p>
         <w:p>
-          <w:pPr>
-            <w:pStyle w:val="Subttulo"/>
-          </w:pPr>
           <w:r>
             <w:t xml:space="preserve">| </w:t>
           </w:r>
@@ -2758,9 +1187,9 @@
               <w:noProof/>
             </w:rPr>
             <w:drawing>
-              <wp:inline distT="0" distB="0" distL="0" distR="0" wp14:anchorId="63B46D09" wp14:editId="485094F3">
+              <wp:inline distT="0" distB="0" distL="0" distR="0" wp14:anchorId="63B46D09" wp14:editId="18803AB3">
                 <wp:extent cx="1294108" cy="1294108"/>
-                <wp:effectExtent l="0" t="0" r="1905" b="1905"/>
+                <wp:effectExtent l="0" t="0" r="5715" b="5715"/>
                 <wp:docPr id="134221174" name="Imagen 2"/>
                 <wp:cNvGraphicFramePr>
                   <a:graphicFrameLocks xmlns:a="http://schemas.openxmlformats.org/drawingml/2006/main" noChangeAspect="1"/>
@@ -2787,7 +1216,7 @@
                       <pic:spPr>
                         <a:xfrm>
                           <a:off x="0" y="0"/>
-                          <a:ext cx="1316090" cy="1316090"/>
+                          <a:ext cx="1294108" cy="1294108"/>
                         </a:xfrm>
                         <a:prstGeom prst="rect">
                           <a:avLst/>
@@ -2804,6 +1233,16 @@
     </w:tr>
   </w:tbl>
   <w:p/>
+</w:hdr>
+</file>
+
+<file path=word/header3.xml><?xml version="1.0" encoding="utf-8"?>
+<w:hdr xmlns:wpc="http://schemas.microsoft.com/office/word/2010/wordprocessingCanvas" xmlns:cx="http://schemas.microsoft.com/office/drawing/2014/chartex" xmlns:cx1="http://schemas.microsoft.com/office/drawing/2015/9/8/chartex" xmlns:cx2="http://schemas.microsoft.com/office/drawing/2015/10/21/chartex" xmlns:cx3="http://schemas.microsoft.com/office/drawing/2016/5/9/chartex" xmlns:cx4="http://schemas.microsoft.com/office/drawing/2016/5/10/chartex" xmlns:cx5="http://schemas.microsoft.com/office/drawing/2016/5/11/chartex" xmlns:cx6="http://schemas.microsoft.com/office/drawing/2016/5/12/chartex" xmlns:cx7="http://schemas.microsoft.com/office/drawing/2016/5/13/chartex" xmlns:cx8="http://schemas.microsoft.com/office/drawing/2016/5/14/chartex" xmlns:mc="http://schemas.openxmlformats.org/markup-compatibility/2006" xmlns:aink="http://schemas.microsoft.com/office/drawing/2016/ink" xmlns:am3d="http://schemas.microsoft.com/office/drawing/2017/model3d" xmlns:o="urn:schemas-microsoft-com:office:office" xmlns:oel="http://schemas.microsoft.com/office/2019/extlst" xmlns:r="http://schemas.openxmlformats.org/officeDocument/2006/relationships" xmlns:m="http://schemas.openxmlformats.org/officeDocument/2006/math" xmlns:v="urn:schemas-microsoft-com:vml" xmlns:wp14="http://schemas.microsoft.com/office/word/2010/wordprocessingDrawing" xmlns:wp="http://schemas.openxmlformats.org/drawingml/2006/wordprocessingDrawing" xmlns:w10="urn:schemas-microsoft-com:office:word" xmlns:w="http://schemas.openxmlformats.org/wordprocessingml/2006/main" xmlns:w14="http://schemas.microsoft.com/office/word/2010/wordml" xmlns:w15="http://schemas.microsoft.com/office/word/2012/wordml" xmlns:w16cex="http://schemas.microsoft.com/office/word/2018/wordml/cex" xmlns:w16cid="http://schemas.microsoft.com/office/word/2016/wordml/cid" xmlns:w16="http://schemas.microsoft.com/office/word/2018/wordml" xmlns:w16du="http://schemas.microsoft.com/office/word/2023/wordml/word16du" xmlns:w16sdtdh="http://schemas.microsoft.com/office/word/2020/wordml/sdtdatahash" xmlns:w16sdtfl="http://schemas.microsoft.com/office/word/2024/wordml/sdtformatlock" xmlns:w16se="http://schemas.microsoft.com/office/word/2015/wordml/symex" xmlns:wpg="http://schemas.microsoft.com/office/word/2010/wordprocessingGroup" xmlns:wpi="http://schemas.microsoft.com/office/word/2010/wordprocessingInk" xmlns:wne="http://schemas.microsoft.com/office/word/2006/wordml" xmlns:wps="http://schemas.microsoft.com/office/word/2010/wordprocessingShape" mc:Ignorable="w14 w15 w16se w16cid w16 w16cex w16sdtdh w16sdtfl w16du wp14">
+  <w:p>
+    <w:pPr>
+      <w:pStyle w:val="Encabezado"/>
+    </w:pPr>
+  </w:p>
 </w:hdr>
 </file>
 

</xml_diff>